<commit_message>
Reformat AM answers: per-experiment pages, no cover, duplex-ready
Removes the cover/title block so the document starts directly with
Experiment 1, puts each experiment on its own page, and lengthens every
answer. Blank pages are then inserted so each experiment begins on a
front (odd) page when printed double-sided (one blank added before
Experiment 5; 11 pages total). Footer reduced to the subject name only
so page numbering stays consistent after padding.

Co-Authored-By: Claude Opus 4.8 <noreply@anthropic.com>
Claude-Session: https://claude.ai/code/session_01REYoacDfMmcfn4tpcBCmyb
</commit_message>
<xml_diff>
--- a/PBL_AM/AM_Lab_Answers/AM_Lab_Manual_Answers.docx
+++ b/PBL_AM/AM_Lab_Answers/AM_Lab_Manual_Answers.docx
@@ -2,457 +2,6 @@
 <file path=word/document.xml><?xml version="1.0" encoding="utf-8"?>
 <w:document xmlns:wpc="http://schemas.microsoft.com/office/word/2010/wordprocessingCanvas" xmlns:mc="http://schemas.openxmlformats.org/markup-compatibility/2006" xmlns:o="urn:schemas-microsoft-com:office:office" xmlns:r="http://schemas.openxmlformats.org/officeDocument/2006/relationships" xmlns:m="http://schemas.openxmlformats.org/officeDocument/2006/math" xmlns:v="urn:schemas-microsoft-com:vml" xmlns:wp14="http://schemas.microsoft.com/office/word/2010/wordprocessingDrawing" xmlns:wp="http://schemas.openxmlformats.org/drawingml/2006/wordprocessingDrawing" xmlns:w10="urn:schemas-microsoft-com:office:word" xmlns:w="http://schemas.openxmlformats.org/wordprocessingml/2006/main" xmlns:w14="http://schemas.microsoft.com/office/word/2010/wordml" xmlns:w15="http://schemas.microsoft.com/office/word/2012/wordml" xmlns:wpg="http://schemas.microsoft.com/office/word/2010/wordprocessingGroup" xmlns:wpi="http://schemas.microsoft.com/office/word/2010/wordprocessingInk" xmlns:wne="http://schemas.microsoft.com/office/word/2006/wordml" xmlns:wps="http://schemas.microsoft.com/office/word/2010/wordprocessingShape" xmlns:cx="http://schemas.microsoft.com/office/drawing/2014/chartex" xmlns:cx1="http://schemas.microsoft.com/office/drawing/2015/9/8/chartex" xmlns:cx2="http://schemas.microsoft.com/office/drawing/2015/10/21/chartex" xmlns:cx3="http://schemas.microsoft.com/office/drawing/2016/5/9/chartex" xmlns:cx4="http://schemas.microsoft.com/office/drawing/2016/5/10/chartex" xmlns:cx5="http://schemas.microsoft.com/office/drawing/2016/5/11/chartex" xmlns:cx6="http://schemas.microsoft.com/office/drawing/2016/5/12/chartex" xmlns:cx7="http://schemas.microsoft.com/office/drawing/2016/5/13/chartex" xmlns:cx8="http://schemas.microsoft.com/office/drawing/2016/5/14/chartex" xmlns:aink="http://schemas.microsoft.com/office/drawing/2016/ink" xmlns:am3d="http://schemas.microsoft.com/office/drawing/2017/model3d" xmlns:w16cex="http://schemas.microsoft.com/office/word/2018/wordml/cex" xmlns:w16cid="http://schemas.microsoft.com/office/word/2016/wordml/cid" xmlns:w16="http://schemas.microsoft.com/office/word/2018/wordml" xmlns:w16sdtdh="http://schemas.microsoft.com/office/word/2020/wordml/sdtdatahash" xmlns:w16se="http://schemas.microsoft.com/office/word/2015/wordml/symex" mc:Ignorable="w14 w15 wp14">
   <w:body>
-    <w:p>
-      <w:pPr>
-        <w:spacing w:after="60" w:before="240"/>
-        <w:jc w:val="center"/>
-      </w:pPr>
-      <w:r>
-        <w:rPr>
-          <w:rFonts w:ascii="Calibri" w:cs="Calibri" w:eastAsia="Calibri" w:hAnsi="Calibri"/>
-          <w:b/>
-          <w:bCs/>
-          <w:i w:val="false"/>
-          <w:iCs w:val="false"/>
-          <w:color w:val="44546A"/>
-          <w:sz w:val="22"/>
-          <w:szCs w:val="22"/>
-        </w:rPr>
-        <w:t xml:space="preserve">AUTOMATED MANUFACTURING (BE05041021)  ·  B.E. SEMESTER 5</w:t>
-      </w:r>
-    </w:p>
-    <w:p>
-      <w:pPr>
-        <w:spacing w:after="60" w:before="0"/>
-        <w:jc w:val="center"/>
-      </w:pPr>
-      <w:r>
-        <w:rPr>
-          <w:rFonts w:ascii="Calibri" w:cs="Calibri" w:eastAsia="Calibri" w:hAnsi="Calibri"/>
-          <w:b/>
-          <w:bCs/>
-          <w:i w:val="false"/>
-          <w:iCs w:val="false"/>
-          <w:color w:val="1F3864"/>
-          <w:sz w:val="34"/>
-          <w:szCs w:val="34"/>
-        </w:rPr>
-        <w:t xml:space="preserve">Lab Manual — Question Solutions</w:t>
-      </w:r>
-    </w:p>
-    <w:p>
-      <w:pPr>
-        <w:pBdr>
-          <w:bottom w:val="single" w:color="1F3864" w:sz="10" w:space="9"/>
-        </w:pBdr>
-        <w:spacing w:after="260" w:before="0"/>
-        <w:jc w:val="center"/>
-      </w:pPr>
-      <w:r>
-        <w:rPr>
-          <w:rFonts w:ascii="Calibri" w:cs="Calibri" w:eastAsia="Calibri" w:hAnsi="Calibri"/>
-          <w:b w:val="false"/>
-          <w:bCs w:val="false"/>
-          <w:i/>
-          <w:iCs/>
-          <w:color w:val="44546A"/>
-          <w:sz w:val="21"/>
-          <w:szCs w:val="21"/>
-        </w:rPr>
-        <w:t xml:space="preserve">Answers to the review / assignment / technical questions and worked numericals of all six experiments</w:t>
-      </w:r>
-    </w:p>
-    <w:tbl>
-      <w:tblPr>
-        <w:tblW w:type="dxa" w:w="9740"/>
-        <w:tblBorders>
-          <w:top w:val="single" w:color="9FB0C9" w:sz="4"/>
-          <w:left w:val="single" w:color="9FB0C9" w:sz="4"/>
-          <w:bottom w:val="single" w:color="9FB0C9" w:sz="4"/>
-          <w:right w:val="single" w:color="9FB0C9" w:sz="4"/>
-          <w:insideH w:val="single" w:color="9FB0C9" w:sz="4"/>
-          <w:insideV w:val="single" w:color="9FB0C9" w:sz="4"/>
-        </w:tblBorders>
-      </w:tblPr>
-      <w:tblGrid>
-        <w:gridCol w:w="3312"/>
-        <w:gridCol w:w="6428"/>
-      </w:tblGrid>
-      <w:tr>
-        <w:trPr>
-          <w:cantSplit/>
-          <w:tblHeader/>
-        </w:trPr>
-        <w:tc>
-          <w:tcPr>
-            <w:tcW w:type="dxa" w:w="3312"/>
-            <w:shd w:fill="D9E2F1" w:color="auto" w:val="clear"/>
-            <w:tcMar>
-              <w:top w:type="dxa" w:w="60"/>
-              <w:left w:type="dxa" w:w="110"/>
-              <w:bottom w:type="dxa" w:w="60"/>
-              <w:right w:type="dxa" w:w="110"/>
-            </w:tcMar>
-            <w:vAlign w:val="center"/>
-          </w:tcPr>
-          <w:p>
-            <w:pPr>
-              <w:spacing w:after="26" w:before="26"/>
-              <w:jc w:val="center"/>
-            </w:pPr>
-            <w:r>
-              <w:rPr>
-                <w:rFonts w:ascii="Calibri" w:cs="Calibri" w:eastAsia="Calibri" w:hAnsi="Calibri"/>
-                <w:b/>
-                <w:bCs/>
-                <w:i w:val="false"/>
-                <w:iCs w:val="false"/>
-                <w:sz w:val="19"/>
-                <w:szCs w:val="19"/>
-              </w:rPr>
-              <w:t xml:space="preserve">Particulars</w:t>
-            </w:r>
-          </w:p>
-        </w:tc>
-        <w:tc>
-          <w:tcPr>
-            <w:tcW w:type="dxa" w:w="6428"/>
-            <w:shd w:fill="D9E2F1" w:color="auto" w:val="clear"/>
-            <w:tcMar>
-              <w:top w:type="dxa" w:w="60"/>
-              <w:left w:type="dxa" w:w="110"/>
-              <w:bottom w:type="dxa" w:w="60"/>
-              <w:right w:type="dxa" w:w="110"/>
-            </w:tcMar>
-            <w:vAlign w:val="center"/>
-          </w:tcPr>
-          <w:p>
-            <w:pPr>
-              <w:spacing w:after="26" w:before="26"/>
-              <w:jc w:val="center"/>
-            </w:pPr>
-            <w:r>
-              <w:rPr>
-                <w:rFonts w:ascii="Calibri" w:cs="Calibri" w:eastAsia="Calibri" w:hAnsi="Calibri"/>
-                <w:b/>
-                <w:bCs/>
-                <w:i w:val="false"/>
-                <w:iCs w:val="false"/>
-                <w:sz w:val="19"/>
-                <w:szCs w:val="19"/>
-              </w:rPr>
-              <w:t xml:space="preserve">Details</w:t>
-            </w:r>
-          </w:p>
-        </w:tc>
-      </w:tr>
-      <w:tr>
-        <w:trPr>
-          <w:cantSplit/>
-        </w:trPr>
-        <w:tc>
-          <w:tcPr>
-            <w:tcW w:type="dxa" w:w="3312"/>
-            <w:shd w:fill="FFFFFF" w:color="auto" w:val="clear"/>
-            <w:tcMar>
-              <w:top w:type="dxa" w:w="60"/>
-              <w:left w:type="dxa" w:w="110"/>
-              <w:bottom w:type="dxa" w:w="60"/>
-              <w:right w:type="dxa" w:w="110"/>
-            </w:tcMar>
-            <w:vAlign w:val="center"/>
-          </w:tcPr>
-          <w:p>
-            <w:pPr>
-              <w:spacing w:after="26" w:before="26" w:line="252" w:lineRule="auto"/>
-            </w:pPr>
-            <w:r>
-              <w:rPr>
-                <w:rFonts w:ascii="Calibri" w:cs="Calibri" w:eastAsia="Calibri" w:hAnsi="Calibri"/>
-                <w:b w:val="false"/>
-                <w:bCs w:val="false"/>
-                <w:i w:val="false"/>
-                <w:iCs w:val="false"/>
-                <w:sz w:val="19"/>
-                <w:szCs w:val="19"/>
-              </w:rPr>
-              <w:t xml:space="preserve">Name of the student</w:t>
-            </w:r>
-          </w:p>
-        </w:tc>
-        <w:tc>
-          <w:tcPr>
-            <w:tcW w:type="dxa" w:w="6428"/>
-            <w:shd w:fill="FFFFFF" w:color="auto" w:val="clear"/>
-            <w:tcMar>
-              <w:top w:type="dxa" w:w="60"/>
-              <w:left w:type="dxa" w:w="110"/>
-              <w:bottom w:type="dxa" w:w="60"/>
-              <w:right w:type="dxa" w:w="110"/>
-            </w:tcMar>
-            <w:vAlign w:val="center"/>
-          </w:tcPr>
-          <w:p>
-            <w:pPr>
-              <w:spacing w:after="26" w:before="26" w:line="252" w:lineRule="auto"/>
-            </w:pPr>
-          </w:p>
-        </w:tc>
-      </w:tr>
-      <w:tr>
-        <w:trPr>
-          <w:cantSplit/>
-        </w:trPr>
-        <w:tc>
-          <w:tcPr>
-            <w:tcW w:type="dxa" w:w="3312"/>
-            <w:shd w:fill="F6F8FC" w:color="auto" w:val="clear"/>
-            <w:tcMar>
-              <w:top w:type="dxa" w:w="60"/>
-              <w:left w:type="dxa" w:w="110"/>
-              <w:bottom w:type="dxa" w:w="60"/>
-              <w:right w:type="dxa" w:w="110"/>
-            </w:tcMar>
-            <w:vAlign w:val="center"/>
-          </w:tcPr>
-          <w:p>
-            <w:pPr>
-              <w:spacing w:after="26" w:before="26" w:line="252" w:lineRule="auto"/>
-            </w:pPr>
-            <w:r>
-              <w:rPr>
-                <w:rFonts w:ascii="Calibri" w:cs="Calibri" w:eastAsia="Calibri" w:hAnsi="Calibri"/>
-                <w:b w:val="false"/>
-                <w:bCs w:val="false"/>
-                <w:i w:val="false"/>
-                <w:iCs w:val="false"/>
-                <w:sz w:val="19"/>
-                <w:szCs w:val="19"/>
-              </w:rPr>
-              <w:t xml:space="preserve">Enrolment No.  ·  Branch</w:t>
-            </w:r>
-          </w:p>
-        </w:tc>
-        <w:tc>
-          <w:tcPr>
-            <w:tcW w:type="dxa" w:w="6428"/>
-            <w:shd w:fill="F6F8FC" w:color="auto" w:val="clear"/>
-            <w:tcMar>
-              <w:top w:type="dxa" w:w="60"/>
-              <w:left w:type="dxa" w:w="110"/>
-              <w:bottom w:type="dxa" w:w="60"/>
-              <w:right w:type="dxa" w:w="110"/>
-            </w:tcMar>
-            <w:vAlign w:val="center"/>
-          </w:tcPr>
-          <w:p>
-            <w:pPr>
-              <w:spacing w:after="26" w:before="26" w:line="252" w:lineRule="auto"/>
-            </w:pPr>
-            <w:r>
-              <w:rPr>
-                <w:rFonts w:ascii="Calibri" w:cs="Calibri" w:eastAsia="Calibri" w:hAnsi="Calibri"/>
-                <w:b w:val="false"/>
-                <w:bCs w:val="false"/>
-                <w:i w:val="false"/>
-                <w:iCs w:val="false"/>
-                <w:sz w:val="19"/>
-                <w:szCs w:val="19"/>
-              </w:rPr>
-              <w:t xml:space="preserve">Robotics and Automation</w:t>
-            </w:r>
-          </w:p>
-        </w:tc>
-      </w:tr>
-      <w:tr>
-        <w:trPr>
-          <w:cantSplit/>
-        </w:trPr>
-        <w:tc>
-          <w:tcPr>
-            <w:tcW w:type="dxa" w:w="3312"/>
-            <w:shd w:fill="FFFFFF" w:color="auto" w:val="clear"/>
-            <w:tcMar>
-              <w:top w:type="dxa" w:w="60"/>
-              <w:left w:type="dxa" w:w="110"/>
-              <w:bottom w:type="dxa" w:w="60"/>
-              <w:right w:type="dxa" w:w="110"/>
-            </w:tcMar>
-            <w:vAlign w:val="center"/>
-          </w:tcPr>
-          <w:p>
-            <w:pPr>
-              <w:spacing w:after="26" w:before="26" w:line="252" w:lineRule="auto"/>
-            </w:pPr>
-            <w:r>
-              <w:rPr>
-                <w:rFonts w:ascii="Calibri" w:cs="Calibri" w:eastAsia="Calibri" w:hAnsi="Calibri"/>
-                <w:b w:val="false"/>
-                <w:bCs w:val="false"/>
-                <w:i w:val="false"/>
-                <w:iCs w:val="false"/>
-                <w:sz w:val="19"/>
-                <w:szCs w:val="19"/>
-              </w:rPr>
-              <w:t xml:space="preserve">Subject</w:t>
-            </w:r>
-          </w:p>
-        </w:tc>
-        <w:tc>
-          <w:tcPr>
-            <w:tcW w:type="dxa" w:w="6428"/>
-            <w:shd w:fill="FFFFFF" w:color="auto" w:val="clear"/>
-            <w:tcMar>
-              <w:top w:type="dxa" w:w="60"/>
-              <w:left w:type="dxa" w:w="110"/>
-              <w:bottom w:type="dxa" w:w="60"/>
-              <w:right w:type="dxa" w:w="110"/>
-            </w:tcMar>
-            <w:vAlign w:val="center"/>
-          </w:tcPr>
-          <w:p>
-            <w:pPr>
-              <w:spacing w:after="26" w:before="26" w:line="252" w:lineRule="auto"/>
-            </w:pPr>
-            <w:r>
-              <w:rPr>
-                <w:rFonts w:ascii="Calibri" w:cs="Calibri" w:eastAsia="Calibri" w:hAnsi="Calibri"/>
-                <w:b w:val="false"/>
-                <w:bCs w:val="false"/>
-                <w:i w:val="false"/>
-                <w:iCs w:val="false"/>
-                <w:sz w:val="19"/>
-                <w:szCs w:val="19"/>
-              </w:rPr>
-              <w:t xml:space="preserve">Automated Manufacturing (BE05041021)</w:t>
-            </w:r>
-          </w:p>
-        </w:tc>
-      </w:tr>
-      <w:tr>
-        <w:trPr>
-          <w:cantSplit/>
-        </w:trPr>
-        <w:tc>
-          <w:tcPr>
-            <w:tcW w:type="dxa" w:w="3312"/>
-            <w:shd w:fill="F6F8FC" w:color="auto" w:val="clear"/>
-            <w:tcMar>
-              <w:top w:type="dxa" w:w="60"/>
-              <w:left w:type="dxa" w:w="110"/>
-              <w:bottom w:type="dxa" w:w="60"/>
-              <w:right w:type="dxa" w:w="110"/>
-            </w:tcMar>
-            <w:vAlign w:val="center"/>
-          </w:tcPr>
-          <w:p>
-            <w:pPr>
-              <w:spacing w:after="26" w:before="26" w:line="252" w:lineRule="auto"/>
-            </w:pPr>
-            <w:r>
-              <w:rPr>
-                <w:rFonts w:ascii="Calibri" w:cs="Calibri" w:eastAsia="Calibri" w:hAnsi="Calibri"/>
-                <w:b w:val="false"/>
-                <w:bCs w:val="false"/>
-                <w:i w:val="false"/>
-                <w:iCs w:val="false"/>
-                <w:sz w:val="19"/>
-                <w:szCs w:val="19"/>
-              </w:rPr>
-              <w:t xml:space="preserve">Experiments covered</w:t>
-            </w:r>
-          </w:p>
-        </w:tc>
-        <w:tc>
-          <w:tcPr>
-            <w:tcW w:type="dxa" w:w="6428"/>
-            <w:shd w:fill="F6F8FC" w:color="auto" w:val="clear"/>
-            <w:tcMar>
-              <w:top w:type="dxa" w:w="60"/>
-              <w:left w:type="dxa" w:w="110"/>
-              <w:bottom w:type="dxa" w:w="60"/>
-              <w:right w:type="dxa" w:w="110"/>
-            </w:tcMar>
-            <w:vAlign w:val="center"/>
-          </w:tcPr>
-          <w:p>
-            <w:pPr>
-              <w:spacing w:after="26" w:before="26" w:line="252" w:lineRule="auto"/>
-            </w:pPr>
-            <w:r>
-              <w:rPr>
-                <w:rFonts w:ascii="Calibri" w:cs="Calibri" w:eastAsia="Calibri" w:hAnsi="Calibri"/>
-                <w:b w:val="false"/>
-                <w:bCs w:val="false"/>
-                <w:i w:val="false"/>
-                <w:iCs w:val="false"/>
-                <w:sz w:val="19"/>
-                <w:szCs w:val="19"/>
-              </w:rPr>
-              <w:t xml:space="preserve">All 6 (CAM &amp; Automation · CNC · CAPP · AS/RS · CMM)</w:t>
-            </w:r>
-          </w:p>
-        </w:tc>
-      </w:tr>
-      <w:tr>
-        <w:trPr>
-          <w:cantSplit/>
-        </w:trPr>
-        <w:tc>
-          <w:tcPr>
-            <w:tcW w:type="dxa" w:w="3312"/>
-            <w:shd w:fill="FFFFFF" w:color="auto" w:val="clear"/>
-            <w:tcMar>
-              <w:top w:type="dxa" w:w="60"/>
-              <w:left w:type="dxa" w:w="110"/>
-              <w:bottom w:type="dxa" w:w="60"/>
-              <w:right w:type="dxa" w:w="110"/>
-            </w:tcMar>
-            <w:vAlign w:val="center"/>
-          </w:tcPr>
-          <w:p>
-            <w:pPr>
-              <w:spacing w:after="26" w:before="26" w:line="252" w:lineRule="auto"/>
-            </w:pPr>
-            <w:r>
-              <w:rPr>
-                <w:rFonts w:ascii="Calibri" w:cs="Calibri" w:eastAsia="Calibri" w:hAnsi="Calibri"/>
-                <w:b w:val="false"/>
-                <w:bCs w:val="false"/>
-                <w:i w:val="false"/>
-                <w:iCs w:val="false"/>
-                <w:sz w:val="19"/>
-                <w:szCs w:val="19"/>
-              </w:rPr>
-              <w:t xml:space="preserve">Date</w:t>
-            </w:r>
-          </w:p>
-        </w:tc>
-        <w:tc>
-          <w:tcPr>
-            <w:tcW w:type="dxa" w:w="6428"/>
-            <w:shd w:fill="FFFFFF" w:color="auto" w:val="clear"/>
-            <w:tcMar>
-              <w:top w:type="dxa" w:w="60"/>
-              <w:left w:type="dxa" w:w="110"/>
-              <w:bottom w:type="dxa" w:w="60"/>
-              <w:right w:type="dxa" w:w="110"/>
-            </w:tcMar>
-            <w:vAlign w:val="center"/>
-          </w:tcPr>
-          <w:p>
-            <w:pPr>
-              <w:spacing w:after="26" w:before="26" w:line="252" w:lineRule="auto"/>
-            </w:pPr>
-          </w:p>
-        </w:tc>
-      </w:tr>
-    </w:tbl>
-    <w:p>
-      <w:pPr>
-        <w:spacing w:after="260" w:before="0"/>
-      </w:pPr>
-    </w:p>
     <w:p>
       <w:pPr>
         <w:pStyle w:val="Heading1"/>
@@ -622,7 +171,7 @@
                 <w:sz w:val="17"/>
                 <w:szCs w:val="17"/>
               </w:rPr>
-              <w:t xml:space="preserve">   The smallest commandable movement of the axis is 20 um per step.</w:t>
+              <w:t xml:space="preserve">   The smallest increment of motion the axis can command is 20 um per step.</w:t>
             </w:r>
           </w:p>
         </w:tc>
@@ -684,7 +233,7 @@
     <w:p>
       <w:pPr>
         <w:keepNext/>
-        <w:spacing w:after="24" w:before="120" w:line="276" w:lineRule="auto"/>
+        <w:spacing w:after="26" w:before="130" w:line="278" w:lineRule="auto"/>
       </w:pPr>
       <w:r>
         <w:rPr>
@@ -714,7 +263,7 @@
     </w:p>
     <w:p>
       <w:pPr>
-        <w:spacing w:after="70" w:before="0" w:line="276" w:lineRule="auto"/>
+        <w:spacing w:after="80" w:before="0" w:line="278" w:lineRule="auto"/>
         <w:ind w:left="150"/>
       </w:pPr>
       <w:r>
@@ -752,49 +301,145 @@
           <w:sz w:val="21"/>
           <w:szCs w:val="21"/>
         </w:rPr>
-        <w:t xml:space="preserve">hardwired control and punched tapes</w:t>
-      </w:r>
-      <w:r>
-        <w:rPr>
-          <w:rFonts w:ascii="Calibri" w:cs="Calibri" w:eastAsia="Calibri" w:hAnsi="Calibri"/>
-          <w:b w:val="false"/>
-          <w:bCs w:val="false"/>
-          <w:i w:val="false"/>
-          <w:iCs w:val="false"/>
-          <w:sz w:val="21"/>
-          <w:szCs w:val="21"/>
-        </w:rPr>
-        <w:t xml:space="preserve">. Its main limitations were: programs could not be edited at the machine (the tape had to be re-punched), the paper/mylar tapes wore out, tore and read unreliably, there was no program storage or memory, no diagnostics or error-checking, and repeated tape reading slowed production. </w:t>
-      </w:r>
-      <w:r>
-        <w:rPr>
-          <w:rFonts w:ascii="Calibri" w:cs="Calibri" w:eastAsia="Calibri" w:hAnsi="Calibri"/>
-          <w:b/>
-          <w:bCs/>
-          <w:i w:val="false"/>
-          <w:iCs w:val="false"/>
-          <w:sz w:val="21"/>
-          <w:szCs w:val="21"/>
-        </w:rPr>
-        <w:t xml:space="preserve">CNC overcame these</w:t>
-      </w:r>
-      <w:r>
-        <w:rPr>
-          <w:rFonts w:ascii="Calibri" w:cs="Calibri" w:eastAsia="Calibri" w:hAnsi="Calibri"/>
-          <w:b w:val="false"/>
-          <w:bCs w:val="false"/>
-          <w:i w:val="false"/>
-          <w:iCs w:val="false"/>
-          <w:sz w:val="21"/>
-          <w:szCs w:val="21"/>
-        </w:rPr>
-        <w:t xml:space="preserve"> by using an onboard microcomputer (MCU) that stores and edits programs in memory, allowing easy editing, storage, diagnostics, interpolation and far higher reliability.</w:t>
+        <w:t xml:space="preserve">hardwired control logic and punched paper/mylar tapes</w:t>
+      </w:r>
+      <w:r>
+        <w:rPr>
+          <w:rFonts w:ascii="Calibri" w:cs="Calibri" w:eastAsia="Calibri" w:hAnsi="Calibri"/>
+          <w:b w:val="false"/>
+          <w:bCs w:val="false"/>
+          <w:i w:val="false"/>
+          <w:iCs w:val="false"/>
+          <w:sz w:val="21"/>
+          <w:szCs w:val="21"/>
+        </w:rPr>
+        <w:t xml:space="preserve"> to store the program. Its main drawbacks were: the program </w:t>
+      </w:r>
+      <w:r>
+        <w:rPr>
+          <w:rFonts w:ascii="Calibri" w:cs="Calibri" w:eastAsia="Calibri" w:hAnsi="Calibri"/>
+          <w:b/>
+          <w:bCs/>
+          <w:i w:val="false"/>
+          <w:iCs w:val="false"/>
+          <w:sz w:val="21"/>
+          <w:szCs w:val="21"/>
+        </w:rPr>
+        <w:t xml:space="preserve">could not be edited at the machine</w:t>
+      </w:r>
+      <w:r>
+        <w:rPr>
+          <w:rFonts w:ascii="Calibri" w:cs="Calibri" w:eastAsia="Calibri" w:hAnsi="Calibri"/>
+          <w:b w:val="false"/>
+          <w:bCs w:val="false"/>
+          <w:i w:val="false"/>
+          <w:iCs w:val="false"/>
+          <w:sz w:val="21"/>
+          <w:szCs w:val="21"/>
+        </w:rPr>
+        <w:t xml:space="preserve"> — the whole tape had to be re-punched for even a small change; the </w:t>
+      </w:r>
+      <w:r>
+        <w:rPr>
+          <w:rFonts w:ascii="Calibri" w:cs="Calibri" w:eastAsia="Calibri" w:hAnsi="Calibri"/>
+          <w:b/>
+          <w:bCs/>
+          <w:i w:val="false"/>
+          <w:iCs w:val="false"/>
+          <w:sz w:val="21"/>
+          <w:szCs w:val="21"/>
+        </w:rPr>
+        <w:t xml:space="preserve">tapes wore out, tore and read unreliably</w:t>
+      </w:r>
+      <w:r>
+        <w:rPr>
+          <w:rFonts w:ascii="Calibri" w:cs="Calibri" w:eastAsia="Calibri" w:hAnsi="Calibri"/>
+          <w:b w:val="false"/>
+          <w:bCs w:val="false"/>
+          <w:i w:val="false"/>
+          <w:iCs w:val="false"/>
+          <w:sz w:val="21"/>
+          <w:szCs w:val="21"/>
+        </w:rPr>
+        <w:t xml:space="preserve">, causing scrap; there was </w:t>
+      </w:r>
+      <w:r>
+        <w:rPr>
+          <w:rFonts w:ascii="Calibri" w:cs="Calibri" w:eastAsia="Calibri" w:hAnsi="Calibri"/>
+          <w:b/>
+          <w:bCs/>
+          <w:i w:val="false"/>
+          <w:iCs w:val="false"/>
+          <w:sz w:val="21"/>
+          <w:szCs w:val="21"/>
+        </w:rPr>
+        <w:t xml:space="preserve">no program storage, memory or diagnostics</w:t>
+      </w:r>
+      <w:r>
+        <w:rPr>
+          <w:rFonts w:ascii="Calibri" w:cs="Calibri" w:eastAsia="Calibri" w:hAnsi="Calibri"/>
+          <w:b w:val="false"/>
+          <w:bCs w:val="false"/>
+          <w:i w:val="false"/>
+          <w:iCs w:val="false"/>
+          <w:sz w:val="21"/>
+          <w:szCs w:val="21"/>
+        </w:rPr>
+        <w:t xml:space="preserve">; the machine had to </w:t>
+      </w:r>
+      <w:r>
+        <w:rPr>
+          <w:rFonts w:ascii="Calibri" w:cs="Calibri" w:eastAsia="Calibri" w:hAnsi="Calibri"/>
+          <w:b/>
+          <w:bCs/>
+          <w:i w:val="false"/>
+          <w:iCs w:val="false"/>
+          <w:sz w:val="21"/>
+          <w:szCs w:val="21"/>
+        </w:rPr>
+        <w:t xml:space="preserve">re-read the tape for every cycle</w:t>
+      </w:r>
+      <w:r>
+        <w:rPr>
+          <w:rFonts w:ascii="Calibri" w:cs="Calibri" w:eastAsia="Calibri" w:hAnsi="Calibri"/>
+          <w:b w:val="false"/>
+          <w:bCs w:val="false"/>
+          <w:i w:val="false"/>
+          <w:iCs w:val="false"/>
+          <w:sz w:val="21"/>
+          <w:szCs w:val="21"/>
+        </w:rPr>
+        <w:t xml:space="preserve">, which slowed production; and because the control was hardwired, changing the machine’s function needed physical rewiring. </w:t>
+      </w:r>
+      <w:r>
+        <w:rPr>
+          <w:rFonts w:ascii="Calibri" w:cs="Calibri" w:eastAsia="Calibri" w:hAnsi="Calibri"/>
+          <w:b/>
+          <w:bCs/>
+          <w:i w:val="false"/>
+          <w:iCs w:val="false"/>
+          <w:sz w:val="21"/>
+          <w:szCs w:val="21"/>
+        </w:rPr>
+        <w:t xml:space="preserve">CNC overcame all of these</w:t>
+      </w:r>
+      <w:r>
+        <w:rPr>
+          <w:rFonts w:ascii="Calibri" w:cs="Calibri" w:eastAsia="Calibri" w:hAnsi="Calibri"/>
+          <w:b w:val="false"/>
+          <w:bCs w:val="false"/>
+          <w:i w:val="false"/>
+          <w:iCs w:val="false"/>
+          <w:sz w:val="21"/>
+          <w:szCs w:val="21"/>
+        </w:rPr>
+        <w:t xml:space="preserve"> by using an onboard microcomputer (MCU) that stores the program in memory and is "soft-wired", so programs can be edited at the machine, stored in a library, run with on-board diagnostics and interpolation, and executed with far higher reliability, accuracy and productivity.</w:t>
       </w:r>
     </w:p>
     <w:p>
       <w:pPr>
         <w:keepNext/>
-        <w:spacing w:after="24" w:before="120" w:line="276" w:lineRule="auto"/>
+        <w:spacing w:after="26" w:before="130" w:line="278" w:lineRule="auto"/>
       </w:pPr>
       <w:r>
         <w:rPr>
@@ -824,7 +469,7 @@
     </w:p>
     <w:p>
       <w:pPr>
-        <w:spacing w:after="70" w:before="0" w:line="276" w:lineRule="auto"/>
+        <w:spacing w:after="80" w:before="0" w:line="278" w:lineRule="auto"/>
         <w:ind w:left="150"/>
       </w:pPr>
       <w:r>
@@ -862,7 +507,31 @@
           <w:sz w:val="21"/>
           <w:szCs w:val="21"/>
         </w:rPr>
-        <w:t xml:space="preserve"> is how close the machine gets to the actual target (commanded) point — hitting the bull’s-eye. </w:t>
+        <w:t xml:space="preserve"> is how close the machine gets to the </w:t>
+      </w:r>
+      <w:r>
+        <w:rPr>
+          <w:rFonts w:ascii="Calibri" w:cs="Calibri" w:eastAsia="Calibri" w:hAnsi="Calibri"/>
+          <w:b/>
+          <w:bCs/>
+          <w:i w:val="false"/>
+          <w:iCs w:val="false"/>
+          <w:sz w:val="21"/>
+          <w:szCs w:val="21"/>
+        </w:rPr>
+        <w:t xml:space="preserve">actual target (commanded) point</w:t>
+      </w:r>
+      <w:r>
+        <w:rPr>
+          <w:rFonts w:ascii="Calibri" w:cs="Calibri" w:eastAsia="Calibri" w:hAnsi="Calibri"/>
+          <w:b w:val="false"/>
+          <w:bCs w:val="false"/>
+          <w:i w:val="false"/>
+          <w:iCs w:val="false"/>
+          <w:sz w:val="21"/>
+          <w:szCs w:val="21"/>
+        </w:rPr>
+        <w:t xml:space="preserve"> — i.e. hitting the bull’s-eye. </w:t>
       </w:r>
       <w:r>
         <w:rPr>
@@ -886,7 +555,31 @@
           <w:sz w:val="21"/>
           <w:szCs w:val="21"/>
         </w:rPr>
-        <w:t xml:space="preserve"> is how closely repeated moves cluster together, whether or not they hit the target. On a target: a tight group away from the centre is </w:t>
+        <w:t xml:space="preserve"> is how closely </w:t>
+      </w:r>
+      <w:r>
+        <w:rPr>
+          <w:rFonts w:ascii="Calibri" w:cs="Calibri" w:eastAsia="Calibri" w:hAnsi="Calibri"/>
+          <w:b/>
+          <w:bCs/>
+          <w:i w:val="false"/>
+          <w:iCs w:val="false"/>
+          <w:sz w:val="21"/>
+          <w:szCs w:val="21"/>
+        </w:rPr>
+        <w:t xml:space="preserve">repeated moves cluster together</w:t>
+      </w:r>
+      <w:r>
+        <w:rPr>
+          <w:rFonts w:ascii="Calibri" w:cs="Calibri" w:eastAsia="Calibri" w:hAnsi="Calibri"/>
+          <w:b w:val="false"/>
+          <w:bCs w:val="false"/>
+          <w:i w:val="false"/>
+          <w:iCs w:val="false"/>
+          <w:sz w:val="21"/>
+          <w:szCs w:val="21"/>
+        </w:rPr>
+        <w:t xml:space="preserve">, whether or not that cluster is on the target. Using a target: a tight group placed away from the centre is </w:t>
       </w:r>
       <w:r>
         <w:rPr>
@@ -910,7 +603,7 @@
           <w:sz w:val="21"/>
           <w:szCs w:val="21"/>
         </w:rPr>
-        <w:t xml:space="preserve">; shots scattered around the centre are </w:t>
+        <w:t xml:space="preserve">; shots scattered all around the centre are </w:t>
       </w:r>
       <w:r>
         <w:rPr>
@@ -934,37 +627,85 @@
           <w:sz w:val="21"/>
           <w:szCs w:val="21"/>
         </w:rPr>
-        <w:t xml:space="preserve">; a tight group on the centre is </w:t>
-      </w:r>
-      <w:r>
-        <w:rPr>
-          <w:rFonts w:ascii="Calibri" w:cs="Calibri" w:eastAsia="Calibri" w:hAnsi="Calibri"/>
-          <w:b/>
-          <w:bCs/>
-          <w:i w:val="false"/>
-          <w:iCs w:val="false"/>
-          <w:sz w:val="21"/>
-          <w:szCs w:val="21"/>
-        </w:rPr>
-        <w:t xml:space="preserve">both</w:t>
-      </w:r>
-      <w:r>
-        <w:rPr>
-          <w:rFonts w:ascii="Calibri" w:cs="Calibri" w:eastAsia="Calibri" w:hAnsi="Calibri"/>
-          <w:b w:val="false"/>
-          <w:bCs w:val="false"/>
-          <w:i w:val="false"/>
-          <w:iCs w:val="false"/>
-          <w:sz w:val="21"/>
-          <w:szCs w:val="21"/>
-        </w:rPr>
-        <w:t xml:space="preserve">. A good CNC machine must be accurate and precise.</w:t>
+        <w:t xml:space="preserve">; and a tight group sitting on the centre is </w:t>
+      </w:r>
+      <w:r>
+        <w:rPr>
+          <w:rFonts w:ascii="Calibri" w:cs="Calibri" w:eastAsia="Calibri" w:hAnsi="Calibri"/>
+          <w:b/>
+          <w:bCs/>
+          <w:i w:val="false"/>
+          <w:iCs w:val="false"/>
+          <w:sz w:val="21"/>
+          <w:szCs w:val="21"/>
+        </w:rPr>
+        <w:t xml:space="preserve">both accurate and precise</w:t>
+      </w:r>
+      <w:r>
+        <w:rPr>
+          <w:rFonts w:ascii="Calibri" w:cs="Calibri" w:eastAsia="Calibri" w:hAnsi="Calibri"/>
+          <w:b w:val="false"/>
+          <w:bCs w:val="false"/>
+          <w:i w:val="false"/>
+          <w:iCs w:val="false"/>
+          <w:sz w:val="21"/>
+          <w:szCs w:val="21"/>
+        </w:rPr>
+        <w:t xml:space="preserve">. In practice, accuracy includes </w:t>
+      </w:r>
+      <w:r>
+        <w:rPr>
+          <w:rFonts w:ascii="Calibri" w:cs="Calibri" w:eastAsia="Calibri" w:hAnsi="Calibri"/>
+          <w:b/>
+          <w:bCs/>
+          <w:i w:val="false"/>
+          <w:iCs w:val="false"/>
+          <w:sz w:val="21"/>
+          <w:szCs w:val="21"/>
+        </w:rPr>
+        <w:t xml:space="preserve">systematic errors</w:t>
+      </w:r>
+      <w:r>
+        <w:rPr>
+          <w:rFonts w:ascii="Calibri" w:cs="Calibri" w:eastAsia="Calibri" w:hAnsi="Calibri"/>
+          <w:b w:val="false"/>
+          <w:bCs w:val="false"/>
+          <w:i w:val="false"/>
+          <w:iCs w:val="false"/>
+          <w:sz w:val="21"/>
+          <w:szCs w:val="21"/>
+        </w:rPr>
+        <w:t xml:space="preserve"> (which can be measured and calibrated out), whereas precision reflects </w:t>
+      </w:r>
+      <w:r>
+        <w:rPr>
+          <w:rFonts w:ascii="Calibri" w:cs="Calibri" w:eastAsia="Calibri" w:hAnsi="Calibri"/>
+          <w:b/>
+          <w:bCs/>
+          <w:i w:val="false"/>
+          <w:iCs w:val="false"/>
+          <w:sz w:val="21"/>
+          <w:szCs w:val="21"/>
+        </w:rPr>
+        <w:t xml:space="preserve">random scatter</w:t>
+      </w:r>
+      <w:r>
+        <w:rPr>
+          <w:rFonts w:ascii="Calibri" w:cs="Calibri" w:eastAsia="Calibri" w:hAnsi="Calibri"/>
+          <w:b w:val="false"/>
+          <w:bCs w:val="false"/>
+          <w:i w:val="false"/>
+          <w:iCs w:val="false"/>
+          <w:sz w:val="21"/>
+          <w:szCs w:val="21"/>
+        </w:rPr>
+        <w:t xml:space="preserve"> (which cannot be calibrated away). A good CNC machine must be both accurate and precise.</w:t>
       </w:r>
     </w:p>
     <w:p>
       <w:pPr>
         <w:keepNext/>
-        <w:spacing w:after="24" w:before="120" w:line="276" w:lineRule="auto"/>
+        <w:spacing w:after="26" w:before="130" w:line="278" w:lineRule="auto"/>
       </w:pPr>
       <w:r>
         <w:rPr>
@@ -994,7 +735,7 @@
     </w:p>
     <w:p>
       <w:pPr>
-        <w:spacing w:after="70" w:before="0" w:line="276" w:lineRule="auto"/>
+        <w:spacing w:after="80" w:before="0" w:line="278" w:lineRule="auto"/>
         <w:ind w:left="150"/>
       </w:pPr>
       <w:r>
@@ -1044,31 +785,31 @@
           <w:sz w:val="21"/>
           <w:szCs w:val="21"/>
         </w:rPr>
-        <w:t xml:space="preserve"> must be </w:t>
-      </w:r>
-      <w:r>
-        <w:rPr>
-          <w:rFonts w:ascii="Calibri" w:cs="Calibri" w:eastAsia="Calibri" w:hAnsi="Calibri"/>
-          <w:b/>
-          <w:bCs/>
-          <w:i w:val="false"/>
-          <w:iCs w:val="false"/>
-          <w:sz w:val="21"/>
-          <w:szCs w:val="21"/>
-        </w:rPr>
-        <w:t xml:space="preserve">reprogrammed by a human</w:t>
-      </w:r>
-      <w:r>
-        <w:rPr>
-          <w:rFonts w:ascii="Calibri" w:cs="Calibri" w:eastAsia="Calibri" w:hAnsi="Calibri"/>
-          <w:b w:val="false"/>
-          <w:bCs w:val="false"/>
-          <w:i w:val="false"/>
-          <w:iCs w:val="false"/>
-          <w:sz w:val="21"/>
-          <w:szCs w:val="21"/>
-        </w:rPr>
-        <w:t xml:space="preserve"> to handle a new product or mix. </w:t>
+        <w:t xml:space="preserve"> can make a variety of products, but it must be </w:t>
+      </w:r>
+      <w:r>
+        <w:rPr>
+          <w:rFonts w:ascii="Calibri" w:cs="Calibri" w:eastAsia="Calibri" w:hAnsi="Calibri"/>
+          <w:b/>
+          <w:bCs/>
+          <w:i w:val="false"/>
+          <w:iCs w:val="false"/>
+          <w:sz w:val="21"/>
+          <w:szCs w:val="21"/>
+        </w:rPr>
+        <w:t xml:space="preserve">reprogrammed or reset by a human</w:t>
+      </w:r>
+      <w:r>
+        <w:rPr>
+          <w:rFonts w:ascii="Calibri" w:cs="Calibri" w:eastAsia="Calibri" w:hAnsi="Calibri"/>
+          <w:b w:val="false"/>
+          <w:bCs w:val="false"/>
+          <w:i w:val="false"/>
+          <w:iCs w:val="false"/>
+          <w:sz w:val="21"/>
+          <w:szCs w:val="21"/>
+        </w:rPr>
+        <w:t xml:space="preserve"> whenever the product or mix changes. </w:t>
       </w:r>
       <w:r>
         <w:rPr>
@@ -1092,61 +833,85 @@
           <w:sz w:val="21"/>
           <w:szCs w:val="21"/>
         </w:rPr>
-        <w:t xml:space="preserve"> goes further: using sensors, real-time data, AI/machine learning and adaptive control, it </w:t>
-      </w:r>
-      <w:r>
-        <w:rPr>
-          <w:rFonts w:ascii="Calibri" w:cs="Calibri" w:eastAsia="Calibri" w:hAnsi="Calibri"/>
-          <w:b/>
-          <w:bCs/>
-          <w:i w:val="false"/>
-          <w:iCs w:val="false"/>
-          <w:sz w:val="21"/>
-          <w:szCs w:val="21"/>
-        </w:rPr>
-        <w:t xml:space="preserve">detects variations</w:t>
-      </w:r>
-      <w:r>
-        <w:rPr>
-          <w:rFonts w:ascii="Calibri" w:cs="Calibri" w:eastAsia="Calibri" w:hAnsi="Calibri"/>
-          <w:b w:val="false"/>
-          <w:bCs w:val="false"/>
-          <w:i w:val="false"/>
-          <w:iCs w:val="false"/>
-          <w:sz w:val="21"/>
-          <w:szCs w:val="21"/>
-        </w:rPr>
-        <w:t xml:space="preserve"> (tool wear, material changes, dimensional drift) and </w:t>
-      </w:r>
-      <w:r>
-        <w:rPr>
-          <w:rFonts w:ascii="Calibri" w:cs="Calibri" w:eastAsia="Calibri" w:hAnsi="Calibri"/>
-          <w:b/>
-          <w:bCs/>
-          <w:i w:val="false"/>
-          <w:iCs w:val="false"/>
-          <w:sz w:val="21"/>
-          <w:szCs w:val="21"/>
-        </w:rPr>
-        <w:t xml:space="preserve">automatically adjusts the process</w:t>
-      </w:r>
-      <w:r>
-        <w:rPr>
-          <w:rFonts w:ascii="Calibri" w:cs="Calibri" w:eastAsia="Calibri" w:hAnsi="Calibri"/>
-          <w:b w:val="false"/>
-          <w:bCs w:val="false"/>
-          <w:i w:val="false"/>
-          <w:iCs w:val="false"/>
-          <w:sz w:val="21"/>
-          <w:szCs w:val="21"/>
-        </w:rPr>
-        <w:t xml:space="preserve"> without human reprogramming. It is self-monitoring and self-optimising, so it adapts to production variation in real time instead of needing manual setup changes.</w:t>
+        <w:t xml:space="preserve"> goes a step further: using sensors, real-time data, IoT connectivity, AI/machine-learning and adaptive closed-loop control, it </w:t>
+      </w:r>
+      <w:r>
+        <w:rPr>
+          <w:rFonts w:ascii="Calibri" w:cs="Calibri" w:eastAsia="Calibri" w:hAnsi="Calibri"/>
+          <w:b/>
+          <w:bCs/>
+          <w:i w:val="false"/>
+          <w:iCs w:val="false"/>
+          <w:sz w:val="21"/>
+          <w:szCs w:val="21"/>
+        </w:rPr>
+        <w:t xml:space="preserve">detects variations by itself</w:t>
+      </w:r>
+      <w:r>
+        <w:rPr>
+          <w:rFonts w:ascii="Calibri" w:cs="Calibri" w:eastAsia="Calibri" w:hAnsi="Calibri"/>
+          <w:b w:val="false"/>
+          <w:bCs w:val="false"/>
+          <w:i w:val="false"/>
+          <w:iCs w:val="false"/>
+          <w:sz w:val="21"/>
+          <w:szCs w:val="21"/>
+        </w:rPr>
+        <w:t xml:space="preserve"> — tool wear, material differences, temperature drift or dimensional error — and </w:t>
+      </w:r>
+      <w:r>
+        <w:rPr>
+          <w:rFonts w:ascii="Calibri" w:cs="Calibri" w:eastAsia="Calibri" w:hAnsi="Calibri"/>
+          <w:b/>
+          <w:bCs/>
+          <w:i w:val="false"/>
+          <w:iCs w:val="false"/>
+          <w:sz w:val="21"/>
+          <w:szCs w:val="21"/>
+        </w:rPr>
+        <w:t xml:space="preserve">automatically adjusts the process parameters</w:t>
+      </w:r>
+      <w:r>
+        <w:rPr>
+          <w:rFonts w:ascii="Calibri" w:cs="Calibri" w:eastAsia="Calibri" w:hAnsi="Calibri"/>
+          <w:b w:val="false"/>
+          <w:bCs w:val="false"/>
+          <w:i w:val="false"/>
+          <w:iCs w:val="false"/>
+          <w:sz w:val="21"/>
+          <w:szCs w:val="21"/>
+        </w:rPr>
+        <w:t xml:space="preserve"> to correct them, often supported by a digital twin and predictive maintenance. It is therefore </w:t>
+      </w:r>
+      <w:r>
+        <w:rPr>
+          <w:rFonts w:ascii="Calibri" w:cs="Calibri" w:eastAsia="Calibri" w:hAnsi="Calibri"/>
+          <w:b/>
+          <w:bCs/>
+          <w:i w:val="false"/>
+          <w:iCs w:val="false"/>
+          <w:sz w:val="21"/>
+          <w:szCs w:val="21"/>
+        </w:rPr>
+        <w:t xml:space="preserve">self-monitoring and self-optimising</w:t>
+      </w:r>
+      <w:r>
+        <w:rPr>
+          <w:rFonts w:ascii="Calibri" w:cs="Calibri" w:eastAsia="Calibri" w:hAnsi="Calibri"/>
+          <w:b w:val="false"/>
+          <w:bCs w:val="false"/>
+          <w:i w:val="false"/>
+          <w:iCs w:val="false"/>
+          <w:sz w:val="21"/>
+          <w:szCs w:val="21"/>
+        </w:rPr>
+        <w:t xml:space="preserve">, adapting to production variation in real time instead of waiting for a human to change the setup.</w:t>
       </w:r>
     </w:p>
     <w:p>
       <w:pPr>
         <w:keepNext/>
-        <w:spacing w:after="24" w:before="120" w:line="276" w:lineRule="auto"/>
+        <w:spacing w:after="26" w:before="130" w:line="278" w:lineRule="auto"/>
       </w:pPr>
       <w:r>
         <w:rPr>
@@ -1176,7 +941,7 @@
     </w:p>
     <w:p>
       <w:pPr>
-        <w:spacing w:after="70" w:before="0" w:line="276" w:lineRule="auto"/>
+        <w:spacing w:after="80" w:before="0" w:line="278" w:lineRule="auto"/>
         <w:ind w:left="150"/>
       </w:pPr>
       <w:r>
@@ -1226,79 +991,132 @@
           <w:sz w:val="21"/>
           <w:szCs w:val="21"/>
         </w:rPr>
-        <w:t xml:space="preserve"> a central computer is networked to many CNC/NC machines. It </w:t>
-      </w:r>
-      <w:r>
-        <w:rPr>
-          <w:rFonts w:ascii="Calibri" w:cs="Calibri" w:eastAsia="Calibri" w:hAnsi="Calibri"/>
-          <w:b/>
-          <w:bCs/>
-          <w:i w:val="false"/>
-          <w:iCs w:val="false"/>
-          <w:sz w:val="21"/>
-          <w:szCs w:val="21"/>
-        </w:rPr>
-        <w:t xml:space="preserve">stores and distributes part programs</w:t>
-      </w:r>
-      <w:r>
-        <w:rPr>
-          <w:rFonts w:ascii="Calibri" w:cs="Calibri" w:eastAsia="Calibri" w:hAnsi="Calibri"/>
-          <w:b w:val="false"/>
-          <w:bCs w:val="false"/>
-          <w:i w:val="false"/>
-          <w:iCs w:val="false"/>
-          <w:sz w:val="21"/>
-          <w:szCs w:val="21"/>
-        </w:rPr>
-        <w:t xml:space="preserve"> to each machine on demand, </w:t>
-      </w:r>
-      <w:r>
-        <w:rPr>
-          <w:rFonts w:ascii="Calibri" w:cs="Calibri" w:eastAsia="Calibri" w:hAnsi="Calibri"/>
-          <w:b/>
-          <w:bCs/>
-          <w:i w:val="false"/>
-          <w:iCs w:val="false"/>
-          <w:sz w:val="21"/>
-          <w:szCs w:val="21"/>
-        </w:rPr>
-        <w:t xml:space="preserve">collects production and status data</w:t>
-      </w:r>
-      <w:r>
-        <w:rPr>
-          <w:rFonts w:ascii="Calibri" w:cs="Calibri" w:eastAsia="Calibri" w:hAnsi="Calibri"/>
-          <w:b w:val="false"/>
-          <w:bCs w:val="false"/>
-          <w:i w:val="false"/>
-          <w:iCs w:val="false"/>
-          <w:sz w:val="21"/>
-          <w:szCs w:val="21"/>
-        </w:rPr>
-        <w:t xml:space="preserve"> back from them, and manages program version control and real-time data flow. This removes the need to load programs individually at each machine and </w:t>
-      </w:r>
-      <w:r>
-        <w:rPr>
-          <w:rFonts w:ascii="Calibri" w:cs="Calibri" w:eastAsia="Calibri" w:hAnsi="Calibri"/>
-          <w:b/>
-          <w:bCs/>
-          <w:i w:val="false"/>
-          <w:iCs w:val="false"/>
-          <w:sz w:val="21"/>
-          <w:szCs w:val="21"/>
-        </w:rPr>
-        <w:t xml:space="preserve">integrates the shop floor</w:t>
-      </w:r>
-      <w:r>
-        <w:rPr>
-          <w:rFonts w:ascii="Calibri" w:cs="Calibri" w:eastAsia="Calibri" w:hAnsi="Calibri"/>
-          <w:b w:val="false"/>
-          <w:bCs w:val="false"/>
-          <w:i w:val="false"/>
-          <w:iCs w:val="false"/>
-          <w:sz w:val="21"/>
-          <w:szCs w:val="21"/>
-        </w:rPr>
-        <w:t xml:space="preserve"> into a computer-integrated manufacturing (CIM) system.</w:t>
+        <w:t xml:space="preserve">, a central computer is networked to a group of CNC/NC machines and acts as the hub for part-program data. It </w:t>
+      </w:r>
+      <w:r>
+        <w:rPr>
+          <w:rFonts w:ascii="Calibri" w:cs="Calibri" w:eastAsia="Calibri" w:hAnsi="Calibri"/>
+          <w:b/>
+          <w:bCs/>
+          <w:i w:val="false"/>
+          <w:iCs w:val="false"/>
+          <w:sz w:val="21"/>
+          <w:szCs w:val="21"/>
+        </w:rPr>
+        <w:t xml:space="preserve">stores all the part programs centrally</w:t>
+      </w:r>
+      <w:r>
+        <w:rPr>
+          <w:rFonts w:ascii="Calibri" w:cs="Calibri" w:eastAsia="Calibri" w:hAnsi="Calibri"/>
+          <w:b w:val="false"/>
+          <w:bCs w:val="false"/>
+          <w:i w:val="false"/>
+          <w:iCs w:val="false"/>
+          <w:sz w:val="21"/>
+          <w:szCs w:val="21"/>
+        </w:rPr>
+        <w:t xml:space="preserve">, </w:t>
+      </w:r>
+      <w:r>
+        <w:rPr>
+          <w:rFonts w:ascii="Calibri" w:cs="Calibri" w:eastAsia="Calibri" w:hAnsi="Calibri"/>
+          <w:b/>
+          <w:bCs/>
+          <w:i w:val="false"/>
+          <w:iCs w:val="false"/>
+          <w:sz w:val="21"/>
+          <w:szCs w:val="21"/>
+        </w:rPr>
+        <w:t xml:space="preserve">distributes the required program to each machine on demand</w:t>
+      </w:r>
+      <w:r>
+        <w:rPr>
+          <w:rFonts w:ascii="Calibri" w:cs="Calibri" w:eastAsia="Calibri" w:hAnsi="Calibri"/>
+          <w:b w:val="false"/>
+          <w:bCs w:val="false"/>
+          <w:i w:val="false"/>
+          <w:iCs w:val="false"/>
+          <w:sz w:val="21"/>
+          <w:szCs w:val="21"/>
+        </w:rPr>
+        <w:t xml:space="preserve"> (removing individual tape readers and manual loading), and </w:t>
+      </w:r>
+      <w:r>
+        <w:rPr>
+          <w:rFonts w:ascii="Calibri" w:cs="Calibri" w:eastAsia="Calibri" w:hAnsi="Calibri"/>
+          <w:b/>
+          <w:bCs/>
+          <w:i w:val="false"/>
+          <w:iCs w:val="false"/>
+          <w:sz w:val="21"/>
+          <w:szCs w:val="21"/>
+        </w:rPr>
+        <w:t xml:space="preserve">collects production and machine-status data back</w:t>
+      </w:r>
+      <w:r>
+        <w:rPr>
+          <w:rFonts w:ascii="Calibri" w:cs="Calibri" w:eastAsia="Calibri" w:hAnsi="Calibri"/>
+          <w:b w:val="false"/>
+          <w:bCs w:val="false"/>
+          <w:i w:val="false"/>
+          <w:iCs w:val="false"/>
+          <w:sz w:val="21"/>
+          <w:szCs w:val="21"/>
+        </w:rPr>
+        <w:t xml:space="preserve"> from the shop floor for monitoring. It also manages </w:t>
+      </w:r>
+      <w:r>
+        <w:rPr>
+          <w:rFonts w:ascii="Calibri" w:cs="Calibri" w:eastAsia="Calibri" w:hAnsi="Calibri"/>
+          <w:b/>
+          <w:bCs/>
+          <w:i w:val="false"/>
+          <w:iCs w:val="false"/>
+          <w:sz w:val="21"/>
+          <w:szCs w:val="21"/>
+        </w:rPr>
+        <w:t xml:space="preserve">program version control and back-up</w:t>
+      </w:r>
+      <w:r>
+        <w:rPr>
+          <w:rFonts w:ascii="Calibri" w:cs="Calibri" w:eastAsia="Calibri" w:hAnsi="Calibri"/>
+          <w:b w:val="false"/>
+          <w:bCs w:val="false"/>
+          <w:i w:val="false"/>
+          <w:iCs w:val="false"/>
+          <w:sz w:val="21"/>
+          <w:szCs w:val="21"/>
+        </w:rPr>
+        <w:t xml:space="preserve">, and links the machines upward to scheduling, MES and ERP systems. In this way DNC ties isolated machines together into a coordinated, data-driven </w:t>
+      </w:r>
+      <w:r>
+        <w:rPr>
+          <w:rFonts w:ascii="Calibri" w:cs="Calibri" w:eastAsia="Calibri" w:hAnsi="Calibri"/>
+          <w:b/>
+          <w:bCs/>
+          <w:i w:val="false"/>
+          <w:iCs w:val="false"/>
+          <w:sz w:val="21"/>
+          <w:szCs w:val="21"/>
+        </w:rPr>
+        <w:t xml:space="preserve">computer-integrated manufacturing (CIM)</w:t>
+      </w:r>
+      <w:r>
+        <w:rPr>
+          <w:rFonts w:ascii="Calibri" w:cs="Calibri" w:eastAsia="Calibri" w:hAnsi="Calibri"/>
+          <w:b w:val="false"/>
+          <w:bCs w:val="false"/>
+          <w:i w:val="false"/>
+          <w:iCs w:val="false"/>
+          <w:sz w:val="21"/>
+          <w:szCs w:val="21"/>
+        </w:rPr>
+        <w:t xml:space="preserve"> environment.</w:t>
+      </w:r>
+    </w:p>
+    <w:p>
+      <w:r>
+        <w:br w:type="page"/>
       </w:r>
     </w:p>
     <w:p>
@@ -1556,7 +1374,7 @@
     <w:p>
       <w:pPr>
         <w:keepNext/>
-        <w:spacing w:after="24" w:before="120" w:line="276" w:lineRule="auto"/>
+        <w:spacing w:after="26" w:before="130" w:line="278" w:lineRule="auto"/>
       </w:pPr>
       <w:r>
         <w:rPr>
@@ -1586,7 +1404,7 @@
     </w:p>
     <w:p>
       <w:pPr>
-        <w:spacing w:after="70" w:before="0" w:line="276" w:lineRule="auto"/>
+        <w:spacing w:after="80" w:before="0" w:line="278" w:lineRule="auto"/>
         <w:ind w:left="150"/>
       </w:pPr>
       <w:r>
@@ -1636,7 +1454,7 @@
           <w:sz w:val="21"/>
           <w:szCs w:val="21"/>
         </w:rPr>
-        <w:t xml:space="preserve">, converting rotary to linear motion through </w:t>
+        <w:t xml:space="preserve">, so motion is transmitted through </w:t>
       </w:r>
       <w:r>
         <w:rPr>
@@ -1660,7 +1478,7 @@
           <w:sz w:val="21"/>
           <w:szCs w:val="21"/>
         </w:rPr>
-        <w:t xml:space="preserve">. Backlash (lost motion on reversal) is removed by </w:t>
+        <w:t xml:space="preserve"> instead of the sliding contact of an Acme thread. Backlash (the lost motion felt when an axis reverses) is removed by </w:t>
       </w:r>
       <w:r>
         <w:rPr>
@@ -1684,7 +1502,31 @@
           <w:sz w:val="21"/>
           <w:szCs w:val="21"/>
         </w:rPr>
-        <w:t xml:space="preserve"> — a double nut or oversized balls keep the balls in firm contact with both flanks of the thread, eliminating the clearance/play that a sliding Acme lead screw has. The result is </w:t>
+        <w:t xml:space="preserve"> — using a </w:t>
+      </w:r>
+      <w:r>
+        <w:rPr>
+          <w:rFonts w:ascii="Calibri" w:cs="Calibri" w:eastAsia="Calibri" w:hAnsi="Calibri"/>
+          <w:b/>
+          <w:bCs/>
+          <w:i w:val="false"/>
+          <w:iCs w:val="false"/>
+          <w:sz w:val="21"/>
+          <w:szCs w:val="21"/>
+        </w:rPr>
+        <w:t xml:space="preserve">double nut, an oversized ball set, or a lead shift</w:t>
+      </w:r>
+      <w:r>
+        <w:rPr>
+          <w:rFonts w:ascii="Calibri" w:cs="Calibri" w:eastAsia="Calibri" w:hAnsi="Calibri"/>
+          <w:b w:val="false"/>
+          <w:bCs w:val="false"/>
+          <w:i w:val="false"/>
+          <w:iCs w:val="false"/>
+          <w:sz w:val="21"/>
+          <w:szCs w:val="21"/>
+        </w:rPr>
+        <w:t xml:space="preserve"> so that the balls are held in firm contact with both flanks of the thread at all times, eliminating the internal clearance. This gives </w:t>
       </w:r>
       <w:r>
         <w:rPr>
@@ -1708,13 +1550,13 @@
           <w:sz w:val="21"/>
           <w:szCs w:val="21"/>
         </w:rPr>
-        <w:t xml:space="preserve"> and high positioning accuracy.</w:t>
+        <w:t xml:space="preserve">, much higher mechanical efficiency (about 90 % against roughly 40 % for an Acme screw), higher rigidity and far better positioning accuracy and repeatability.</w:t>
       </w:r>
     </w:p>
     <w:p>
       <w:pPr>
         <w:keepNext/>
-        <w:spacing w:after="24" w:before="120" w:line="276" w:lineRule="auto"/>
+        <w:spacing w:after="26" w:before="130" w:line="278" w:lineRule="auto"/>
       </w:pPr>
       <w:r>
         <w:rPr>
@@ -1744,7 +1586,7 @@
     </w:p>
     <w:p>
       <w:pPr>
-        <w:spacing w:after="70" w:before="0" w:line="276" w:lineRule="auto"/>
+        <w:spacing w:after="80" w:before="0" w:line="278" w:lineRule="auto"/>
         <w:ind w:left="150"/>
       </w:pPr>
       <w:r>
@@ -1770,73 +1612,145 @@
           <w:sz w:val="21"/>
           <w:szCs w:val="21"/>
         </w:rPr>
-        <w:t xml:space="preserve">LM (rolling) guideways</w:t>
-      </w:r>
-      <w:r>
-        <w:rPr>
-          <w:rFonts w:ascii="Calibri" w:cs="Calibri" w:eastAsia="Calibri" w:hAnsi="Calibri"/>
-          <w:b w:val="false"/>
-          <w:bCs w:val="false"/>
-          <w:i w:val="false"/>
-          <w:iCs w:val="false"/>
-          <w:sz w:val="21"/>
-          <w:szCs w:val="21"/>
-        </w:rPr>
-        <w:t xml:space="preserve"> use recirculating rolling elements, giving very low friction, no stick-slip, high-speed capability and easy replacement — ideal for fast, precise positioning. </w:t>
-      </w:r>
-      <w:r>
-        <w:rPr>
-          <w:rFonts w:ascii="Calibri" w:cs="Calibri" w:eastAsia="Calibri" w:hAnsi="Calibri"/>
-          <w:b/>
-          <w:bCs/>
-          <w:i w:val="false"/>
-          <w:iCs w:val="false"/>
-          <w:sz w:val="21"/>
-          <w:szCs w:val="21"/>
-        </w:rPr>
-        <w:t xml:space="preserve">Hardened &amp; ground (box) guideways</w:t>
-      </w:r>
-      <w:r>
-        <w:rPr>
-          <w:rFonts w:ascii="Calibri" w:cs="Calibri" w:eastAsia="Calibri" w:hAnsi="Calibri"/>
-          <w:b w:val="false"/>
-          <w:bCs w:val="false"/>
-          <w:i w:val="false"/>
-          <w:iCs w:val="false"/>
-          <w:sz w:val="21"/>
-          <w:szCs w:val="21"/>
-        </w:rPr>
-        <w:t xml:space="preserve"> are sliding contact with a large surface area, giving high load capacity, stiffness and vibration/chatter damping, but with higher friction and lower speed. In high-speed machining centres </w:t>
-      </w:r>
-      <w:r>
-        <w:rPr>
-          <w:rFonts w:ascii="Calibri" w:cs="Calibri" w:eastAsia="Calibri" w:hAnsi="Calibri"/>
-          <w:b/>
-          <w:bCs/>
-          <w:i w:val="false"/>
-          <w:iCs w:val="false"/>
-          <w:sz w:val="21"/>
-          <w:szCs w:val="21"/>
-        </w:rPr>
-        <w:t xml:space="preserve">LM guides are preferred</w:t>
-      </w:r>
-      <w:r>
-        <w:rPr>
-          <w:rFonts w:ascii="Calibri" w:cs="Calibri" w:eastAsia="Calibri" w:hAnsi="Calibri"/>
-          <w:b w:val="false"/>
-          <w:bCs w:val="false"/>
-          <w:i w:val="false"/>
-          <w:iCs w:val="false"/>
-          <w:sz w:val="21"/>
-          <w:szCs w:val="21"/>
-        </w:rPr>
-        <w:t xml:space="preserve"> for speed and precision, while box ways suit heavy roughing cuts.</w:t>
+        <w:t xml:space="preserve">LM (linear-motion, rolling) guideways</w:t>
+      </w:r>
+      <w:r>
+        <w:rPr>
+          <w:rFonts w:ascii="Calibri" w:cs="Calibri" w:eastAsia="Calibri" w:hAnsi="Calibri"/>
+          <w:b w:val="false"/>
+          <w:bCs w:val="false"/>
+          <w:i w:val="false"/>
+          <w:iCs w:val="false"/>
+          <w:sz w:val="21"/>
+          <w:szCs w:val="21"/>
+        </w:rPr>
+        <w:t xml:space="preserve"> use recirculating balls or rollers, giving </w:t>
+      </w:r>
+      <w:r>
+        <w:rPr>
+          <w:rFonts w:ascii="Calibri" w:cs="Calibri" w:eastAsia="Calibri" w:hAnsi="Calibri"/>
+          <w:b/>
+          <w:bCs/>
+          <w:i w:val="false"/>
+          <w:iCs w:val="false"/>
+          <w:sz w:val="21"/>
+          <w:szCs w:val="21"/>
+        </w:rPr>
+        <w:t xml:space="preserve">very low friction, no stick-slip, very high rapid-traverse speeds, low heat generation and easy replacement</w:t>
+      </w:r>
+      <w:r>
+        <w:rPr>
+          <w:rFonts w:ascii="Calibri" w:cs="Calibri" w:eastAsia="Calibri" w:hAnsi="Calibri"/>
+          <w:b w:val="false"/>
+          <w:bCs w:val="false"/>
+          <w:i w:val="false"/>
+          <w:iCs w:val="false"/>
+          <w:sz w:val="21"/>
+          <w:szCs w:val="21"/>
+        </w:rPr>
+        <w:t xml:space="preserve"> — ideal for fast, precise positioning. </w:t>
+      </w:r>
+      <w:r>
+        <w:rPr>
+          <w:rFonts w:ascii="Calibri" w:cs="Calibri" w:eastAsia="Calibri" w:hAnsi="Calibri"/>
+          <w:b/>
+          <w:bCs/>
+          <w:i w:val="false"/>
+          <w:iCs w:val="false"/>
+          <w:sz w:val="21"/>
+          <w:szCs w:val="21"/>
+        </w:rPr>
+        <w:t xml:space="preserve">Hardened and ground (box) guideways</w:t>
+      </w:r>
+      <w:r>
+        <w:rPr>
+          <w:rFonts w:ascii="Calibri" w:cs="Calibri" w:eastAsia="Calibri" w:hAnsi="Calibri"/>
+          <w:b w:val="false"/>
+          <w:bCs w:val="false"/>
+          <w:i w:val="false"/>
+          <w:iCs w:val="false"/>
+          <w:sz w:val="21"/>
+          <w:szCs w:val="21"/>
+        </w:rPr>
+        <w:t xml:space="preserve"> are a large sliding-contact surface, giving </w:t>
+      </w:r>
+      <w:r>
+        <w:rPr>
+          <w:rFonts w:ascii="Calibri" w:cs="Calibri" w:eastAsia="Calibri" w:hAnsi="Calibri"/>
+          <w:b/>
+          <w:bCs/>
+          <w:i w:val="false"/>
+          <w:iCs w:val="false"/>
+          <w:sz w:val="21"/>
+          <w:szCs w:val="21"/>
+        </w:rPr>
+        <w:t xml:space="preserve">high load capacity, high stiffness and excellent vibration/chatter damping</w:t>
+      </w:r>
+      <w:r>
+        <w:rPr>
+          <w:rFonts w:ascii="Calibri" w:cs="Calibri" w:eastAsia="Calibri" w:hAnsi="Calibri"/>
+          <w:b w:val="false"/>
+          <w:bCs w:val="false"/>
+          <w:i w:val="false"/>
+          <w:iCs w:val="false"/>
+          <w:sz w:val="21"/>
+          <w:szCs w:val="21"/>
+        </w:rPr>
+        <w:t xml:space="preserve">, but with higher friction, more heat and lower speed. In </w:t>
+      </w:r>
+      <w:r>
+        <w:rPr>
+          <w:rFonts w:ascii="Calibri" w:cs="Calibri" w:eastAsia="Calibri" w:hAnsi="Calibri"/>
+          <w:b/>
+          <w:bCs/>
+          <w:i w:val="false"/>
+          <w:iCs w:val="false"/>
+          <w:sz w:val="21"/>
+          <w:szCs w:val="21"/>
+        </w:rPr>
+        <w:t xml:space="preserve">high-speed machining centres LM guideways are generally preferred</w:t>
+      </w:r>
+      <w:r>
+        <w:rPr>
+          <w:rFonts w:ascii="Calibri" w:cs="Calibri" w:eastAsia="Calibri" w:hAnsi="Calibri"/>
+          <w:b w:val="false"/>
+          <w:bCs w:val="false"/>
+          <w:i w:val="false"/>
+          <w:iCs w:val="false"/>
+          <w:sz w:val="21"/>
+          <w:szCs w:val="21"/>
+        </w:rPr>
+        <w:t xml:space="preserve"> for their speed and precision, while box ways are retained on axes that take </w:t>
+      </w:r>
+      <w:r>
+        <w:rPr>
+          <w:rFonts w:ascii="Calibri" w:cs="Calibri" w:eastAsia="Calibri" w:hAnsi="Calibri"/>
+          <w:b/>
+          <w:bCs/>
+          <w:i w:val="false"/>
+          <w:iCs w:val="false"/>
+          <w:sz w:val="21"/>
+          <w:szCs w:val="21"/>
+        </w:rPr>
+        <w:t xml:space="preserve">heavy or interrupted roughing cuts</w:t>
+      </w:r>
+      <w:r>
+        <w:rPr>
+          <w:rFonts w:ascii="Calibri" w:cs="Calibri" w:eastAsia="Calibri" w:hAnsi="Calibri"/>
+          <w:b w:val="false"/>
+          <w:bCs w:val="false"/>
+          <w:i w:val="false"/>
+          <w:iCs w:val="false"/>
+          <w:sz w:val="21"/>
+          <w:szCs w:val="21"/>
+        </w:rPr>
+        <w:t xml:space="preserve">, where their damping protects the tool and surface finish.</w:t>
       </w:r>
     </w:p>
     <w:p>
       <w:pPr>
         <w:keepNext/>
-        <w:spacing w:after="24" w:before="120" w:line="276" w:lineRule="auto"/>
+        <w:spacing w:after="26" w:before="130" w:line="278" w:lineRule="auto"/>
       </w:pPr>
       <w:r>
         <w:rPr>
@@ -1866,7 +1780,7 @@
     </w:p>
     <w:p>
       <w:pPr>
-        <w:spacing w:after="70" w:before="0" w:line="276" w:lineRule="auto"/>
+        <w:spacing w:after="80" w:before="0" w:line="278" w:lineRule="auto"/>
         <w:ind w:left="150"/>
       </w:pPr>
       <w:r>
@@ -1892,31 +1806,79 @@
           <w:sz w:val="21"/>
           <w:szCs w:val="21"/>
         </w:rPr>
-        <w:t xml:space="preserve">A rotary encoder on the motor/screw measures only the </w:t>
-      </w:r>
-      <w:r>
-        <w:rPr>
-          <w:rFonts w:ascii="Calibri" w:cs="Calibri" w:eastAsia="Calibri" w:hAnsi="Calibri"/>
-          <w:b/>
-          <w:bCs/>
-          <w:i w:val="false"/>
-          <w:iCs w:val="false"/>
-          <w:sz w:val="21"/>
-          <w:szCs w:val="21"/>
-        </w:rPr>
-        <w:t xml:space="preserve">screw’s rotation</w:t>
-      </w:r>
-      <w:r>
-        <w:rPr>
-          <w:rFonts w:ascii="Calibri" w:cs="Calibri" w:eastAsia="Calibri" w:hAnsi="Calibri"/>
-          <w:b w:val="false"/>
-          <w:bCs w:val="false"/>
-          <w:i w:val="false"/>
-          <w:iCs w:val="false"/>
-          <w:sz w:val="21"/>
-          <w:szCs w:val="21"/>
-        </w:rPr>
-        <w:t xml:space="preserve">, so it cannot see errors introduced after the screw — ball-screw pitch error, thermal expansion, backlash and wear. A </w:t>
+        <w:t xml:space="preserve">A rotary encoder on the motor or screw only measures the </w:t>
+      </w:r>
+      <w:r>
+        <w:rPr>
+          <w:rFonts w:ascii="Calibri" w:cs="Calibri" w:eastAsia="Calibri" w:hAnsi="Calibri"/>
+          <w:b/>
+          <w:bCs/>
+          <w:i w:val="false"/>
+          <w:iCs w:val="false"/>
+          <w:sz w:val="21"/>
+          <w:szCs w:val="21"/>
+        </w:rPr>
+        <w:t xml:space="preserve">screw’s angular rotation</w:t>
+      </w:r>
+      <w:r>
+        <w:rPr>
+          <w:rFonts w:ascii="Calibri" w:cs="Calibri" w:eastAsia="Calibri" w:hAnsi="Calibri"/>
+          <w:b w:val="false"/>
+          <w:bCs w:val="false"/>
+          <w:i w:val="false"/>
+          <w:iCs w:val="false"/>
+          <w:sz w:val="21"/>
+          <w:szCs w:val="21"/>
+        </w:rPr>
+        <w:t xml:space="preserve">, so the table position is </w:t>
+      </w:r>
+      <w:r>
+        <w:rPr>
+          <w:rFonts w:ascii="Calibri" w:cs="Calibri" w:eastAsia="Calibri" w:hAnsi="Calibri"/>
+          <w:b/>
+          <w:bCs/>
+          <w:i w:val="false"/>
+          <w:iCs w:val="false"/>
+          <w:sz w:val="21"/>
+          <w:szCs w:val="21"/>
+        </w:rPr>
+        <w:t xml:space="preserve">inferred indirectly</w:t>
+      </w:r>
+      <w:r>
+        <w:rPr>
+          <w:rFonts w:ascii="Calibri" w:cs="Calibri" w:eastAsia="Calibri" w:hAnsi="Calibri"/>
+          <w:b w:val="false"/>
+          <w:bCs w:val="false"/>
+          <w:i w:val="false"/>
+          <w:iCs w:val="false"/>
+          <w:sz w:val="21"/>
+          <w:szCs w:val="21"/>
+        </w:rPr>
+        <w:t xml:space="preserve"> from the assumed lead. It therefore </w:t>
+      </w:r>
+      <w:r>
+        <w:rPr>
+          <w:rFonts w:ascii="Calibri" w:cs="Calibri" w:eastAsia="Calibri" w:hAnsi="Calibri"/>
+          <w:b/>
+          <w:bCs/>
+          <w:i w:val="false"/>
+          <w:iCs w:val="false"/>
+          <w:sz w:val="21"/>
+          <w:szCs w:val="21"/>
+        </w:rPr>
+        <w:t xml:space="preserve">cannot detect any error that occurs after the screw</w:t>
+      </w:r>
+      <w:r>
+        <w:rPr>
+          <w:rFonts w:ascii="Calibri" w:cs="Calibri" w:eastAsia="Calibri" w:hAnsi="Calibri"/>
+          <w:b w:val="false"/>
+          <w:bCs w:val="false"/>
+          <w:i w:val="false"/>
+          <w:iCs w:val="false"/>
+          <w:sz w:val="21"/>
+          <w:szCs w:val="21"/>
+        </w:rPr>
+        <w:t xml:space="preserve"> — ball-screw pitch error, thermal expansion of the screw, backlash, nut wear or coupling wind-up. A </w:t>
       </w:r>
       <w:r>
         <w:rPr>
@@ -1940,37 +1902,61 @@
           <w:sz w:val="21"/>
           <w:szCs w:val="21"/>
         </w:rPr>
-        <w:t xml:space="preserve"> mounted on the axis measures the </w:t>
-      </w:r>
-      <w:r>
-        <w:rPr>
-          <w:rFonts w:ascii="Calibri" w:cs="Calibri" w:eastAsia="Calibri" w:hAnsi="Calibri"/>
-          <w:b/>
-          <w:bCs/>
-          <w:i w:val="false"/>
-          <w:iCs w:val="false"/>
-          <w:sz w:val="21"/>
-          <w:szCs w:val="21"/>
-        </w:rPr>
-        <w:t xml:space="preserve">table’s actual position directly</w:t>
-      </w:r>
-      <w:r>
-        <w:rPr>
-          <w:rFonts w:ascii="Calibri" w:cs="Calibri" w:eastAsia="Calibri" w:hAnsi="Calibri"/>
-          <w:b w:val="false"/>
-          <w:bCs w:val="false"/>
-          <w:i w:val="false"/>
-          <w:iCs w:val="false"/>
-          <w:sz w:val="21"/>
-          <w:szCs w:val="21"/>
-        </w:rPr>
-        <w:t xml:space="preserve"> (true closed-loop feedback), so it detects and corrects all these errors, giving the higher positional accuracy that high-precision work demands.</w:t>
+        <w:t xml:space="preserve"> is mounted on the axis itself and measures the </w:t>
+      </w:r>
+      <w:r>
+        <w:rPr>
+          <w:rFonts w:ascii="Calibri" w:cs="Calibri" w:eastAsia="Calibri" w:hAnsi="Calibri"/>
+          <w:b/>
+          <w:bCs/>
+          <w:i w:val="false"/>
+          <w:iCs w:val="false"/>
+          <w:sz w:val="21"/>
+          <w:szCs w:val="21"/>
+        </w:rPr>
+        <w:t xml:space="preserve">table’s true linear position directly</w:t>
+      </w:r>
+      <w:r>
+        <w:rPr>
+          <w:rFonts w:ascii="Calibri" w:cs="Calibri" w:eastAsia="Calibri" w:hAnsi="Calibri"/>
+          <w:b w:val="false"/>
+          <w:bCs w:val="false"/>
+          <w:i w:val="false"/>
+          <w:iCs w:val="false"/>
+          <w:sz w:val="21"/>
+          <w:szCs w:val="21"/>
+        </w:rPr>
+        <w:t xml:space="preserve"> (a genuine closed loop that satisfies the Abbe principle), so it </w:t>
+      </w:r>
+      <w:r>
+        <w:rPr>
+          <w:rFonts w:ascii="Calibri" w:cs="Calibri" w:eastAsia="Calibri" w:hAnsi="Calibri"/>
+          <w:b/>
+          <w:bCs/>
+          <w:i w:val="false"/>
+          <w:iCs w:val="false"/>
+          <w:sz w:val="21"/>
+          <w:szCs w:val="21"/>
+        </w:rPr>
+        <w:t xml:space="preserve">sees and corrects all of those errors</w:t>
+      </w:r>
+      <w:r>
+        <w:rPr>
+          <w:rFonts w:ascii="Calibri" w:cs="Calibri" w:eastAsia="Calibri" w:hAnsi="Calibri"/>
+          <w:b w:val="false"/>
+          <w:bCs w:val="false"/>
+          <w:i w:val="false"/>
+          <w:iCs w:val="false"/>
+          <w:sz w:val="21"/>
+          <w:szCs w:val="21"/>
+        </w:rPr>
+        <w:t xml:space="preserve">. For micron-level accuracy — especially where the screw heats up during long runs — direct glass-scale feedback is essential.</w:t>
       </w:r>
     </w:p>
     <w:p>
       <w:pPr>
         <w:keepNext/>
-        <w:spacing w:after="24" w:before="120" w:line="276" w:lineRule="auto"/>
+        <w:spacing w:after="26" w:before="130" w:line="278" w:lineRule="auto"/>
       </w:pPr>
       <w:r>
         <w:rPr>
@@ -2000,7 +1986,7 @@
     </w:p>
     <w:p>
       <w:pPr>
-        <w:spacing w:after="70" w:before="0" w:line="276" w:lineRule="auto"/>
+        <w:spacing w:after="80" w:before="0" w:line="278" w:lineRule="auto"/>
         <w:ind w:left="150"/>
       </w:pPr>
       <w:r>
@@ -2050,31 +2036,55 @@
           <w:sz w:val="21"/>
           <w:szCs w:val="21"/>
         </w:rPr>
-        <w:t xml:space="preserve"> bearing the oil film is generated by the </w:t>
-      </w:r>
-      <w:r>
-        <w:rPr>
-          <w:rFonts w:ascii="Calibri" w:cs="Calibri" w:eastAsia="Calibri" w:hAnsi="Calibri"/>
-          <w:b/>
-          <w:bCs/>
-          <w:i w:val="false"/>
-          <w:iCs w:val="false"/>
-          <w:sz w:val="21"/>
-          <w:szCs w:val="21"/>
-        </w:rPr>
-        <w:t xml:space="preserve">rotation of the journal itself</w:t>
-      </w:r>
-      <w:r>
-        <w:rPr>
-          <w:rFonts w:ascii="Calibri" w:cs="Calibri" w:eastAsia="Calibri" w:hAnsi="Calibri"/>
-          <w:b w:val="false"/>
-          <w:bCs w:val="false"/>
-          <w:i w:val="false"/>
-          <w:iCs w:val="false"/>
-          <w:sz w:val="21"/>
-          <w:szCs w:val="21"/>
-        </w:rPr>
-        <w:t xml:space="preserve">, so at startup (zero/low speed) there is metal-to-metal contact and wear until speed builds the film. In a </w:t>
+        <w:t xml:space="preserve"> bearing the supporting oil film is </w:t>
+      </w:r>
+      <w:r>
+        <w:rPr>
+          <w:rFonts w:ascii="Calibri" w:cs="Calibri" w:eastAsia="Calibri" w:hAnsi="Calibri"/>
+          <w:b/>
+          <w:bCs/>
+          <w:i w:val="false"/>
+          <w:iCs w:val="false"/>
+          <w:sz w:val="21"/>
+          <w:szCs w:val="21"/>
+        </w:rPr>
+        <w:t xml:space="preserve">generated by the rotation of the journal itself</w:t>
+      </w:r>
+      <w:r>
+        <w:rPr>
+          <w:rFonts w:ascii="Calibri" w:cs="Calibri" w:eastAsia="Calibri" w:hAnsi="Calibri"/>
+          <w:b w:val="false"/>
+          <w:bCs w:val="false"/>
+          <w:i w:val="false"/>
+          <w:iCs w:val="false"/>
+          <w:sz w:val="21"/>
+          <w:szCs w:val="21"/>
+        </w:rPr>
+        <w:t xml:space="preserve">; at rest and at low speed there is </w:t>
+      </w:r>
+      <w:r>
+        <w:rPr>
+          <w:rFonts w:ascii="Calibri" w:cs="Calibri" w:eastAsia="Calibri" w:hAnsi="Calibri"/>
+          <w:b/>
+          <w:bCs/>
+          <w:i w:val="false"/>
+          <w:iCs w:val="false"/>
+          <w:sz w:val="21"/>
+          <w:szCs w:val="21"/>
+        </w:rPr>
+        <w:t xml:space="preserve">metal-to-metal contact</w:t>
+      </w:r>
+      <w:r>
+        <w:rPr>
+          <w:rFonts w:ascii="Calibri" w:cs="Calibri" w:eastAsia="Calibri" w:hAnsi="Calibri"/>
+          <w:b w:val="false"/>
+          <w:bCs w:val="false"/>
+          <w:i w:val="false"/>
+          <w:iCs w:val="false"/>
+          <w:sz w:val="21"/>
+          <w:szCs w:val="21"/>
+        </w:rPr>
+        <w:t xml:space="preserve">, so there is friction and wear at every start and stop until the spinning shaft drags the film up. In a </w:t>
       </w:r>
       <w:r>
         <w:rPr>
@@ -2110,43 +2120,72 @@
           <w:sz w:val="21"/>
           <w:szCs w:val="21"/>
         </w:rPr>
-        <w:t xml:space="preserve">pressurised by an external pump</w:t>
-      </w:r>
-      <w:r>
-        <w:rPr>
-          <w:rFonts w:ascii="Calibri" w:cs="Calibri" w:eastAsia="Calibri" w:hAnsi="Calibri"/>
-          <w:b w:val="false"/>
-          <w:bCs w:val="false"/>
-          <w:i w:val="false"/>
-          <w:iCs w:val="false"/>
-          <w:sz w:val="21"/>
-          <w:szCs w:val="21"/>
-        </w:rPr>
-        <w:t xml:space="preserve">, maintaining a supporting film even at zero speed. Therefore hydrostatic bearings give </w:t>
-      </w:r>
-      <w:r>
-        <w:rPr>
-          <w:rFonts w:ascii="Calibri" w:cs="Calibri" w:eastAsia="Calibri" w:hAnsi="Calibri"/>
-          <w:b/>
-          <w:bCs/>
-          <w:i w:val="false"/>
-          <w:iCs w:val="false"/>
-          <w:sz w:val="21"/>
-          <w:szCs w:val="21"/>
-        </w:rPr>
-        <w:t xml:space="preserve">zero-wear starts</w:t>
-      </w:r>
-      <w:r>
-        <w:rPr>
-          <w:rFonts w:ascii="Calibri" w:cs="Calibri" w:eastAsia="Calibri" w:hAnsi="Calibri"/>
-          <w:b w:val="false"/>
-          <w:bCs w:val="false"/>
-          <w:i w:val="false"/>
-          <w:iCs w:val="false"/>
-          <w:sz w:val="21"/>
-          <w:szCs w:val="21"/>
-        </w:rPr>
-        <w:t xml:space="preserve">, whereas hydrodynamic bearings wear slightly at every start and stop.</w:t>
+        <w:t xml:space="preserve">supplied under pressure by an external pump</w:t>
+      </w:r>
+      <w:r>
+        <w:rPr>
+          <w:rFonts w:ascii="Calibri" w:cs="Calibri" w:eastAsia="Calibri" w:hAnsi="Calibri"/>
+          <w:b w:val="false"/>
+          <w:bCs w:val="false"/>
+          <w:i w:val="false"/>
+          <w:iCs w:val="false"/>
+          <w:sz w:val="21"/>
+          <w:szCs w:val="21"/>
+        </w:rPr>
+        <w:t xml:space="preserve">, so a </w:t>
+      </w:r>
+      <w:r>
+        <w:rPr>
+          <w:rFonts w:ascii="Calibri" w:cs="Calibri" w:eastAsia="Calibri" w:hAnsi="Calibri"/>
+          <w:b/>
+          <w:bCs/>
+          <w:i w:val="false"/>
+          <w:iCs w:val="false"/>
+          <w:sz w:val="21"/>
+          <w:szCs w:val="21"/>
+        </w:rPr>
+        <w:t xml:space="preserve">full supporting film exists even at zero speed</w:t>
+      </w:r>
+      <w:r>
+        <w:rPr>
+          <w:rFonts w:ascii="Calibri" w:cs="Calibri" w:eastAsia="Calibri" w:hAnsi="Calibri"/>
+          <w:b w:val="false"/>
+          <w:bCs w:val="false"/>
+          <w:i w:val="false"/>
+          <w:iCs w:val="false"/>
+          <w:sz w:val="21"/>
+          <w:szCs w:val="21"/>
+        </w:rPr>
+        <w:t xml:space="preserve">, giving a frictionless, </w:t>
+      </w:r>
+      <w:r>
+        <w:rPr>
+          <w:rFonts w:ascii="Calibri" w:cs="Calibri" w:eastAsia="Calibri" w:hAnsi="Calibri"/>
+          <w:b/>
+          <w:bCs/>
+          <w:i w:val="false"/>
+          <w:iCs w:val="false"/>
+          <w:sz w:val="21"/>
+          <w:szCs w:val="21"/>
+        </w:rPr>
+        <w:t xml:space="preserve">zero-wear start</w:t>
+      </w:r>
+      <w:r>
+        <w:rPr>
+          <w:rFonts w:ascii="Calibri" w:cs="Calibri" w:eastAsia="Calibri" w:hAnsi="Calibri"/>
+          <w:b w:val="false"/>
+          <w:bCs w:val="false"/>
+          <w:i w:val="false"/>
+          <w:iCs w:val="false"/>
+          <w:sz w:val="21"/>
+          <w:szCs w:val="21"/>
+        </w:rPr>
+        <w:t xml:space="preserve"> and very high stiffness and accuracy. The trade-off is that the hydrostatic design needs a pump, filtration and more cost, whereas the hydrodynamic bearing is simpler and cheaper and performs well once it is running at steady high speed.</w:t>
+      </w:r>
+    </w:p>
+    <w:p>
+      <w:r>
+        <w:br w:type="page"/>
       </w:r>
     </w:p>
     <w:p>
@@ -2332,7 +2371,7 @@
     <w:p>
       <w:pPr>
         <w:keepNext/>
-        <w:spacing w:after="24" w:before="120" w:line="276" w:lineRule="auto"/>
+        <w:spacing w:after="26" w:before="130" w:line="278" w:lineRule="auto"/>
       </w:pPr>
       <w:r>
         <w:rPr>
@@ -2362,7 +2401,7 @@
     </w:p>
     <w:p>
       <w:pPr>
-        <w:spacing w:after="70" w:before="0" w:line="276" w:lineRule="auto"/>
+        <w:spacing w:after="80" w:before="0" w:line="278" w:lineRule="auto"/>
         <w:ind w:left="150"/>
       </w:pPr>
       <w:r>
@@ -2436,31 +2475,55 @@
           <w:sz w:val="21"/>
           <w:szCs w:val="21"/>
         </w:rPr>
-        <w:t xml:space="preserve">. On straight turning and facing this causes no error, but on </w:t>
-      </w:r>
-      <w:r>
-        <w:rPr>
-          <w:rFonts w:ascii="Calibri" w:cs="Calibri" w:eastAsia="Calibri" w:hAnsi="Calibri"/>
-          <w:b/>
-          <w:bCs/>
-          <w:i w:val="false"/>
-          <w:iCs w:val="false"/>
-          <w:sz w:val="21"/>
-          <w:szCs w:val="21"/>
-        </w:rPr>
-        <w:t xml:space="preserve">tapers and circular contours</w:t>
-      </w:r>
-      <w:r>
-        <w:rPr>
-          <w:rFonts w:ascii="Calibri" w:cs="Calibri" w:eastAsia="Calibri" w:hAnsi="Calibri"/>
-          <w:b w:val="false"/>
-          <w:bCs w:val="false"/>
-          <w:i w:val="false"/>
-          <w:iCs w:val="false"/>
-          <w:sz w:val="21"/>
-          <w:szCs w:val="21"/>
-        </w:rPr>
-        <w:t xml:space="preserve"> the actual contact point shifts around the nose radius, producing profile errors (undercut or oversize). </w:t>
+        <w:t xml:space="preserve">. On straight turning and facing the contact point stays at that programmed point, so there is no error; but on </w:t>
+      </w:r>
+      <w:r>
+        <w:rPr>
+          <w:rFonts w:ascii="Calibri" w:cs="Calibri" w:eastAsia="Calibri" w:hAnsi="Calibri"/>
+          <w:b/>
+          <w:bCs/>
+          <w:i w:val="false"/>
+          <w:iCs w:val="false"/>
+          <w:sz w:val="21"/>
+          <w:szCs w:val="21"/>
+        </w:rPr>
+        <w:t xml:space="preserve">tapers and circular contours the actual contact point shifts around the curved nose</w:t>
+      </w:r>
+      <w:r>
+        <w:rPr>
+          <w:rFonts w:ascii="Calibri" w:cs="Calibri" w:eastAsia="Calibri" w:hAnsi="Calibri"/>
+          <w:b w:val="false"/>
+          <w:bCs w:val="false"/>
+          <w:i w:val="false"/>
+          <w:iCs w:val="false"/>
+          <w:sz w:val="21"/>
+          <w:szCs w:val="21"/>
+        </w:rPr>
+        <w:t xml:space="preserve">, so the part comes out </w:t>
+      </w:r>
+      <w:r>
+        <w:rPr>
+          <w:rFonts w:ascii="Calibri" w:cs="Calibri" w:eastAsia="Calibri" w:hAnsi="Calibri"/>
+          <w:b/>
+          <w:bCs/>
+          <w:i w:val="false"/>
+          <w:iCs w:val="false"/>
+          <w:sz w:val="21"/>
+          <w:szCs w:val="21"/>
+        </w:rPr>
+        <w:t xml:space="preserve">undercut or oversize</w:t>
+      </w:r>
+      <w:r>
+        <w:rPr>
+          <w:rFonts w:ascii="Calibri" w:cs="Calibri" w:eastAsia="Calibri" w:hAnsi="Calibri"/>
+          <w:b w:val="false"/>
+          <w:bCs w:val="false"/>
+          <w:i w:val="false"/>
+          <w:iCs w:val="false"/>
+          <w:sz w:val="21"/>
+          <w:szCs w:val="21"/>
+        </w:rPr>
+        <w:t xml:space="preserve"> by an amount that depends on the slope and the nose radius. </w:t>
       </w:r>
       <w:r>
         <w:rPr>
@@ -2484,13 +2547,37 @@
           <w:sz w:val="21"/>
           <w:szCs w:val="21"/>
         </w:rPr>
-        <w:t xml:space="preserve"> makes the control automatically offset the path by the nose radius, so the programmed profile is cut accurately.</w:t>
+        <w:t xml:space="preserve"> tells the control the nose radius and the tool orientation (the imaginary tool-tip quadrant), and it </w:t>
+      </w:r>
+      <w:r>
+        <w:rPr>
+          <w:rFonts w:ascii="Calibri" w:cs="Calibri" w:eastAsia="Calibri" w:hAnsi="Calibri"/>
+          <w:b/>
+          <w:bCs/>
+          <w:i w:val="false"/>
+          <w:iCs w:val="false"/>
+          <w:sz w:val="21"/>
+          <w:szCs w:val="21"/>
+        </w:rPr>
+        <w:t xml:space="preserve">automatically offsets the tool-centre path</w:t>
+      </w:r>
+      <w:r>
+        <w:rPr>
+          <w:rFonts w:ascii="Calibri" w:cs="Calibri" w:eastAsia="Calibri" w:hAnsi="Calibri"/>
+          <w:b w:val="false"/>
+          <w:bCs w:val="false"/>
+          <w:i w:val="false"/>
+          <w:iCs w:val="false"/>
+          <w:sz w:val="21"/>
+          <w:szCs w:val="21"/>
+        </w:rPr>
+        <w:t xml:space="preserve"> so the programmed profile is reproduced exactly on the finished part. Without it, angled and curved features must be re-calculated by hand.</w:t>
       </w:r>
     </w:p>
     <w:p>
       <w:pPr>
         <w:keepNext/>
-        <w:spacing w:after="24" w:before="120" w:line="276" w:lineRule="auto"/>
+        <w:spacing w:after="26" w:before="130" w:line="278" w:lineRule="auto"/>
       </w:pPr>
       <w:r>
         <w:rPr>
@@ -2520,7 +2607,7 @@
     </w:p>
     <w:p>
       <w:pPr>
-        <w:spacing w:after="70" w:before="0" w:line="276" w:lineRule="auto"/>
+        <w:spacing w:after="80" w:before="0" w:line="278" w:lineRule="auto"/>
         <w:ind w:left="150"/>
       </w:pPr>
       <w:r>
@@ -2582,85 +2669,133 @@
           <w:sz w:val="21"/>
           <w:szCs w:val="21"/>
         </w:rPr>
-        <w:t xml:space="preserve"> circular interpolation. Swapping them makes the cutter travel the arc in the </w:t>
-      </w:r>
-      <w:r>
-        <w:rPr>
-          <w:rFonts w:ascii="Calibri" w:cs="Calibri" w:eastAsia="Calibri" w:hAnsi="Calibri"/>
-          <w:b/>
-          <w:bCs/>
-          <w:i w:val="false"/>
-          <w:iCs w:val="false"/>
-          <w:sz w:val="21"/>
-          <w:szCs w:val="21"/>
-        </w:rPr>
-        <w:t xml:space="preserve">wrong direction</w:t>
-      </w:r>
-      <w:r>
-        <w:rPr>
-          <w:rFonts w:ascii="Calibri" w:cs="Calibri" w:eastAsia="Calibri" w:hAnsi="Calibri"/>
-          <w:b w:val="false"/>
-          <w:bCs w:val="false"/>
-          <w:i w:val="false"/>
-          <w:iCs w:val="false"/>
-          <w:sz w:val="21"/>
-          <w:szCs w:val="21"/>
-        </w:rPr>
-        <w:t xml:space="preserve">, cutting a mirror-image/incorrect arc — it either </w:t>
-      </w:r>
-      <w:r>
-        <w:rPr>
-          <w:rFonts w:ascii="Calibri" w:cs="Calibri" w:eastAsia="Calibri" w:hAnsi="Calibri"/>
-          <w:b/>
-          <w:bCs/>
-          <w:i w:val="false"/>
-          <w:iCs w:val="false"/>
-          <w:sz w:val="21"/>
-          <w:szCs w:val="21"/>
-        </w:rPr>
-        <w:t xml:space="preserve">gouges into the part</w:t>
-      </w:r>
-      <w:r>
-        <w:rPr>
-          <w:rFonts w:ascii="Calibri" w:cs="Calibri" w:eastAsia="Calibri" w:hAnsi="Calibri"/>
-          <w:b w:val="false"/>
-          <w:bCs w:val="false"/>
-          <w:i w:val="false"/>
-          <w:iCs w:val="false"/>
-          <w:sz w:val="21"/>
-          <w:szCs w:val="21"/>
-        </w:rPr>
-        <w:t xml:space="preserve"> or cuts on the wrong side, giving a wrong profile and a possible tool collision. The arc end-point may also become geometrically invalid for that direction, triggering a </w:t>
-      </w:r>
-      <w:r>
-        <w:rPr>
-          <w:rFonts w:ascii="Calibri" w:cs="Calibri" w:eastAsia="Calibri" w:hAnsi="Calibri"/>
-          <w:b/>
-          <w:bCs/>
-          <w:i w:val="false"/>
-          <w:iCs w:val="false"/>
-          <w:sz w:val="21"/>
-          <w:szCs w:val="21"/>
-        </w:rPr>
-        <w:t xml:space="preserve">radius/arc alarm</w:t>
-      </w:r>
-      <w:r>
-        <w:rPr>
-          <w:rFonts w:ascii="Calibri" w:cs="Calibri" w:eastAsia="Calibri" w:hAnsi="Calibri"/>
-          <w:b w:val="false"/>
-          <w:bCs w:val="false"/>
-          <w:i w:val="false"/>
-          <w:iCs w:val="false"/>
-          <w:sz w:val="21"/>
-          <w:szCs w:val="21"/>
-        </w:rPr>
-        <w:t xml:space="preserve">.</w:t>
+        <w:t xml:space="preserve"> circular interpolation. If they are swapped, the control takes the same start point, end point and radius but </w:t>
+      </w:r>
+      <w:r>
+        <w:rPr>
+          <w:rFonts w:ascii="Calibri" w:cs="Calibri" w:eastAsia="Calibri" w:hAnsi="Calibri"/>
+          <w:b/>
+          <w:bCs/>
+          <w:i w:val="false"/>
+          <w:iCs w:val="false"/>
+          <w:sz w:val="21"/>
+          <w:szCs w:val="21"/>
+        </w:rPr>
+        <w:t xml:space="preserve">sweeps the arc in the opposite direction</w:t>
+      </w:r>
+      <w:r>
+        <w:rPr>
+          <w:rFonts w:ascii="Calibri" w:cs="Calibri" w:eastAsia="Calibri" w:hAnsi="Calibri"/>
+          <w:b w:val="false"/>
+          <w:bCs w:val="false"/>
+          <w:i w:val="false"/>
+          <w:iCs w:val="false"/>
+          <w:sz w:val="21"/>
+          <w:szCs w:val="21"/>
+        </w:rPr>
+        <w:t xml:space="preserve">, producing a </w:t>
+      </w:r>
+      <w:r>
+        <w:rPr>
+          <w:rFonts w:ascii="Calibri" w:cs="Calibri" w:eastAsia="Calibri" w:hAnsi="Calibri"/>
+          <w:b/>
+          <w:bCs/>
+          <w:i w:val="false"/>
+          <w:iCs w:val="false"/>
+          <w:sz w:val="21"/>
+          <w:szCs w:val="21"/>
+        </w:rPr>
+        <w:t xml:space="preserve">mirror-image / incorrect arc</w:t>
+      </w:r>
+      <w:r>
+        <w:rPr>
+          <w:rFonts w:ascii="Calibri" w:cs="Calibri" w:eastAsia="Calibri" w:hAnsi="Calibri"/>
+          <w:b w:val="false"/>
+          <w:bCs w:val="false"/>
+          <w:i w:val="false"/>
+          <w:iCs w:val="false"/>
+          <w:sz w:val="21"/>
+          <w:szCs w:val="21"/>
+        </w:rPr>
+        <w:t xml:space="preserve">. The cutter then either </w:t>
+      </w:r>
+      <w:r>
+        <w:rPr>
+          <w:rFonts w:ascii="Calibri" w:cs="Calibri" w:eastAsia="Calibri" w:hAnsi="Calibri"/>
+          <w:b/>
+          <w:bCs/>
+          <w:i w:val="false"/>
+          <w:iCs w:val="false"/>
+          <w:sz w:val="21"/>
+          <w:szCs w:val="21"/>
+        </w:rPr>
+        <w:t xml:space="preserve">gouges into the finished part</w:t>
+      </w:r>
+      <w:r>
+        <w:rPr>
+          <w:rFonts w:ascii="Calibri" w:cs="Calibri" w:eastAsia="Calibri" w:hAnsi="Calibri"/>
+          <w:b w:val="false"/>
+          <w:bCs w:val="false"/>
+          <w:i w:val="false"/>
+          <w:iCs w:val="false"/>
+          <w:sz w:val="21"/>
+          <w:szCs w:val="21"/>
+        </w:rPr>
+        <w:t xml:space="preserve"> or cuts air on the wrong side of the profile, leaving material behind and ruining the geometry, and it can cause a </w:t>
+      </w:r>
+      <w:r>
+        <w:rPr>
+          <w:rFonts w:ascii="Calibri" w:cs="Calibri" w:eastAsia="Calibri" w:hAnsi="Calibri"/>
+          <w:b/>
+          <w:bCs/>
+          <w:i w:val="false"/>
+          <w:iCs w:val="false"/>
+          <w:sz w:val="21"/>
+          <w:szCs w:val="21"/>
+        </w:rPr>
+        <w:t xml:space="preserve">tool or fixture collision</w:t>
+      </w:r>
+      <w:r>
+        <w:rPr>
+          <w:rFonts w:ascii="Calibri" w:cs="Calibri" w:eastAsia="Calibri" w:hAnsi="Calibri"/>
+          <w:b w:val="false"/>
+          <w:bCs w:val="false"/>
+          <w:i w:val="false"/>
+          <w:iCs w:val="false"/>
+          <w:sz w:val="21"/>
+          <w:szCs w:val="21"/>
+        </w:rPr>
+        <w:t xml:space="preserve">. If the arc is defined by I/J (centre) or R and the wrong direction makes the geometry impossible, the control will throw a </w:t>
+      </w:r>
+      <w:r>
+        <w:rPr>
+          <w:rFonts w:ascii="Calibri" w:cs="Calibri" w:eastAsia="Calibri" w:hAnsi="Calibri"/>
+          <w:b/>
+          <w:bCs/>
+          <w:i w:val="false"/>
+          <w:iCs w:val="false"/>
+          <w:sz w:val="21"/>
+          <w:szCs w:val="21"/>
+        </w:rPr>
+        <w:t xml:space="preserve">radius/end-point alarm</w:t>
+      </w:r>
+      <w:r>
+        <w:rPr>
+          <w:rFonts w:ascii="Calibri" w:cs="Calibri" w:eastAsia="Calibri" w:hAnsi="Calibri"/>
+          <w:b w:val="false"/>
+          <w:bCs w:val="false"/>
+          <w:i w:val="false"/>
+          <w:iCs w:val="false"/>
+          <w:sz w:val="21"/>
+          <w:szCs w:val="21"/>
+        </w:rPr>
+        <w:t xml:space="preserve"> and stop.</w:t>
       </w:r>
     </w:p>
     <w:p>
       <w:pPr>
         <w:keepNext/>
-        <w:spacing w:after="24" w:before="120" w:line="276" w:lineRule="auto"/>
+        <w:spacing w:after="26" w:before="130" w:line="278" w:lineRule="auto"/>
       </w:pPr>
       <w:r>
         <w:rPr>
@@ -2690,7 +2825,7 @@
     </w:p>
     <w:p>
       <w:pPr>
-        <w:spacing w:after="70" w:before="0" w:line="276" w:lineRule="auto"/>
+        <w:spacing w:after="80" w:before="0" w:line="278" w:lineRule="auto"/>
         <w:ind w:left="150"/>
       </w:pPr>
       <w:r>
@@ -2716,97 +2851,121 @@
           <w:sz w:val="21"/>
           <w:szCs w:val="21"/>
         </w:rPr>
-        <w:t xml:space="preserve">G90 (absolute)</w:t>
-      </w:r>
-      <w:r>
-        <w:rPr>
-          <w:rFonts w:ascii="Calibri" w:cs="Calibri" w:eastAsia="Calibri" w:hAnsi="Calibri"/>
-          <w:b w:val="false"/>
-          <w:bCs w:val="false"/>
-          <w:i w:val="false"/>
-          <w:iCs w:val="false"/>
-          <w:sz w:val="21"/>
-          <w:szCs w:val="21"/>
-        </w:rPr>
-        <w:t xml:space="preserve"> references every coordinate from a </w:t>
-      </w:r>
-      <w:r>
-        <w:rPr>
-          <w:rFonts w:ascii="Calibri" w:cs="Calibri" w:eastAsia="Calibri" w:hAnsi="Calibri"/>
-          <w:b/>
-          <w:bCs/>
-          <w:i w:val="false"/>
-          <w:iCs w:val="false"/>
-          <w:sz w:val="21"/>
-          <w:szCs w:val="21"/>
-        </w:rPr>
-        <w:t xml:space="preserve">fixed work origin (part zero)</w:t>
-      </w:r>
-      <w:r>
-        <w:rPr>
-          <w:rFonts w:ascii="Calibri" w:cs="Calibri" w:eastAsia="Calibri" w:hAnsi="Calibri"/>
-          <w:b w:val="false"/>
-          <w:bCs w:val="false"/>
-          <w:i w:val="false"/>
-          <w:iCs w:val="false"/>
-          <w:sz w:val="21"/>
-          <w:szCs w:val="21"/>
-        </w:rPr>
-        <w:t xml:space="preserve"> — each value is the actual position to reach. </w:t>
-      </w:r>
-      <w:r>
-        <w:rPr>
-          <w:rFonts w:ascii="Calibri" w:cs="Calibri" w:eastAsia="Calibri" w:hAnsi="Calibri"/>
-          <w:b/>
-          <w:bCs/>
-          <w:i w:val="false"/>
-          <w:iCs w:val="false"/>
-          <w:sz w:val="21"/>
-          <w:szCs w:val="21"/>
-        </w:rPr>
-        <w:t xml:space="preserve">G91 (incremental)</w:t>
-      </w:r>
-      <w:r>
-        <w:rPr>
-          <w:rFonts w:ascii="Calibri" w:cs="Calibri" w:eastAsia="Calibri" w:hAnsi="Calibri"/>
-          <w:b w:val="false"/>
-          <w:bCs w:val="false"/>
-          <w:i w:val="false"/>
-          <w:iCs w:val="false"/>
-          <w:sz w:val="21"/>
-          <w:szCs w:val="21"/>
-        </w:rPr>
-        <w:t xml:space="preserve"> references each coordinate from the </w:t>
-      </w:r>
-      <w:r>
-        <w:rPr>
-          <w:rFonts w:ascii="Calibri" w:cs="Calibri" w:eastAsia="Calibri" w:hAnsi="Calibri"/>
-          <w:b/>
-          <w:bCs/>
-          <w:i w:val="false"/>
-          <w:iCs w:val="false"/>
-          <w:sz w:val="21"/>
-          <w:szCs w:val="21"/>
-        </w:rPr>
-        <w:t xml:space="preserve">tool’s current position</w:t>
-      </w:r>
-      <w:r>
-        <w:rPr>
-          <w:rFonts w:ascii="Calibri" w:cs="Calibri" w:eastAsia="Calibri" w:hAnsi="Calibri"/>
-          <w:b w:val="false"/>
-          <w:bCs w:val="false"/>
-          <w:i w:val="false"/>
-          <w:iCs w:val="false"/>
-          <w:sz w:val="21"/>
-          <w:szCs w:val="21"/>
-        </w:rPr>
-        <w:t xml:space="preserve"> — each value is the distance and direction to move next. G90 is easy to check against the drawing; G91 is convenient for repeated or patterned moves.</w:t>
+        <w:t xml:space="preserve">G90 (absolute mode)</w:t>
+      </w:r>
+      <w:r>
+        <w:rPr>
+          <w:rFonts w:ascii="Calibri" w:cs="Calibri" w:eastAsia="Calibri" w:hAnsi="Calibri"/>
+          <w:b w:val="false"/>
+          <w:bCs w:val="false"/>
+          <w:i w:val="false"/>
+          <w:iCs w:val="false"/>
+          <w:sz w:val="21"/>
+          <w:szCs w:val="21"/>
+        </w:rPr>
+        <w:t xml:space="preserve"> references </w:t>
+      </w:r>
+      <w:r>
+        <w:rPr>
+          <w:rFonts w:ascii="Calibri" w:cs="Calibri" w:eastAsia="Calibri" w:hAnsi="Calibri"/>
+          <w:b/>
+          <w:bCs/>
+          <w:i w:val="false"/>
+          <w:iCs w:val="false"/>
+          <w:sz w:val="21"/>
+          <w:szCs w:val="21"/>
+        </w:rPr>
+        <w:t xml:space="preserve">every coordinate from one fixed work origin (part zero)</w:t>
+      </w:r>
+      <w:r>
+        <w:rPr>
+          <w:rFonts w:ascii="Calibri" w:cs="Calibri" w:eastAsia="Calibri" w:hAnsi="Calibri"/>
+          <w:b w:val="false"/>
+          <w:bCs w:val="false"/>
+          <w:i w:val="false"/>
+          <w:iCs w:val="false"/>
+          <w:sz w:val="21"/>
+          <w:szCs w:val="21"/>
+        </w:rPr>
+        <w:t xml:space="preserve"> — each value written is the actual position the tool must reach. </w:t>
+      </w:r>
+      <w:r>
+        <w:rPr>
+          <w:rFonts w:ascii="Calibri" w:cs="Calibri" w:eastAsia="Calibri" w:hAnsi="Calibri"/>
+          <w:b/>
+          <w:bCs/>
+          <w:i w:val="false"/>
+          <w:iCs w:val="false"/>
+          <w:sz w:val="21"/>
+          <w:szCs w:val="21"/>
+        </w:rPr>
+        <w:t xml:space="preserve">G91 (incremental mode)</w:t>
+      </w:r>
+      <w:r>
+        <w:rPr>
+          <w:rFonts w:ascii="Calibri" w:cs="Calibri" w:eastAsia="Calibri" w:hAnsi="Calibri"/>
+          <w:b w:val="false"/>
+          <w:bCs w:val="false"/>
+          <w:i w:val="false"/>
+          <w:iCs w:val="false"/>
+          <w:sz w:val="21"/>
+          <w:szCs w:val="21"/>
+        </w:rPr>
+        <w:t xml:space="preserve"> references </w:t>
+      </w:r>
+      <w:r>
+        <w:rPr>
+          <w:rFonts w:ascii="Calibri" w:cs="Calibri" w:eastAsia="Calibri" w:hAnsi="Calibri"/>
+          <w:b/>
+          <w:bCs/>
+          <w:i w:val="false"/>
+          <w:iCs w:val="false"/>
+          <w:sz w:val="21"/>
+          <w:szCs w:val="21"/>
+        </w:rPr>
+        <w:t xml:space="preserve">each coordinate from the tool’s current position</w:t>
+      </w:r>
+      <w:r>
+        <w:rPr>
+          <w:rFonts w:ascii="Calibri" w:cs="Calibri" w:eastAsia="Calibri" w:hAnsi="Calibri"/>
+          <w:b w:val="false"/>
+          <w:bCs w:val="false"/>
+          <w:i w:val="false"/>
+          <w:iCs w:val="false"/>
+          <w:sz w:val="21"/>
+          <w:szCs w:val="21"/>
+        </w:rPr>
+        <w:t xml:space="preserve"> — each value is the distance and direction to move for that step. Absolute programming is easier to check against the drawing and recovers safely after an interruption, so it is used for most programs; incremental programming is convenient for </w:t>
+      </w:r>
+      <w:r>
+        <w:rPr>
+          <w:rFonts w:ascii="Calibri" w:cs="Calibri" w:eastAsia="Calibri" w:hAnsi="Calibri"/>
+          <w:b/>
+          <w:bCs/>
+          <w:i w:val="false"/>
+          <w:iCs w:val="false"/>
+          <w:sz w:val="21"/>
+          <w:szCs w:val="21"/>
+        </w:rPr>
+        <w:t xml:space="preserve">repeated or patterned features</w:t>
+      </w:r>
+      <w:r>
+        <w:rPr>
+          <w:rFonts w:ascii="Calibri" w:cs="Calibri" w:eastAsia="Calibri" w:hAnsi="Calibri"/>
+          <w:b w:val="false"/>
+          <w:bCs w:val="false"/>
+          <w:i w:val="false"/>
+          <w:iCs w:val="false"/>
+          <w:sz w:val="21"/>
+          <w:szCs w:val="21"/>
+        </w:rPr>
+        <w:t xml:space="preserve"> (for example drilling an equally spaced row of holes) where the same relative move is repeated.</w:t>
       </w:r>
     </w:p>
     <w:p>
       <w:pPr>
         <w:keepNext/>
-        <w:spacing w:after="24" w:before="120" w:line="276" w:lineRule="auto"/>
+        <w:spacing w:after="26" w:before="130" w:line="278" w:lineRule="auto"/>
       </w:pPr>
       <w:r>
         <w:rPr>
@@ -2836,7 +2995,7 @@
     </w:p>
     <w:p>
       <w:pPr>
-        <w:spacing w:after="70" w:before="0" w:line="276" w:lineRule="auto"/>
+        <w:spacing w:after="80" w:before="0" w:line="278" w:lineRule="auto"/>
         <w:ind w:left="150"/>
       </w:pPr>
       <w:r>
@@ -2874,19 +3033,19 @@
           <w:sz w:val="21"/>
           <w:szCs w:val="21"/>
         </w:rPr>
-        <w:t xml:space="preserve">reference unit of the feed rate</w:t>
-      </w:r>
-      <w:r>
-        <w:rPr>
-          <w:rFonts w:ascii="Calibri" w:cs="Calibri" w:eastAsia="Calibri" w:hAnsi="Calibri"/>
-          <w:b w:val="false"/>
-          <w:bCs w:val="false"/>
-          <w:i w:val="false"/>
-          <w:iCs w:val="false"/>
-          <w:sz w:val="21"/>
-          <w:szCs w:val="21"/>
-        </w:rPr>
-        <w:t xml:space="preserve"> — whether feed is tied to </w:t>
+        <w:t xml:space="preserve">reference unit chosen for the feed rate</w:t>
+      </w:r>
+      <w:r>
+        <w:rPr>
+          <w:rFonts w:ascii="Calibri" w:cs="Calibri" w:eastAsia="Calibri" w:hAnsi="Calibri"/>
+          <w:b w:val="false"/>
+          <w:bCs w:val="false"/>
+          <w:i w:val="false"/>
+          <w:iCs w:val="false"/>
+          <w:sz w:val="21"/>
+          <w:szCs w:val="21"/>
+        </w:rPr>
+        <w:t xml:space="preserve"> — whether the feed is tied to </w:t>
       </w:r>
       <w:r>
         <w:rPr>
@@ -2958,7 +3117,31 @@
           <w:sz w:val="21"/>
           <w:szCs w:val="21"/>
         </w:rPr>
-        <w:t xml:space="preserve">, used mainly in milling. </w:t>
+        <w:t xml:space="preserve">, where the axis advances a set distance each minute regardless of spindle speed; this is normal for </w:t>
+      </w:r>
+      <w:r>
+        <w:rPr>
+          <w:rFonts w:ascii="Calibri" w:cs="Calibri" w:eastAsia="Calibri" w:hAnsi="Calibri"/>
+          <w:b/>
+          <w:bCs/>
+          <w:i w:val="false"/>
+          <w:iCs w:val="false"/>
+          <w:sz w:val="21"/>
+          <w:szCs w:val="21"/>
+        </w:rPr>
+        <w:t xml:space="preserve">milling</w:t>
+      </w:r>
+      <w:r>
+        <w:rPr>
+          <w:rFonts w:ascii="Calibri" w:cs="Calibri" w:eastAsia="Calibri" w:hAnsi="Calibri"/>
+          <w:b w:val="false"/>
+          <w:bCs w:val="false"/>
+          <w:i w:val="false"/>
+          <w:iCs w:val="false"/>
+          <w:sz w:val="21"/>
+          <w:szCs w:val="21"/>
+        </w:rPr>
+        <w:t xml:space="preserve">. </w:t>
       </w:r>
       <w:r>
         <w:rPr>
@@ -2982,7 +3165,60 @@
           <w:sz w:val="21"/>
           <w:szCs w:val="21"/>
         </w:rPr>
-        <w:t xml:space="preserve">, used mainly in turning, where the feed is linked to each revolution of the spindle.</w:t>
+        <w:t xml:space="preserve">, where the axis advances a set distance for every revolution of the spindle; this is normal for </w:t>
+      </w:r>
+      <w:r>
+        <w:rPr>
+          <w:rFonts w:ascii="Calibri" w:cs="Calibri" w:eastAsia="Calibri" w:hAnsi="Calibri"/>
+          <w:b/>
+          <w:bCs/>
+          <w:i w:val="false"/>
+          <w:iCs w:val="false"/>
+          <w:sz w:val="21"/>
+          <w:szCs w:val="21"/>
+        </w:rPr>
+        <w:t xml:space="preserve">turning</w:t>
+      </w:r>
+      <w:r>
+        <w:rPr>
+          <w:rFonts w:ascii="Calibri" w:cs="Calibri" w:eastAsia="Calibri" w:hAnsi="Calibri"/>
+          <w:b w:val="false"/>
+          <w:bCs w:val="false"/>
+          <w:i w:val="false"/>
+          <w:iCs w:val="false"/>
+          <w:sz w:val="21"/>
+          <w:szCs w:val="21"/>
+        </w:rPr>
+        <w:t xml:space="preserve">, because tying the feed to each revolution keeps the </w:t>
+      </w:r>
+      <w:r>
+        <w:rPr>
+          <w:rFonts w:ascii="Calibri" w:cs="Calibri" w:eastAsia="Calibri" w:hAnsi="Calibri"/>
+          <w:b/>
+          <w:bCs/>
+          <w:i w:val="false"/>
+          <w:iCs w:val="false"/>
+          <w:sz w:val="21"/>
+          <w:szCs w:val="21"/>
+        </w:rPr>
+        <w:t xml:space="preserve">chip load and surface finish consistent</w:t>
+      </w:r>
+      <w:r>
+        <w:rPr>
+          <w:rFonts w:ascii="Calibri" w:cs="Calibri" w:eastAsia="Calibri" w:hAnsi="Calibri"/>
+          <w:b w:val="false"/>
+          <w:bCs w:val="false"/>
+          <w:i w:val="false"/>
+          <w:iCs w:val="false"/>
+          <w:sz w:val="21"/>
+          <w:szCs w:val="21"/>
+        </w:rPr>
+        <w:t xml:space="preserve"> as the cutting diameter (and hence spindle speed under constant surface speed) changes.</w:t>
+      </w:r>
+    </w:p>
+    <w:p>
+      <w:r>
+        <w:br w:type="page"/>
       </w:r>
     </w:p>
     <w:p>
@@ -3203,7 +3439,7 @@
     <w:p>
       <w:pPr>
         <w:keepNext/>
-        <w:spacing w:after="24" w:before="120" w:line="276" w:lineRule="auto"/>
+        <w:spacing w:after="26" w:before="130" w:line="278" w:lineRule="auto"/>
       </w:pPr>
       <w:r>
         <w:rPr>
@@ -3233,7 +3469,7 @@
     </w:p>
     <w:p>
       <w:pPr>
-        <w:spacing w:after="70" w:before="0" w:line="276" w:lineRule="auto"/>
+        <w:spacing w:after="80" w:before="0" w:line="278" w:lineRule="auto"/>
         <w:ind w:left="150"/>
       </w:pPr>
       <w:r>
@@ -3283,73 +3519,121 @@
           <w:sz w:val="21"/>
           <w:szCs w:val="21"/>
         </w:rPr>
-        <w:t xml:space="preserve">bridge between CAD (design) and CAM (manufacturing)</w:t>
-      </w:r>
-      <w:r>
-        <w:rPr>
-          <w:rFonts w:ascii="Calibri" w:cs="Calibri" w:eastAsia="Calibri" w:hAnsi="Calibri"/>
-          <w:b w:val="false"/>
-          <w:bCs w:val="false"/>
-          <w:i w:val="false"/>
-          <w:iCs w:val="false"/>
-          <w:sz w:val="21"/>
-          <w:szCs w:val="21"/>
-        </w:rPr>
-        <w:t xml:space="preserve">. Isolated "islands of automation" — standalone CAD, CNC, inspection, etc. — cannot share data. CAPP automatically converts design data into </w:t>
-      </w:r>
-      <w:r>
-        <w:rPr>
-          <w:rFonts w:ascii="Calibri" w:cs="Calibri" w:eastAsia="Calibri" w:hAnsi="Calibri"/>
-          <w:b/>
-          <w:bCs/>
-          <w:i w:val="false"/>
-          <w:iCs w:val="false"/>
-          <w:sz w:val="21"/>
-          <w:szCs w:val="21"/>
-        </w:rPr>
-        <w:t xml:space="preserve">standardised, consistent process plans and routing sheets</w:t>
-      </w:r>
-      <w:r>
-        <w:rPr>
-          <w:rFonts w:ascii="Calibri" w:cs="Calibri" w:eastAsia="Calibri" w:hAnsi="Calibri"/>
-          <w:b w:val="false"/>
-          <w:bCs w:val="false"/>
-          <w:i w:val="false"/>
-          <w:iCs w:val="false"/>
-          <w:sz w:val="21"/>
-          <w:szCs w:val="21"/>
-        </w:rPr>
-        <w:t xml:space="preserve"> and feeds them to scheduling, CNC and material handling. Without it there is a manual, inconsistent gap between design and the shop floor, so CAPP is essential to </w:t>
-      </w:r>
-      <w:r>
-        <w:rPr>
-          <w:rFonts w:ascii="Calibri" w:cs="Calibri" w:eastAsia="Calibri" w:hAnsi="Calibri"/>
-          <w:b/>
-          <w:bCs/>
-          <w:i w:val="false"/>
-          <w:iCs w:val="false"/>
-          <w:sz w:val="21"/>
-          <w:szCs w:val="21"/>
-        </w:rPr>
-        <w:t xml:space="preserve">tie everything together into a full CIM system</w:t>
-      </w:r>
-      <w:r>
-        <w:rPr>
-          <w:rFonts w:ascii="Calibri" w:cs="Calibri" w:eastAsia="Calibri" w:hAnsi="Calibri"/>
-          <w:b w:val="false"/>
-          <w:bCs w:val="false"/>
-          <w:i w:val="false"/>
-          <w:iCs w:val="false"/>
-          <w:sz w:val="21"/>
-          <w:szCs w:val="21"/>
-        </w:rPr>
-        <w:t xml:space="preserve">.</w:t>
+        <w:t xml:space="preserve">bridge that connects CAD (design) to CAM (manufacturing)</w:t>
+      </w:r>
+      <w:r>
+        <w:rPr>
+          <w:rFonts w:ascii="Calibri" w:cs="Calibri" w:eastAsia="Calibri" w:hAnsi="Calibri"/>
+          <w:b w:val="false"/>
+          <w:bCs w:val="false"/>
+          <w:i w:val="false"/>
+          <w:iCs w:val="false"/>
+          <w:sz w:val="21"/>
+          <w:szCs w:val="21"/>
+        </w:rPr>
+        <w:t xml:space="preserve">. In a shop with only isolated "islands of automation" — standalone CAD, standalone CNC, standalone inspection — each system holds its own data and </w:t>
+      </w:r>
+      <w:r>
+        <w:rPr>
+          <w:rFonts w:ascii="Calibri" w:cs="Calibri" w:eastAsia="Calibri" w:hAnsi="Calibri"/>
+          <w:b/>
+          <w:bCs/>
+          <w:i w:val="false"/>
+          <w:iCs w:val="false"/>
+          <w:sz w:val="21"/>
+          <w:szCs w:val="21"/>
+        </w:rPr>
+        <w:t xml:space="preserve">cannot pass information automatically to the next</w:t>
+      </w:r>
+      <w:r>
+        <w:rPr>
+          <w:rFonts w:ascii="Calibri" w:cs="Calibri" w:eastAsia="Calibri" w:hAnsi="Calibri"/>
+          <w:b w:val="false"/>
+          <w:bCs w:val="false"/>
+          <w:i w:val="false"/>
+          <w:iCs w:val="false"/>
+          <w:sz w:val="21"/>
+          <w:szCs w:val="21"/>
+        </w:rPr>
+        <w:t xml:space="preserve">, so an engineer must manually translate the design into a process plan, which is slow and inconsistent. CAPP </w:t>
+      </w:r>
+      <w:r>
+        <w:rPr>
+          <w:rFonts w:ascii="Calibri" w:cs="Calibri" w:eastAsia="Calibri" w:hAnsi="Calibri"/>
+          <w:b/>
+          <w:bCs/>
+          <w:i w:val="false"/>
+          <w:iCs w:val="false"/>
+          <w:sz w:val="21"/>
+          <w:szCs w:val="21"/>
+        </w:rPr>
+        <w:t xml:space="preserve">automatically converts the design data into standardised, repeatable process plans and routing sheets</w:t>
+      </w:r>
+      <w:r>
+        <w:rPr>
+          <w:rFonts w:ascii="Calibri" w:cs="Calibri" w:eastAsia="Calibri" w:hAnsi="Calibri"/>
+          <w:b w:val="false"/>
+          <w:bCs w:val="false"/>
+          <w:i w:val="false"/>
+          <w:iCs w:val="false"/>
+          <w:sz w:val="21"/>
+          <w:szCs w:val="21"/>
+        </w:rPr>
+        <w:t xml:space="preserve"> and feeds that consistent data forward to scheduling, MRP, the CNC machines and material handling. It therefore removes the manual gap, forms the </w:t>
+      </w:r>
+      <w:r>
+        <w:rPr>
+          <w:rFonts w:ascii="Calibri" w:cs="Calibri" w:eastAsia="Calibri" w:hAnsi="Calibri"/>
+          <w:b/>
+          <w:bCs/>
+          <w:i w:val="false"/>
+          <w:iCs w:val="false"/>
+          <w:sz w:val="21"/>
+          <w:szCs w:val="21"/>
+        </w:rPr>
+        <w:t xml:space="preserve">digital thread</w:t>
+      </w:r>
+      <w:r>
+        <w:rPr>
+          <w:rFonts w:ascii="Calibri" w:cs="Calibri" w:eastAsia="Calibri" w:hAnsi="Calibri"/>
+          <w:b w:val="false"/>
+          <w:bCs w:val="false"/>
+          <w:i w:val="false"/>
+          <w:iCs w:val="false"/>
+          <w:sz w:val="21"/>
+          <w:szCs w:val="21"/>
+        </w:rPr>
+        <w:t xml:space="preserve"> through the factory, and is essential to knit the separate islands into a true </w:t>
+      </w:r>
+      <w:r>
+        <w:rPr>
+          <w:rFonts w:ascii="Calibri" w:cs="Calibri" w:eastAsia="Calibri" w:hAnsi="Calibri"/>
+          <w:b/>
+          <w:bCs/>
+          <w:i w:val="false"/>
+          <w:iCs w:val="false"/>
+          <w:sz w:val="21"/>
+          <w:szCs w:val="21"/>
+        </w:rPr>
+        <w:t xml:space="preserve">computer-integrated manufacturing (CIM)</w:t>
+      </w:r>
+      <w:r>
+        <w:rPr>
+          <w:rFonts w:ascii="Calibri" w:cs="Calibri" w:eastAsia="Calibri" w:hAnsi="Calibri"/>
+          <w:b w:val="false"/>
+          <w:bCs w:val="false"/>
+          <w:i w:val="false"/>
+          <w:iCs w:val="false"/>
+          <w:sz w:val="21"/>
+          <w:szCs w:val="21"/>
+        </w:rPr>
+        <w:t xml:space="preserve"> system.</w:t>
       </w:r>
     </w:p>
     <w:p>
       <w:pPr>
         <w:keepNext/>
-        <w:spacing w:after="24" w:before="120" w:line="276" w:lineRule="auto"/>
+        <w:spacing w:after="26" w:before="130" w:line="278" w:lineRule="auto"/>
       </w:pPr>
       <w:r>
         <w:rPr>
@@ -3379,7 +3663,7 @@
     </w:p>
     <w:p>
       <w:pPr>
-        <w:spacing w:after="70" w:before="0" w:line="276" w:lineRule="auto"/>
+        <w:spacing w:after="80" w:before="0" w:line="278" w:lineRule="auto"/>
         <w:ind w:left="150"/>
       </w:pPr>
       <w:r>
@@ -3417,55 +3701,79 @@
           <w:sz w:val="21"/>
           <w:szCs w:val="21"/>
         </w:rPr>
-        <w:t xml:space="preserve"> suits </w:t>
-      </w:r>
-      <w:r>
-        <w:rPr>
-          <w:rFonts w:ascii="Calibri" w:cs="Calibri" w:eastAsia="Calibri" w:hAnsi="Calibri"/>
-          <w:b/>
-          <w:bCs/>
-          <w:i w:val="false"/>
-          <w:iCs w:val="false"/>
-          <w:sz w:val="21"/>
-          <w:szCs w:val="21"/>
-        </w:rPr>
-        <w:t xml:space="preserve">high volume with low variety</w:t>
-      </w:r>
-      <w:r>
-        <w:rPr>
-          <w:rFonts w:ascii="Calibri" w:cs="Calibri" w:eastAsia="Calibri" w:hAnsi="Calibri"/>
-          <w:b w:val="false"/>
-          <w:bCs w:val="false"/>
-          <w:i w:val="false"/>
-          <w:iCs w:val="false"/>
-          <w:sz w:val="21"/>
-          <w:szCs w:val="21"/>
-        </w:rPr>
-        <w:t xml:space="preserve">, where parts fall into established </w:t>
-      </w:r>
-      <w:r>
-        <w:rPr>
-          <w:rFonts w:ascii="Calibri" w:cs="Calibri" w:eastAsia="Calibri" w:hAnsi="Calibri"/>
-          <w:b/>
-          <w:bCs/>
-          <w:i w:val="false"/>
-          <w:iCs w:val="false"/>
-          <w:sz w:val="21"/>
-          <w:szCs w:val="21"/>
-        </w:rPr>
-        <w:t xml:space="preserve">part families</w:t>
-      </w:r>
-      <w:r>
-        <w:rPr>
-          <w:rFonts w:ascii="Calibri" w:cs="Calibri" w:eastAsia="Calibri" w:hAnsi="Calibri"/>
-          <w:b w:val="false"/>
-          <w:bCs w:val="false"/>
-          <w:i w:val="false"/>
-          <w:iCs w:val="false"/>
-          <w:sz w:val="21"/>
-          <w:szCs w:val="21"/>
-        </w:rPr>
-        <w:t xml:space="preserve"> that already have master process plans — the existing plan is simply retrieved and lightly edited, which is fast and low-cost. </w:t>
+        <w:t xml:space="preserve"> is chosen for </w:t>
+      </w:r>
+      <w:r>
+        <w:rPr>
+          <w:rFonts w:ascii="Calibri" w:cs="Calibri" w:eastAsia="Calibri" w:hAnsi="Calibri"/>
+          <w:b/>
+          <w:bCs/>
+          <w:i w:val="false"/>
+          <w:iCs w:val="false"/>
+          <w:sz w:val="21"/>
+          <w:szCs w:val="21"/>
+        </w:rPr>
+        <w:t xml:space="preserve">high production volume with low part variety</w:t>
+      </w:r>
+      <w:r>
+        <w:rPr>
+          <w:rFonts w:ascii="Calibri" w:cs="Calibri" w:eastAsia="Calibri" w:hAnsi="Calibri"/>
+          <w:b w:val="false"/>
+          <w:bCs w:val="false"/>
+          <w:i w:val="false"/>
+          <w:iCs w:val="false"/>
+          <w:sz w:val="21"/>
+          <w:szCs w:val="21"/>
+        </w:rPr>
+        <w:t xml:space="preserve">, where most new parts are </w:t>
+      </w:r>
+      <w:r>
+        <w:rPr>
+          <w:rFonts w:ascii="Calibri" w:cs="Calibri" w:eastAsia="Calibri" w:hAnsi="Calibri"/>
+          <w:b/>
+          <w:bCs/>
+          <w:i w:val="false"/>
+          <w:iCs w:val="false"/>
+          <w:sz w:val="21"/>
+          <w:szCs w:val="21"/>
+        </w:rPr>
+        <w:t xml:space="preserve">similar to existing ones and fall into established part families</w:t>
+      </w:r>
+      <w:r>
+        <w:rPr>
+          <w:rFonts w:ascii="Calibri" w:cs="Calibri" w:eastAsia="Calibri" w:hAnsi="Calibri"/>
+          <w:b w:val="false"/>
+          <w:bCs w:val="false"/>
+          <w:i w:val="false"/>
+          <w:iCs w:val="false"/>
+          <w:sz w:val="21"/>
+          <w:szCs w:val="21"/>
+        </w:rPr>
+        <w:t xml:space="preserve"> (coded, for example, with an Opitz system). The system simply </w:t>
+      </w:r>
+      <w:r>
+        <w:rPr>
+          <w:rFonts w:ascii="Calibri" w:cs="Calibri" w:eastAsia="Calibri" w:hAnsi="Calibri"/>
+          <w:b/>
+          <w:bCs/>
+          <w:i w:val="false"/>
+          <w:iCs w:val="false"/>
+          <w:sz w:val="21"/>
+          <w:szCs w:val="21"/>
+        </w:rPr>
+        <w:t xml:space="preserve">retrieves the family’s master process plan and lightly edits it</w:t>
+      </w:r>
+      <w:r>
+        <w:rPr>
+          <w:rFonts w:ascii="Calibri" w:cs="Calibri" w:eastAsia="Calibri" w:hAnsi="Calibri"/>
+          <w:b w:val="false"/>
+          <w:bCs w:val="false"/>
+          <w:i w:val="false"/>
+          <w:iCs w:val="false"/>
+          <w:sz w:val="21"/>
+          <w:szCs w:val="21"/>
+        </w:rPr>
+        <w:t xml:space="preserve">, which is fast, cheap and reliable, and it works well in a stable product line. </w:t>
       </w:r>
       <w:r>
         <w:rPr>
@@ -3489,7 +3797,7 @@
           <w:sz w:val="21"/>
           <w:szCs w:val="21"/>
         </w:rPr>
-        <w:t xml:space="preserve"> suits </w:t>
+        <w:t xml:space="preserve">, by contrast, suits </w:t>
       </w:r>
       <w:r>
         <w:rPr>
@@ -3513,31 +3821,84 @@
           <w:sz w:val="21"/>
           <w:szCs w:val="21"/>
         </w:rPr>
-        <w:t xml:space="preserve"> or new, unique parts where no master plan exists and a plan must be built from scratch. So a company making </w:t>
-      </w:r>
-      <w:r>
-        <w:rPr>
-          <w:rFonts w:ascii="Calibri" w:cs="Calibri" w:eastAsia="Calibri" w:hAnsi="Calibri"/>
-          <w:b/>
-          <w:bCs/>
-          <w:i w:val="false"/>
-          <w:iCs w:val="false"/>
-          <w:sz w:val="21"/>
-          <w:szCs w:val="21"/>
-        </w:rPr>
-        <w:t xml:space="preserve">many similar parts with stable designs</w:t>
-      </w:r>
-      <w:r>
-        <w:rPr>
-          <w:rFonts w:ascii="Calibri" w:cs="Calibri" w:eastAsia="Calibri" w:hAnsi="Calibri"/>
-          <w:b w:val="false"/>
-          <w:bCs w:val="false"/>
-          <w:i w:val="false"/>
-          <w:iCs w:val="false"/>
-          <w:sz w:val="21"/>
-          <w:szCs w:val="21"/>
-        </w:rPr>
-        <w:t xml:space="preserve"> chooses the Variant system.</w:t>
+        <w:t xml:space="preserve"> or genuinely </w:t>
+      </w:r>
+      <w:r>
+        <w:rPr>
+          <w:rFonts w:ascii="Calibri" w:cs="Calibri" w:eastAsia="Calibri" w:hAnsi="Calibri"/>
+          <w:b/>
+          <w:bCs/>
+          <w:i w:val="false"/>
+          <w:iCs w:val="false"/>
+          <w:sz w:val="21"/>
+          <w:szCs w:val="21"/>
+        </w:rPr>
+        <w:t xml:space="preserve">new, unique parts</w:t>
+      </w:r>
+      <w:r>
+        <w:rPr>
+          <w:rFonts w:ascii="Calibri" w:cs="Calibri" w:eastAsia="Calibri" w:hAnsi="Calibri"/>
+          <w:b w:val="false"/>
+          <w:bCs w:val="false"/>
+          <w:i w:val="false"/>
+          <w:iCs w:val="false"/>
+          <w:sz w:val="21"/>
+          <w:szCs w:val="21"/>
+        </w:rPr>
+        <w:t xml:space="preserve"> for which no master plan exists, because it </w:t>
+      </w:r>
+      <w:r>
+        <w:rPr>
+          <w:rFonts w:ascii="Calibri" w:cs="Calibri" w:eastAsia="Calibri" w:hAnsi="Calibri"/>
+          <w:b/>
+          <w:bCs/>
+          <w:i w:val="false"/>
+          <w:iCs w:val="false"/>
+          <w:sz w:val="21"/>
+          <w:szCs w:val="21"/>
+        </w:rPr>
+        <w:t xml:space="preserve">builds the plan from scratch</w:t>
+      </w:r>
+      <w:r>
+        <w:rPr>
+          <w:rFonts w:ascii="Calibri" w:cs="Calibri" w:eastAsia="Calibri" w:hAnsi="Calibri"/>
+          <w:b w:val="false"/>
+          <w:bCs w:val="false"/>
+          <w:i w:val="false"/>
+          <w:iCs w:val="false"/>
+          <w:sz w:val="21"/>
+          <w:szCs w:val="21"/>
+        </w:rPr>
+        <w:t xml:space="preserve"> using logical rules and a machinability database — more flexible but far more complex and costly to develop. So a company making </w:t>
+      </w:r>
+      <w:r>
+        <w:rPr>
+          <w:rFonts w:ascii="Calibri" w:cs="Calibri" w:eastAsia="Calibri" w:hAnsi="Calibri"/>
+          <w:b/>
+          <w:bCs/>
+          <w:i w:val="false"/>
+          <w:iCs w:val="false"/>
+          <w:sz w:val="21"/>
+          <w:szCs w:val="21"/>
+        </w:rPr>
+        <w:t xml:space="preserve">many standardised, repetitive parts</w:t>
+      </w:r>
+      <w:r>
+        <w:rPr>
+          <w:rFonts w:ascii="Calibri" w:cs="Calibri" w:eastAsia="Calibri" w:hAnsi="Calibri"/>
+          <w:b w:val="false"/>
+          <w:bCs w:val="false"/>
+          <w:i w:val="false"/>
+          <w:iCs w:val="false"/>
+          <w:sz w:val="21"/>
+          <w:szCs w:val="21"/>
+        </w:rPr>
+        <w:t xml:space="preserve"> picks the Variant system.</w:t>
+      </w:r>
+    </w:p>
+    <w:p>
+      <w:r>
+        <w:br w:type="page"/>
       </w:r>
     </w:p>
     <w:p>
@@ -3729,7 +4090,7 @@
           <w:sz w:val="21"/>
           <w:szCs w:val="21"/>
         </w:rPr>
-        <w:t xml:space="preserve">  (where nₐ = number of aisles, x = horizontal compartments, y = vertical tiers; the factor 2 accounts for a rack on </w:t>
+        <w:t xml:space="preserve">  (nₐ = number of aisles, x = horizontal compartments, y = vertical tiers; the factor 2 accounts for a rack on </w:t>
       </w:r>
       <w:r>
         <w:rPr>
@@ -3812,7 +4173,7 @@
     <w:p>
       <w:pPr>
         <w:keepNext/>
-        <w:spacing w:after="24" w:before="120" w:line="276" w:lineRule="auto"/>
+        <w:spacing w:after="26" w:before="130" w:line="278" w:lineRule="auto"/>
       </w:pPr>
       <w:r>
         <w:rPr>
@@ -3842,7 +4203,7 @@
     </w:p>
     <w:p>
       <w:pPr>
-        <w:spacing w:after="70" w:before="0" w:line="276" w:lineRule="auto"/>
+        <w:spacing w:after="80" w:before="0" w:line="278" w:lineRule="auto"/>
         <w:ind w:left="150"/>
       </w:pPr>
       <w:r>
@@ -3892,7 +4253,7 @@
           <w:sz w:val="21"/>
           <w:szCs w:val="21"/>
         </w:rPr>
-        <w:t xml:space="preserve">. It states that all available space must be used effectively — making the best use of the building’s </w:t>
+        <w:t xml:space="preserve">. It states that all available space in a facility must be used as effectively as possible — making the best use of the building’s </w:t>
       </w:r>
       <w:r>
         <w:rPr>
@@ -3916,7 +4277,31 @@
           <w:sz w:val="21"/>
           <w:szCs w:val="21"/>
         </w:rPr>
-        <w:t xml:space="preserve"> through high-density and vertical storage (e.g. tall AS/RS racks) and minimising wasted floor space and dead volume. (The related </w:t>
+        <w:t xml:space="preserve"> rather than just its floor area, chiefly by storing </w:t>
+      </w:r>
+      <w:r>
+        <w:rPr>
+          <w:rFonts w:ascii="Calibri" w:cs="Calibri" w:eastAsia="Calibri" w:hAnsi="Calibri"/>
+          <w:b/>
+          <w:bCs/>
+          <w:i w:val="false"/>
+          <w:iCs w:val="false"/>
+          <w:sz w:val="21"/>
+          <w:szCs w:val="21"/>
+        </w:rPr>
+        <w:t xml:space="preserve">vertically in high-density racks</w:t>
+      </w:r>
+      <w:r>
+        <w:rPr>
+          <w:rFonts w:ascii="Calibri" w:cs="Calibri" w:eastAsia="Calibri" w:hAnsi="Calibri"/>
+          <w:b w:val="false"/>
+          <w:bCs w:val="false"/>
+          <w:i w:val="false"/>
+          <w:iCs w:val="false"/>
+          <w:sz w:val="21"/>
+          <w:szCs w:val="21"/>
+        </w:rPr>
+        <w:t xml:space="preserve"> (as an AS/RS does) and by minimising wasted aisles and dead volume. Maximising cube utilisation is its core aim; the related </w:t>
       </w:r>
       <w:r>
         <w:rPr>
@@ -3940,13 +4325,37 @@
           <w:sz w:val="21"/>
           <w:szCs w:val="21"/>
         </w:rPr>
-        <w:t xml:space="preserve"> addresses keeping the dead-weight of handling units low relative to the payload moved.)</w:t>
+        <w:t xml:space="preserve"> complements it by keeping the </w:t>
+      </w:r>
+      <w:r>
+        <w:rPr>
+          <w:rFonts w:ascii="Calibri" w:cs="Calibri" w:eastAsia="Calibri" w:hAnsi="Calibri"/>
+          <w:b/>
+          <w:bCs/>
+          <w:i w:val="false"/>
+          <w:iCs w:val="false"/>
+          <w:sz w:val="21"/>
+          <w:szCs w:val="21"/>
+        </w:rPr>
+        <w:t xml:space="preserve">dead-weight of each handling unit low</w:t>
+      </w:r>
+      <w:r>
+        <w:rPr>
+          <w:rFonts w:ascii="Calibri" w:cs="Calibri" w:eastAsia="Calibri" w:hAnsi="Calibri"/>
+          <w:b w:val="false"/>
+          <w:bCs w:val="false"/>
+          <w:i w:val="false"/>
+          <w:iCs w:val="false"/>
+          <w:sz w:val="21"/>
+          <w:szCs w:val="21"/>
+        </w:rPr>
+        <w:t xml:space="preserve"> relative to the payload carried, so that less energy and equipment are spent moving the container rather than the product.</w:t>
       </w:r>
     </w:p>
     <w:p>
       <w:pPr>
         <w:keepNext/>
-        <w:spacing w:after="24" w:before="120" w:line="276" w:lineRule="auto"/>
+        <w:spacing w:after="26" w:before="130" w:line="278" w:lineRule="auto"/>
       </w:pPr>
       <w:r>
         <w:rPr>
@@ -3976,7 +4385,7 @@
     </w:p>
     <w:p>
       <w:pPr>
-        <w:spacing w:after="70" w:before="0" w:line="276" w:lineRule="auto"/>
+        <w:spacing w:after="80" w:before="0" w:line="278" w:lineRule="auto"/>
         <w:ind w:left="150"/>
       </w:pPr>
       <w:r>
@@ -4002,7 +4411,7 @@
           <w:sz w:val="21"/>
           <w:szCs w:val="21"/>
         </w:rPr>
-        <w:t xml:space="preserve">The guide path is divided into </w:t>
+        <w:t xml:space="preserve">The shared guide path is divided into </w:t>
       </w:r>
       <w:r>
         <w:rPr>
@@ -4026,109 +4435,205 @@
           <w:sz w:val="21"/>
           <w:szCs w:val="21"/>
         </w:rPr>
-        <w:t xml:space="preserve">, and a traffic controller allows </w:t>
-      </w:r>
-      <w:r>
-        <w:rPr>
-          <w:rFonts w:ascii="Calibri" w:cs="Calibri" w:eastAsia="Calibri" w:hAnsi="Calibri"/>
-          <w:b/>
-          <w:bCs/>
-          <w:i w:val="false"/>
-          <w:iCs w:val="false"/>
-          <w:sz w:val="21"/>
-          <w:szCs w:val="21"/>
-        </w:rPr>
-        <w:t xml:space="preserve">only one AGV in a block at a time</w:t>
-      </w:r>
-      <w:r>
-        <w:rPr>
-          <w:rFonts w:ascii="Calibri" w:cs="Calibri" w:eastAsia="Calibri" w:hAnsi="Calibri"/>
-          <w:b w:val="false"/>
-          <w:bCs w:val="false"/>
-          <w:i w:val="false"/>
-          <w:iCs w:val="false"/>
-          <w:sz w:val="21"/>
-          <w:szCs w:val="21"/>
-        </w:rPr>
-        <w:t xml:space="preserve">. An AGV must </w:t>
-      </w:r>
-      <w:r>
-        <w:rPr>
-          <w:rFonts w:ascii="Calibri" w:cs="Calibri" w:eastAsia="Calibri" w:hAnsi="Calibri"/>
-          <w:b/>
-          <w:bCs/>
-          <w:i w:val="false"/>
-          <w:iCs w:val="false"/>
-          <w:sz w:val="21"/>
-          <w:szCs w:val="21"/>
-        </w:rPr>
-        <w:t xml:space="preserve">request and be granted permission</w:t>
-      </w:r>
-      <w:r>
-        <w:rPr>
-          <w:rFonts w:ascii="Calibri" w:cs="Calibri" w:eastAsia="Calibri" w:hAnsi="Calibri"/>
-          <w:b w:val="false"/>
-          <w:bCs w:val="false"/>
-          <w:i w:val="false"/>
-          <w:iCs w:val="false"/>
-          <w:sz w:val="21"/>
-          <w:szCs w:val="21"/>
-        </w:rPr>
-        <w:t xml:space="preserve"> before entering the next block; if the block ahead is occupied it </w:t>
-      </w:r>
-      <w:r>
-        <w:rPr>
-          <w:rFonts w:ascii="Calibri" w:cs="Calibri" w:eastAsia="Calibri" w:hAnsi="Calibri"/>
-          <w:b/>
-          <w:bCs/>
-          <w:i w:val="false"/>
-          <w:iCs w:val="false"/>
-          <w:sz w:val="21"/>
-          <w:szCs w:val="21"/>
-        </w:rPr>
-        <w:t xml:space="preserve">waits</w:t>
-      </w:r>
-      <w:r>
-        <w:rPr>
-          <w:rFonts w:ascii="Calibri" w:cs="Calibri" w:eastAsia="Calibri" w:hAnsi="Calibri"/>
-          <w:b w:val="false"/>
-          <w:bCs w:val="false"/>
-          <w:i w:val="false"/>
-          <w:iCs w:val="false"/>
-          <w:sz w:val="21"/>
-          <w:szCs w:val="21"/>
-        </w:rPr>
-        <w:t xml:space="preserve">. Combined with onboard proximity/bumper sensors and defined right-of-way rules at intersections, this </w:t>
-      </w:r>
-      <w:r>
-        <w:rPr>
-          <w:rFonts w:ascii="Calibri" w:cs="Calibri" w:eastAsia="Calibri" w:hAnsi="Calibri"/>
-          <w:b/>
-          <w:bCs/>
-          <w:i w:val="false"/>
-          <w:iCs w:val="false"/>
-          <w:sz w:val="21"/>
-          <w:szCs w:val="21"/>
-        </w:rPr>
-        <w:t xml:space="preserve">blocking-zone logic</w:t>
-      </w:r>
-      <w:r>
-        <w:rPr>
-          <w:rFonts w:ascii="Calibri" w:cs="Calibri" w:eastAsia="Calibri" w:hAnsi="Calibri"/>
-          <w:b w:val="false"/>
-          <w:bCs w:val="false"/>
-          <w:i w:val="false"/>
-          <w:iCs w:val="false"/>
-          <w:sz w:val="21"/>
-          <w:szCs w:val="21"/>
-        </w:rPr>
-        <w:t xml:space="preserve"> prevents two vehicles from occupying the same path segment, avoiding collisions and deadlock.</w:t>
+        <w:t xml:space="preserve">, and a </w:t>
+      </w:r>
+      <w:r>
+        <w:rPr>
+          <w:rFonts w:ascii="Calibri" w:cs="Calibri" w:eastAsia="Calibri" w:hAnsi="Calibri"/>
+          <w:b/>
+          <w:bCs/>
+          <w:i w:val="false"/>
+          <w:iCs w:val="false"/>
+          <w:sz w:val="21"/>
+          <w:szCs w:val="21"/>
+        </w:rPr>
+        <w:t xml:space="preserve">central traffic controller (zone/blocking control)</w:t>
+      </w:r>
+      <w:r>
+        <w:rPr>
+          <w:rFonts w:ascii="Calibri" w:cs="Calibri" w:eastAsia="Calibri" w:hAnsi="Calibri"/>
+          <w:b w:val="false"/>
+          <w:bCs w:val="false"/>
+          <w:i w:val="false"/>
+          <w:iCs w:val="false"/>
+          <w:sz w:val="21"/>
+          <w:szCs w:val="21"/>
+        </w:rPr>
+        <w:t xml:space="preserve"> allows </w:t>
+      </w:r>
+      <w:r>
+        <w:rPr>
+          <w:rFonts w:ascii="Calibri" w:cs="Calibri" w:eastAsia="Calibri" w:hAnsi="Calibri"/>
+          <w:b/>
+          <w:bCs/>
+          <w:i w:val="false"/>
+          <w:iCs w:val="false"/>
+          <w:sz w:val="21"/>
+          <w:szCs w:val="21"/>
+        </w:rPr>
+        <w:t xml:space="preserve">only one AGV inside a block at a time</w:t>
+      </w:r>
+      <w:r>
+        <w:rPr>
+          <w:rFonts w:ascii="Calibri" w:cs="Calibri" w:eastAsia="Calibri" w:hAnsi="Calibri"/>
+          <w:b w:val="false"/>
+          <w:bCs w:val="false"/>
+          <w:i w:val="false"/>
+          <w:iCs w:val="false"/>
+          <w:sz w:val="21"/>
+          <w:szCs w:val="21"/>
+        </w:rPr>
+        <w:t xml:space="preserve">. Before an AGV may enter the next block it must </w:t>
+      </w:r>
+      <w:r>
+        <w:rPr>
+          <w:rFonts w:ascii="Calibri" w:cs="Calibri" w:eastAsia="Calibri" w:hAnsi="Calibri"/>
+          <w:b/>
+          <w:bCs/>
+          <w:i w:val="false"/>
+          <w:iCs w:val="false"/>
+          <w:sz w:val="21"/>
+          <w:szCs w:val="21"/>
+        </w:rPr>
+        <w:t xml:space="preserve">request permission</w:t>
+      </w:r>
+      <w:r>
+        <w:rPr>
+          <w:rFonts w:ascii="Calibri" w:cs="Calibri" w:eastAsia="Calibri" w:hAnsi="Calibri"/>
+          <w:b w:val="false"/>
+          <w:bCs w:val="false"/>
+          <w:i w:val="false"/>
+          <w:iCs w:val="false"/>
+          <w:sz w:val="21"/>
+          <w:szCs w:val="21"/>
+        </w:rPr>
+        <w:t xml:space="preserve">; the controller grants it only if that block is </w:t>
+      </w:r>
+      <w:r>
+        <w:rPr>
+          <w:rFonts w:ascii="Calibri" w:cs="Calibri" w:eastAsia="Calibri" w:hAnsi="Calibri"/>
+          <w:b/>
+          <w:bCs/>
+          <w:i w:val="false"/>
+          <w:iCs w:val="false"/>
+          <w:sz w:val="21"/>
+          <w:szCs w:val="21"/>
+        </w:rPr>
+        <w:t xml:space="preserve">free</w:t>
+      </w:r>
+      <w:r>
+        <w:rPr>
+          <w:rFonts w:ascii="Calibri" w:cs="Calibri" w:eastAsia="Calibri" w:hAnsi="Calibri"/>
+          <w:b w:val="false"/>
+          <w:bCs w:val="false"/>
+          <w:i w:val="false"/>
+          <w:iCs w:val="false"/>
+          <w:sz w:val="21"/>
+          <w:szCs w:val="21"/>
+        </w:rPr>
+        <w:t xml:space="preserve">, otherwise the vehicle </w:t>
+      </w:r>
+      <w:r>
+        <w:rPr>
+          <w:rFonts w:ascii="Calibri" w:cs="Calibri" w:eastAsia="Calibri" w:hAnsi="Calibri"/>
+          <w:b/>
+          <w:bCs/>
+          <w:i w:val="false"/>
+          <w:iCs w:val="false"/>
+          <w:sz w:val="21"/>
+          <w:szCs w:val="21"/>
+        </w:rPr>
+        <w:t xml:space="preserve">stops and waits</w:t>
+      </w:r>
+      <w:r>
+        <w:rPr>
+          <w:rFonts w:ascii="Calibri" w:cs="Calibri" w:eastAsia="Calibri" w:hAnsi="Calibri"/>
+          <w:b w:val="false"/>
+          <w:bCs w:val="false"/>
+          <w:i w:val="false"/>
+          <w:iCs w:val="false"/>
+          <w:sz w:val="21"/>
+          <w:szCs w:val="21"/>
+        </w:rPr>
+        <w:t xml:space="preserve"> until the block clears. This blocking logic is backed up by </w:t>
+      </w:r>
+      <w:r>
+        <w:rPr>
+          <w:rFonts w:ascii="Calibri" w:cs="Calibri" w:eastAsia="Calibri" w:hAnsi="Calibri"/>
+          <w:b/>
+          <w:bCs/>
+          <w:i w:val="false"/>
+          <w:iCs w:val="false"/>
+          <w:sz w:val="21"/>
+          <w:szCs w:val="21"/>
+        </w:rPr>
+        <w:t xml:space="preserve">onboard proximity, laser and bumper sensors</w:t>
+      </w:r>
+      <w:r>
+        <w:rPr>
+          <w:rFonts w:ascii="Calibri" w:cs="Calibri" w:eastAsia="Calibri" w:hAnsi="Calibri"/>
+          <w:b w:val="false"/>
+          <w:bCs w:val="false"/>
+          <w:i w:val="false"/>
+          <w:iCs w:val="false"/>
+          <w:sz w:val="21"/>
+          <w:szCs w:val="21"/>
+        </w:rPr>
+        <w:t xml:space="preserve"> and by fixed </w:t>
+      </w:r>
+      <w:r>
+        <w:rPr>
+          <w:rFonts w:ascii="Calibri" w:cs="Calibri" w:eastAsia="Calibri" w:hAnsi="Calibri"/>
+          <w:b/>
+          <w:bCs/>
+          <w:i w:val="false"/>
+          <w:iCs w:val="false"/>
+          <w:sz w:val="21"/>
+          <w:szCs w:val="21"/>
+        </w:rPr>
+        <w:t xml:space="preserve">right-of-way rules at intersections and merges</w:t>
+      </w:r>
+      <w:r>
+        <w:rPr>
+          <w:rFonts w:ascii="Calibri" w:cs="Calibri" w:eastAsia="Calibri" w:hAnsi="Calibri"/>
+          <w:b w:val="false"/>
+          <w:bCs w:val="false"/>
+          <w:i w:val="false"/>
+          <w:iCs w:val="false"/>
+          <w:sz w:val="21"/>
+          <w:szCs w:val="21"/>
+        </w:rPr>
+        <w:t xml:space="preserve">. Together they guarantee that two vehicles can never occupy the same path segment, which </w:t>
+      </w:r>
+      <w:r>
+        <w:rPr>
+          <w:rFonts w:ascii="Calibri" w:cs="Calibri" w:eastAsia="Calibri" w:hAnsi="Calibri"/>
+          <w:b/>
+          <w:bCs/>
+          <w:i w:val="false"/>
+          <w:iCs w:val="false"/>
+          <w:sz w:val="21"/>
+          <w:szCs w:val="21"/>
+        </w:rPr>
+        <w:t xml:space="preserve">prevents collisions and also avoids deadlock</w:t>
+      </w:r>
+      <w:r>
+        <w:rPr>
+          <w:rFonts w:ascii="Calibri" w:cs="Calibri" w:eastAsia="Calibri" w:hAnsi="Calibri"/>
+          <w:b w:val="false"/>
+          <w:bCs w:val="false"/>
+          <w:i w:val="false"/>
+          <w:iCs w:val="false"/>
+          <w:sz w:val="21"/>
+          <w:szCs w:val="21"/>
+        </w:rPr>
+        <w:t xml:space="preserve"> (where vehicles mutually block each other) on a busy shared layout.</w:t>
       </w:r>
     </w:p>
     <w:p>
       <w:pPr>
         <w:keepNext/>
-        <w:spacing w:after="24" w:before="120" w:line="276" w:lineRule="auto"/>
+        <w:spacing w:after="26" w:before="130" w:line="278" w:lineRule="auto"/>
       </w:pPr>
       <w:r>
         <w:rPr>
@@ -4158,7 +4663,7 @@
     </w:p>
     <w:p>
       <w:pPr>
-        <w:spacing w:after="70" w:before="0" w:line="276" w:lineRule="auto"/>
+        <w:spacing w:after="80" w:before="0" w:line="278" w:lineRule="auto"/>
         <w:ind w:left="150"/>
       </w:pPr>
       <w:r>
@@ -4184,7 +4689,31 @@
           <w:sz w:val="21"/>
           <w:szCs w:val="21"/>
         </w:rPr>
-        <w:t xml:space="preserve">An AS/RS offers </w:t>
+        <w:t xml:space="preserve">An </w:t>
+      </w:r>
+      <w:r>
+        <w:rPr>
+          <w:rFonts w:ascii="Calibri" w:cs="Calibri" w:eastAsia="Calibri" w:hAnsi="Calibri"/>
+          <w:b/>
+          <w:bCs/>
+          <w:i w:val="false"/>
+          <w:iCs w:val="false"/>
+          <w:sz w:val="21"/>
+          <w:szCs w:val="21"/>
+        </w:rPr>
+        <w:t xml:space="preserve">AS/RS</w:t>
+      </w:r>
+      <w:r>
+        <w:rPr>
+          <w:rFonts w:ascii="Calibri" w:cs="Calibri" w:eastAsia="Calibri" w:hAnsi="Calibri"/>
+          <w:b w:val="false"/>
+          <w:bCs w:val="false"/>
+          <w:i w:val="false"/>
+          <w:iCs w:val="false"/>
+          <w:sz w:val="21"/>
+          <w:szCs w:val="21"/>
+        </w:rPr>
+        <w:t xml:space="preserve"> gives </w:t>
       </w:r>
       <w:r>
         <w:rPr>
@@ -4208,31 +4737,31 @@
           <w:sz w:val="21"/>
           <w:szCs w:val="21"/>
         </w:rPr>
-        <w:t xml:space="preserve"> (tall, narrow aisles use cubic space far better), </w:t>
-      </w:r>
-      <w:r>
-        <w:rPr>
-          <w:rFonts w:ascii="Calibri" w:cs="Calibri" w:eastAsia="Calibri" w:hAnsi="Calibri"/>
-          <w:b/>
-          <w:bCs/>
-          <w:i w:val="false"/>
-          <w:iCs w:val="false"/>
-          <w:sz w:val="21"/>
-          <w:szCs w:val="21"/>
-        </w:rPr>
-        <w:t xml:space="preserve">faster automated 24/7 storage and retrieval</w:t>
-      </w:r>
-      <w:r>
-        <w:rPr>
-          <w:rFonts w:ascii="Calibri" w:cs="Calibri" w:eastAsia="Calibri" w:hAnsi="Calibri"/>
-          <w:b w:val="false"/>
-          <w:bCs w:val="false"/>
-          <w:i w:val="false"/>
-          <w:iCs w:val="false"/>
-          <w:sz w:val="21"/>
-          <w:szCs w:val="21"/>
-        </w:rPr>
-        <w:t xml:space="preserve"> with higher throughput, </w:t>
+        <w:t xml:space="preserve">, because its tall, narrow aisles and vertical racking use the building’s cubic space far better than the wide aisles a forklift needs. It provides </w:t>
+      </w:r>
+      <w:r>
+        <w:rPr>
+          <w:rFonts w:ascii="Calibri" w:cs="Calibri" w:eastAsia="Calibri" w:hAnsi="Calibri"/>
+          <w:b/>
+          <w:bCs/>
+          <w:i w:val="false"/>
+          <w:iCs w:val="false"/>
+          <w:sz w:val="21"/>
+          <w:szCs w:val="21"/>
+        </w:rPr>
+        <w:t xml:space="preserve">faster, automated, 24/7 storage and retrieval</w:t>
+      </w:r>
+      <w:r>
+        <w:rPr>
+          <w:rFonts w:ascii="Calibri" w:cs="Calibri" w:eastAsia="Calibri" w:hAnsi="Calibri"/>
+          <w:b w:val="false"/>
+          <w:bCs w:val="false"/>
+          <w:i w:val="false"/>
+          <w:iCs w:val="false"/>
+          <w:sz w:val="21"/>
+          <w:szCs w:val="21"/>
+        </w:rPr>
+        <w:t xml:space="preserve"> with higher and more consistent throughput; </w:t>
       </w:r>
       <w:r>
         <w:rPr>
@@ -4256,7 +4785,7 @@
           <w:sz w:val="21"/>
           <w:szCs w:val="21"/>
         </w:rPr>
-        <w:t xml:space="preserve"> (fewer lost or mis-picked items), </w:t>
+        <w:t xml:space="preserve"> through its warehouse-management software, so items are rarely lost or mis-picked; </w:t>
       </w:r>
       <w:r>
         <w:rPr>
@@ -4280,7 +4809,7 @@
           <w:sz w:val="21"/>
           <w:szCs w:val="21"/>
         </w:rPr>
-        <w:t xml:space="preserve">, and </w:t>
+        <w:t xml:space="preserve">; </w:t>
       </w:r>
       <w:r>
         <w:rPr>
@@ -4304,13 +4833,37 @@
           <w:sz w:val="21"/>
           <w:szCs w:val="21"/>
         </w:rPr>
-        <w:t xml:space="preserve"> (fewer human-forklift accidents). A manual forklift system is slower, needs wide aisles, is labour-intensive and more error-prone.</w:t>
+        <w:t xml:space="preserve">, since there are far fewer human-forklift accidents; and better, software-enforced </w:t>
+      </w:r>
+      <w:r>
+        <w:rPr>
+          <w:rFonts w:ascii="Calibri" w:cs="Calibri" w:eastAsia="Calibri" w:hAnsi="Calibri"/>
+          <w:b/>
+          <w:bCs/>
+          <w:i w:val="false"/>
+          <w:iCs w:val="false"/>
+          <w:sz w:val="21"/>
+          <w:szCs w:val="21"/>
+        </w:rPr>
+        <w:t xml:space="preserve">stock rotation (FIFO)</w:t>
+      </w:r>
+      <w:r>
+        <w:rPr>
+          <w:rFonts w:ascii="Calibri" w:cs="Calibri" w:eastAsia="Calibri" w:hAnsi="Calibri"/>
+          <w:b w:val="false"/>
+          <w:bCs w:val="false"/>
+          <w:i w:val="false"/>
+          <w:iCs w:val="false"/>
+          <w:sz w:val="21"/>
+          <w:szCs w:val="21"/>
+        </w:rPr>
+        <w:t xml:space="preserve">. A manual forklift-and-pallet system, by comparison, is slower, space-hungry, labour-intensive and more error-prone.</w:t>
       </w:r>
     </w:p>
     <w:p>
       <w:pPr>
         <w:keepNext/>
-        <w:spacing w:after="24" w:before="120" w:line="276" w:lineRule="auto"/>
+        <w:spacing w:after="26" w:before="130" w:line="278" w:lineRule="auto"/>
       </w:pPr>
       <w:r>
         <w:rPr>
@@ -4340,7 +4893,7 @@
     </w:p>
     <w:p>
       <w:pPr>
-        <w:spacing w:after="70" w:before="0" w:line="276" w:lineRule="auto"/>
+        <w:spacing w:after="80" w:before="0" w:line="278" w:lineRule="auto"/>
         <w:ind w:left="150"/>
       </w:pPr>
       <w:r>
@@ -4359,110 +4912,127 @@
       <w:r>
         <w:rPr>
           <w:rFonts w:ascii="Calibri" w:cs="Calibri" w:eastAsia="Calibri" w:hAnsi="Calibri"/>
-          <w:b w:val="false"/>
-          <w:bCs w:val="false"/>
-          <w:i w:val="false"/>
-          <w:iCs w:val="false"/>
-          <w:sz w:val="21"/>
-          <w:szCs w:val="21"/>
-        </w:rPr>
-        <w:t xml:space="preserve">2D matrix codes store </w:t>
-      </w:r>
-      <w:r>
-        <w:rPr>
-          <w:rFonts w:ascii="Calibri" w:cs="Calibri" w:eastAsia="Calibri" w:hAnsi="Calibri"/>
-          <w:b/>
-          <w:bCs/>
-          <w:i w:val="false"/>
-          <w:iCs w:val="false"/>
-          <w:sz w:val="21"/>
-          <w:szCs w:val="21"/>
-        </w:rPr>
-        <w:t xml:space="preserve">much more data in a smaller area</w:t>
-      </w:r>
-      <w:r>
-        <w:rPr>
-          <w:rFonts w:ascii="Calibri" w:cs="Calibri" w:eastAsia="Calibri" w:hAnsi="Calibri"/>
-          <w:b w:val="false"/>
-          <w:bCs w:val="false"/>
-          <w:i w:val="false"/>
-          <w:iCs w:val="false"/>
-          <w:sz w:val="21"/>
-          <w:szCs w:val="21"/>
-        </w:rPr>
-        <w:t xml:space="preserve">, can be read from </w:t>
-      </w:r>
-      <w:r>
-        <w:rPr>
-          <w:rFonts w:ascii="Calibri" w:cs="Calibri" w:eastAsia="Calibri" w:hAnsi="Calibri"/>
-          <w:b/>
-          <w:bCs/>
-          <w:i w:val="false"/>
-          <w:iCs w:val="false"/>
-          <w:sz w:val="21"/>
-          <w:szCs w:val="21"/>
-        </w:rPr>
-        <w:t xml:space="preserve">any orientation (omnidirectional)</w:t>
-      </w:r>
-      <w:r>
-        <w:rPr>
-          <w:rFonts w:ascii="Calibri" w:cs="Calibri" w:eastAsia="Calibri" w:hAnsi="Calibri"/>
-          <w:b w:val="false"/>
-          <w:bCs w:val="false"/>
-          <w:i w:val="false"/>
-          <w:iCs w:val="false"/>
-          <w:sz w:val="21"/>
-          <w:szCs w:val="21"/>
-        </w:rPr>
-        <w:t xml:space="preserve">, and most importantly have </w:t>
-      </w:r>
-      <w:r>
-        <w:rPr>
-          <w:rFonts w:ascii="Calibri" w:cs="Calibri" w:eastAsia="Calibri" w:hAnsi="Calibri"/>
-          <w:b/>
-          <w:bCs/>
-          <w:i w:val="false"/>
-          <w:iCs w:val="false"/>
-          <w:sz w:val="21"/>
-          <w:szCs w:val="21"/>
-        </w:rPr>
-        <w:t xml:space="preserve">built-in error correction (redundancy)</w:t>
-      </w:r>
-      <w:r>
-        <w:rPr>
-          <w:rFonts w:ascii="Calibri" w:cs="Calibri" w:eastAsia="Calibri" w:hAnsi="Calibri"/>
-          <w:b w:val="false"/>
-          <w:bCs w:val="false"/>
-          <w:i w:val="false"/>
-          <w:iCs w:val="false"/>
-          <w:sz w:val="21"/>
-          <w:szCs w:val="21"/>
-        </w:rPr>
-        <w:t xml:space="preserve">, so they can still be decoded when partly damaged, dirty, scratched or poorly printed. In harsh conditions (dust, oil, abrasion) a 1D barcode fails once its bars are smudged or damaged, whereas a </w:t>
-      </w:r>
-      <w:r>
-        <w:rPr>
-          <w:rFonts w:ascii="Calibri" w:cs="Calibri" w:eastAsia="Calibri" w:hAnsi="Calibri"/>
-          <w:b/>
-          <w:bCs/>
-          <w:i w:val="false"/>
-          <w:iCs w:val="false"/>
-          <w:sz w:val="21"/>
-          <w:szCs w:val="21"/>
-        </w:rPr>
-        <w:t xml:space="preserve">2D code stays readable</w:t>
-      </w:r>
-      <w:r>
-        <w:rPr>
-          <w:rFonts w:ascii="Calibri" w:cs="Calibri" w:eastAsia="Calibri" w:hAnsi="Calibri"/>
-          <w:b w:val="false"/>
-          <w:bCs w:val="false"/>
-          <w:i w:val="false"/>
-          <w:iCs w:val="false"/>
-          <w:sz w:val="21"/>
-          <w:szCs w:val="21"/>
-        </w:rPr>
-        <w:t xml:space="preserve">, making it far more robust.</w:t>
+          <w:b/>
+          <w:bCs/>
+          <w:i w:val="false"/>
+          <w:iCs w:val="false"/>
+          <w:sz w:val="21"/>
+          <w:szCs w:val="21"/>
+        </w:rPr>
+        <w:t xml:space="preserve">2D matrix codes store far more data in a much smaller area</w:t>
+      </w:r>
+      <w:r>
+        <w:rPr>
+          <w:rFonts w:ascii="Calibri" w:cs="Calibri" w:eastAsia="Calibri" w:hAnsi="Calibri"/>
+          <w:b w:val="false"/>
+          <w:bCs w:val="false"/>
+          <w:i w:val="false"/>
+          <w:iCs w:val="false"/>
+          <w:sz w:val="21"/>
+          <w:szCs w:val="21"/>
+        </w:rPr>
+        <w:t xml:space="preserve"> than a 1D barcode, and they can be </w:t>
+      </w:r>
+      <w:r>
+        <w:rPr>
+          <w:rFonts w:ascii="Calibri" w:cs="Calibri" w:eastAsia="Calibri" w:hAnsi="Calibri"/>
+          <w:b/>
+          <w:bCs/>
+          <w:i w:val="false"/>
+          <w:iCs w:val="false"/>
+          <w:sz w:val="21"/>
+          <w:szCs w:val="21"/>
+        </w:rPr>
+        <w:t xml:space="preserve">read from any orientation (omnidirectionally)</w:t>
+      </w:r>
+      <w:r>
+        <w:rPr>
+          <w:rFonts w:ascii="Calibri" w:cs="Calibri" w:eastAsia="Calibri" w:hAnsi="Calibri"/>
+          <w:b w:val="false"/>
+          <w:bCs w:val="false"/>
+          <w:i w:val="false"/>
+          <w:iCs w:val="false"/>
+          <w:sz w:val="21"/>
+          <w:szCs w:val="21"/>
+        </w:rPr>
+        <w:t xml:space="preserve"> rather than needing a straight-line scan. Most importantly, they contain </w:t>
+      </w:r>
+      <w:r>
+        <w:rPr>
+          <w:rFonts w:ascii="Calibri" w:cs="Calibri" w:eastAsia="Calibri" w:hAnsi="Calibri"/>
+          <w:b/>
+          <w:bCs/>
+          <w:i w:val="false"/>
+          <w:iCs w:val="false"/>
+          <w:sz w:val="21"/>
+          <w:szCs w:val="21"/>
+        </w:rPr>
+        <w:t xml:space="preserve">built-in error-correction (redundancy)</w:t>
+      </w:r>
+      <w:r>
+        <w:rPr>
+          <w:rFonts w:ascii="Calibri" w:cs="Calibri" w:eastAsia="Calibri" w:hAnsi="Calibri"/>
+          <w:b w:val="false"/>
+          <w:bCs w:val="false"/>
+          <w:i w:val="false"/>
+          <w:iCs w:val="false"/>
+          <w:sz w:val="21"/>
+          <w:szCs w:val="21"/>
+        </w:rPr>
+        <w:t xml:space="preserve">, so a code can still be </w:t>
+      </w:r>
+      <w:r>
+        <w:rPr>
+          <w:rFonts w:ascii="Calibri" w:cs="Calibri" w:eastAsia="Calibri" w:hAnsi="Calibri"/>
+          <w:b/>
+          <w:bCs/>
+          <w:i w:val="false"/>
+          <w:iCs w:val="false"/>
+          <w:sz w:val="21"/>
+          <w:szCs w:val="21"/>
+        </w:rPr>
+        <w:t xml:space="preserve">decoded even when it is partly damaged, dirty, scratched, faded or poorly printed</w:t>
+      </w:r>
+      <w:r>
+        <w:rPr>
+          <w:rFonts w:ascii="Calibri" w:cs="Calibri" w:eastAsia="Calibri" w:hAnsi="Calibri"/>
+          <w:b w:val="false"/>
+          <w:bCs w:val="false"/>
+          <w:i w:val="false"/>
+          <w:iCs w:val="false"/>
+          <w:sz w:val="21"/>
+          <w:szCs w:val="21"/>
+        </w:rPr>
+        <w:t xml:space="preserve">. In harsh manufacturing conditions — dust, oil, coolant, heat and abrasion — a 1D barcode fails as soon as a few of its bars are smudged or worn, whereas a 2D code </w:t>
+      </w:r>
+      <w:r>
+        <w:rPr>
+          <w:rFonts w:ascii="Calibri" w:cs="Calibri" w:eastAsia="Calibri" w:hAnsi="Calibri"/>
+          <w:b/>
+          <w:bCs/>
+          <w:i w:val="false"/>
+          <w:iCs w:val="false"/>
+          <w:sz w:val="21"/>
+          <w:szCs w:val="21"/>
+        </w:rPr>
+        <w:t xml:space="preserve">remains reliably readable</w:t>
+      </w:r>
+      <w:r>
+        <w:rPr>
+          <w:rFonts w:ascii="Calibri" w:cs="Calibri" w:eastAsia="Calibri" w:hAnsi="Calibri"/>
+          <w:b w:val="false"/>
+          <w:bCs w:val="false"/>
+          <w:i w:val="false"/>
+          <w:iCs w:val="false"/>
+          <w:sz w:val="21"/>
+          <w:szCs w:val="21"/>
+        </w:rPr>
+        <w:t xml:space="preserve">, which makes it far more robust for automated tracking.</w:t>
+      </w:r>
+    </w:p>
+    <w:p>
+      <w:r>
+        <w:br w:type="page"/>
       </w:r>
     </w:p>
     <w:p>
@@ -4700,7 +5270,7 @@
     <w:p>
       <w:pPr>
         <w:keepNext/>
-        <w:spacing w:after="24" w:before="120" w:line="276" w:lineRule="auto"/>
+        <w:spacing w:after="26" w:before="130" w:line="278" w:lineRule="auto"/>
       </w:pPr>
       <w:r>
         <w:rPr>
@@ -4730,7 +5300,7 @@
     </w:p>
     <w:p>
       <w:pPr>
-        <w:spacing w:after="70" w:before="0" w:line="276" w:lineRule="auto"/>
+        <w:spacing w:after="80" w:before="0" w:line="278" w:lineRule="auto"/>
         <w:ind w:left="150"/>
       </w:pPr>
       <w:r>
@@ -4780,7 +5350,7 @@
           <w:sz w:val="21"/>
           <w:szCs w:val="21"/>
         </w:rPr>
-        <w:t xml:space="preserve"> takes </w:t>
+        <w:t xml:space="preserve"> physically touches the surface and records </w:t>
       </w:r>
       <w:r>
         <w:rPr>
@@ -4804,55 +5374,79 @@
           <w:sz w:val="21"/>
           <w:szCs w:val="21"/>
         </w:rPr>
-        <w:t xml:space="preserve">, so it is </w:t>
-      </w:r>
-      <w:r>
-        <w:rPr>
-          <w:rFonts w:ascii="Calibri" w:cs="Calibri" w:eastAsia="Calibri" w:hAnsi="Calibri"/>
-          <w:b/>
-          <w:bCs/>
-          <w:i w:val="false"/>
-          <w:iCs w:val="false"/>
-          <w:sz w:val="21"/>
-          <w:szCs w:val="21"/>
-        </w:rPr>
-        <w:t xml:space="preserve">slower with low point density</w:t>
-      </w:r>
-      <w:r>
-        <w:rPr>
-          <w:rFonts w:ascii="Calibri" w:cs="Calibri" w:eastAsia="Calibri" w:hAnsi="Calibri"/>
-          <w:b w:val="false"/>
-          <w:bCs w:val="false"/>
-          <w:i w:val="false"/>
-          <w:iCs w:val="false"/>
-          <w:sz w:val="21"/>
-          <w:szCs w:val="21"/>
-        </w:rPr>
-        <w:t xml:space="preserve">, but each point is </w:t>
-      </w:r>
-      <w:r>
-        <w:rPr>
-          <w:rFonts w:ascii="Calibri" w:cs="Calibri" w:eastAsia="Calibri" w:hAnsi="Calibri"/>
-          <w:b/>
-          <w:bCs/>
-          <w:i w:val="false"/>
-          <w:iCs w:val="false"/>
-          <w:sz w:val="21"/>
-          <w:szCs w:val="21"/>
-        </w:rPr>
-        <w:t xml:space="preserve">highly accurate</w:t>
-      </w:r>
-      <w:r>
-        <w:rPr>
-          <w:rFonts w:ascii="Calibri" w:cs="Calibri" w:eastAsia="Calibri" w:hAnsi="Calibri"/>
-          <w:b w:val="false"/>
-          <w:bCs w:val="false"/>
-          <w:i w:val="false"/>
-          <w:iCs w:val="false"/>
-          <w:sz w:val="21"/>
-          <w:szCs w:val="21"/>
-        </w:rPr>
-        <w:t xml:space="preserve"> (micron level) — best for precise features such as bores and distances. </w:t>
+        <w:t xml:space="preserve">, so it is comparatively </w:t>
+      </w:r>
+      <w:r>
+        <w:rPr>
+          <w:rFonts w:ascii="Calibri" w:cs="Calibri" w:eastAsia="Calibri" w:hAnsi="Calibri"/>
+          <w:b/>
+          <w:bCs/>
+          <w:i w:val="false"/>
+          <w:iCs w:val="false"/>
+          <w:sz w:val="21"/>
+          <w:szCs w:val="21"/>
+        </w:rPr>
+        <w:t xml:space="preserve">slow and gives a low point density</w:t>
+      </w:r>
+      <w:r>
+        <w:rPr>
+          <w:rFonts w:ascii="Calibri" w:cs="Calibri" w:eastAsia="Calibri" w:hAnsi="Calibri"/>
+          <w:b w:val="false"/>
+          <w:bCs w:val="false"/>
+          <w:i w:val="false"/>
+          <w:iCs w:val="false"/>
+          <w:sz w:val="21"/>
+          <w:szCs w:val="21"/>
+        </w:rPr>
+        <w:t xml:space="preserve">, but each point is captured to </w:t>
+      </w:r>
+      <w:r>
+        <w:rPr>
+          <w:rFonts w:ascii="Calibri" w:cs="Calibri" w:eastAsia="Calibri" w:hAnsi="Calibri"/>
+          <w:b/>
+          <w:bCs/>
+          <w:i w:val="false"/>
+          <w:iCs w:val="false"/>
+          <w:sz w:val="21"/>
+          <w:szCs w:val="21"/>
+        </w:rPr>
+        <w:t xml:space="preserve">very high accuracy</w:t>
+      </w:r>
+      <w:r>
+        <w:rPr>
+          <w:rFonts w:ascii="Calibri" w:cs="Calibri" w:eastAsia="Calibri" w:hAnsi="Calibri"/>
+          <w:b w:val="false"/>
+          <w:bCs w:val="false"/>
+          <w:i w:val="false"/>
+          <w:iCs w:val="false"/>
+          <w:sz w:val="21"/>
+          <w:szCs w:val="21"/>
+        </w:rPr>
+        <w:t xml:space="preserve"> (micron level) and is unaffected by surface colour or finish — making it best for </w:t>
+      </w:r>
+      <w:r>
+        <w:rPr>
+          <w:rFonts w:ascii="Calibri" w:cs="Calibri" w:eastAsia="Calibri" w:hAnsi="Calibri"/>
+          <w:b/>
+          <w:bCs/>
+          <w:i w:val="false"/>
+          <w:iCs w:val="false"/>
+          <w:sz w:val="21"/>
+          <w:szCs w:val="21"/>
+        </w:rPr>
+        <w:t xml:space="preserve">precise prismatic features</w:t>
+      </w:r>
+      <w:r>
+        <w:rPr>
+          <w:rFonts w:ascii="Calibri" w:cs="Calibri" w:eastAsia="Calibri" w:hAnsi="Calibri"/>
+          <w:b w:val="false"/>
+          <w:bCs w:val="false"/>
+          <w:i w:val="false"/>
+          <w:iCs w:val="false"/>
+          <w:sz w:val="21"/>
+          <w:szCs w:val="21"/>
+        </w:rPr>
+        <w:t xml:space="preserve"> such as bores, hole positions and distances. </w:t>
       </w:r>
       <w:r>
         <w:rPr>
@@ -4876,7 +5470,7 @@
           <w:sz w:val="21"/>
           <w:szCs w:val="21"/>
         </w:rPr>
-        <w:t xml:space="preserve"> projects a laser line/point cloud and captures </w:t>
+        <w:t xml:space="preserve"> sweeps a laser line or point cloud over the part and captures </w:t>
       </w:r>
       <w:r>
         <w:rPr>
@@ -4912,49 +5506,97 @@
           <w:sz w:val="21"/>
           <w:szCs w:val="21"/>
         </w:rPr>
-        <w:t xml:space="preserve">very high speed and very high point-cloud density</w:t>
-      </w:r>
-      <w:r>
-        <w:rPr>
-          <w:rFonts w:ascii="Calibri" w:cs="Calibri" w:eastAsia="Calibri" w:hAnsi="Calibri"/>
-          <w:b w:val="false"/>
-          <w:bCs w:val="false"/>
-          <w:i w:val="false"/>
-          <w:iCs w:val="false"/>
-          <w:sz w:val="21"/>
-          <w:szCs w:val="21"/>
-        </w:rPr>
-        <w:t xml:space="preserve"> ideal for complex 3D surfaces and reverse engineering, but with </w:t>
-      </w:r>
-      <w:r>
-        <w:rPr>
-          <w:rFonts w:ascii="Calibri" w:cs="Calibri" w:eastAsia="Calibri" w:hAnsi="Calibri"/>
-          <w:b/>
-          <w:bCs/>
-          <w:i w:val="false"/>
-          <w:iCs w:val="false"/>
-          <w:sz w:val="21"/>
-          <w:szCs w:val="21"/>
-        </w:rPr>
-        <w:t xml:space="preserve">lower accuracy</w:t>
-      </w:r>
-      <w:r>
-        <w:rPr>
-          <w:rFonts w:ascii="Calibri" w:cs="Calibri" w:eastAsia="Calibri" w:hAnsi="Calibri"/>
-          <w:b w:val="false"/>
-          <w:bCs w:val="false"/>
-          <w:i w:val="false"/>
-          <w:iCs w:val="false"/>
-          <w:sz w:val="21"/>
-          <w:szCs w:val="21"/>
-        </w:rPr>
-        <w:t xml:space="preserve"> (tens of microns) and sensitivity to surface finish and reflectivity.</w:t>
+        <w:t xml:space="preserve">extremely high speed and very dense point clouds</w:t>
+      </w:r>
+      <w:r>
+        <w:rPr>
+          <w:rFonts w:ascii="Calibri" w:cs="Calibri" w:eastAsia="Calibri" w:hAnsi="Calibri"/>
+          <w:b w:val="false"/>
+          <w:bCs w:val="false"/>
+          <w:i w:val="false"/>
+          <w:iCs w:val="false"/>
+          <w:sz w:val="21"/>
+          <w:szCs w:val="21"/>
+        </w:rPr>
+        <w:t xml:space="preserve"> that are ideal for </w:t>
+      </w:r>
+      <w:r>
+        <w:rPr>
+          <w:rFonts w:ascii="Calibri" w:cs="Calibri" w:eastAsia="Calibri" w:hAnsi="Calibri"/>
+          <w:b/>
+          <w:bCs/>
+          <w:i w:val="false"/>
+          <w:iCs w:val="false"/>
+          <w:sz w:val="21"/>
+          <w:szCs w:val="21"/>
+        </w:rPr>
+        <w:t xml:space="preserve">complex free-form 3D surfaces and reverse engineering</w:t>
+      </w:r>
+      <w:r>
+        <w:rPr>
+          <w:rFonts w:ascii="Calibri" w:cs="Calibri" w:eastAsia="Calibri" w:hAnsi="Calibri"/>
+          <w:b w:val="false"/>
+          <w:bCs w:val="false"/>
+          <w:i w:val="false"/>
+          <w:iCs w:val="false"/>
+          <w:sz w:val="21"/>
+          <w:szCs w:val="21"/>
+        </w:rPr>
+        <w:t xml:space="preserve">; however its </w:t>
+      </w:r>
+      <w:r>
+        <w:rPr>
+          <w:rFonts w:ascii="Calibri" w:cs="Calibri" w:eastAsia="Calibri" w:hAnsi="Calibri"/>
+          <w:b/>
+          <w:bCs/>
+          <w:i w:val="false"/>
+          <w:iCs w:val="false"/>
+          <w:sz w:val="21"/>
+          <w:szCs w:val="21"/>
+        </w:rPr>
+        <w:t xml:space="preserve">accuracy is lower</w:t>
+      </w:r>
+      <w:r>
+        <w:rPr>
+          <w:rFonts w:ascii="Calibri" w:cs="Calibri" w:eastAsia="Calibri" w:hAnsi="Calibri"/>
+          <w:b w:val="false"/>
+          <w:bCs w:val="false"/>
+          <w:i w:val="false"/>
+          <w:iCs w:val="false"/>
+          <w:sz w:val="21"/>
+          <w:szCs w:val="21"/>
+        </w:rPr>
+        <w:t xml:space="preserve"> (typically tens of microns) and it is </w:t>
+      </w:r>
+      <w:r>
+        <w:rPr>
+          <w:rFonts w:ascii="Calibri" w:cs="Calibri" w:eastAsia="Calibri" w:hAnsi="Calibri"/>
+          <w:b/>
+          <w:bCs/>
+          <w:i w:val="false"/>
+          <w:iCs w:val="false"/>
+          <w:sz w:val="21"/>
+          <w:szCs w:val="21"/>
+        </w:rPr>
+        <w:t xml:space="preserve">sensitive to surface finish, colour and reflectivity</w:t>
+      </w:r>
+      <w:r>
+        <w:rPr>
+          <w:rFonts w:ascii="Calibri" w:cs="Calibri" w:eastAsia="Calibri" w:hAnsi="Calibri"/>
+          <w:b w:val="false"/>
+          <w:bCs w:val="false"/>
+          <w:i w:val="false"/>
+          <w:iCs w:val="false"/>
+          <w:sz w:val="21"/>
+          <w:szCs w:val="21"/>
+        </w:rPr>
+        <w:t xml:space="preserve"> (shiny or dark surfaces scatter the beam). In short: contact CMM = slow, sparse, highly accurate; laser scanning = fast, dense, less accurate.</w:t>
       </w:r>
     </w:p>
     <w:p>
       <w:pPr>
         <w:keepNext/>
-        <w:spacing w:after="24" w:before="120" w:line="276" w:lineRule="auto"/>
+        <w:spacing w:after="26" w:before="130" w:line="278" w:lineRule="auto"/>
       </w:pPr>
       <w:r>
         <w:rPr>
@@ -4984,7 +5626,7 @@
     </w:p>
     <w:p>
       <w:pPr>
-        <w:spacing w:after="70" w:before="0" w:line="276" w:lineRule="auto"/>
+        <w:spacing w:after="80" w:before="0" w:line="278" w:lineRule="auto"/>
         <w:ind w:left="150"/>
       </w:pPr>
       <w:r>
@@ -5034,103 +5676,247 @@
           <w:sz w:val="21"/>
           <w:szCs w:val="21"/>
         </w:rPr>
-        <w:t xml:space="preserve">. If the room differs from the </w:t>
-      </w:r>
-      <w:r>
-        <w:rPr>
-          <w:rFonts w:ascii="Calibri" w:cs="Calibri" w:eastAsia="Calibri" w:hAnsi="Calibri"/>
-          <w:b/>
-          <w:bCs/>
-          <w:i w:val="false"/>
-          <w:iCs w:val="false"/>
-          <w:sz w:val="21"/>
-          <w:szCs w:val="21"/>
-        </w:rPr>
-        <w:t xml:space="preserve">20 °C reference standard</w:t>
-      </w:r>
-      <w:r>
-        <w:rPr>
-          <w:rFonts w:ascii="Calibri" w:cs="Calibri" w:eastAsia="Calibri" w:hAnsi="Calibri"/>
-          <w:b w:val="false"/>
-          <w:bCs w:val="false"/>
-          <w:i w:val="false"/>
-          <w:iCs w:val="false"/>
-          <w:sz w:val="21"/>
-          <w:szCs w:val="21"/>
-        </w:rPr>
-        <w:t xml:space="preserve">, both the workpiece and the machine’s scales and structure change dimension, so the measured values </w:t>
-      </w:r>
-      <w:r>
-        <w:rPr>
-          <w:rFonts w:ascii="Calibri" w:cs="Calibri" w:eastAsia="Calibri" w:hAnsi="Calibri"/>
-          <w:b/>
-          <w:bCs/>
-          <w:i w:val="false"/>
-          <w:iCs w:val="false"/>
-          <w:sz w:val="21"/>
-          <w:szCs w:val="21"/>
-        </w:rPr>
-        <w:t xml:space="preserve">drift from the true values</w:t>
-      </w:r>
-      <w:r>
-        <w:rPr>
-          <w:rFonts w:ascii="Calibri" w:cs="Calibri" w:eastAsia="Calibri" w:hAnsi="Calibri"/>
-          <w:b w:val="false"/>
-          <w:bCs w:val="false"/>
-          <w:i w:val="false"/>
-          <w:iCs w:val="false"/>
-          <w:sz w:val="21"/>
-          <w:szCs w:val="21"/>
-        </w:rPr>
-        <w:t xml:space="preserve">. Temperature </w:t>
-      </w:r>
-      <w:r>
-        <w:rPr>
-          <w:rFonts w:ascii="Calibri" w:cs="Calibri" w:eastAsia="Calibri" w:hAnsi="Calibri"/>
-          <w:b/>
-          <w:bCs/>
-          <w:i w:val="false"/>
-          <w:iCs w:val="false"/>
-          <w:sz w:val="21"/>
-          <w:szCs w:val="21"/>
-        </w:rPr>
-        <w:t xml:space="preserve">gradients</w:t>
-      </w:r>
-      <w:r>
-        <w:rPr>
-          <w:rFonts w:ascii="Calibri" w:cs="Calibri" w:eastAsia="Calibri" w:hAnsi="Calibri"/>
-          <w:b w:val="false"/>
-          <w:bCs w:val="false"/>
-          <w:i w:val="false"/>
-          <w:iCs w:val="false"/>
-          <w:sz w:val="21"/>
-          <w:szCs w:val="21"/>
-        </w:rPr>
-        <w:t xml:space="preserve"> also distort the CMM frame unevenly. Because even a 1 °C change causes micron-level errors over typical part sizes, precision metrology is performed in </w:t>
-      </w:r>
-      <w:r>
-        <w:rPr>
-          <w:rFonts w:ascii="Calibri" w:cs="Calibri" w:eastAsia="Calibri" w:hAnsi="Calibri"/>
-          <w:b/>
-          <w:bCs/>
-          <w:i w:val="false"/>
-          <w:iCs w:val="false"/>
-          <w:sz w:val="21"/>
-          <w:szCs w:val="21"/>
-        </w:rPr>
-        <w:t xml:space="preserve">temperature-controlled rooms (20 ± 1 °C)</w:t>
-      </w:r>
-      <w:r>
-        <w:rPr>
-          <w:rFonts w:ascii="Calibri" w:cs="Calibri" w:eastAsia="Calibri" w:hAnsi="Calibri"/>
-          <w:b w:val="false"/>
-          <w:bCs w:val="false"/>
-          <w:i w:val="false"/>
-          <w:iCs w:val="false"/>
-          <w:sz w:val="21"/>
-          <w:szCs w:val="21"/>
-        </w:rPr>
-        <w:t xml:space="preserve"> or with active temperature compensation.</w:t>
+        <w:t xml:space="preserve"> (thermal expansion). Dimensional metrology is internationally referenced to </w:t>
+      </w:r>
+      <w:r>
+        <w:rPr>
+          <w:rFonts w:ascii="Calibri" w:cs="Calibri" w:eastAsia="Calibri" w:hAnsi="Calibri"/>
+          <w:b/>
+          <w:bCs/>
+          <w:i w:val="false"/>
+          <w:iCs w:val="false"/>
+          <w:sz w:val="21"/>
+          <w:szCs w:val="21"/>
+        </w:rPr>
+        <w:t xml:space="preserve">20 °C</w:t>
+      </w:r>
+      <w:r>
+        <w:rPr>
+          <w:rFonts w:ascii="Calibri" w:cs="Calibri" w:eastAsia="Calibri" w:hAnsi="Calibri"/>
+          <w:b w:val="false"/>
+          <w:bCs w:val="false"/>
+          <w:i w:val="false"/>
+          <w:iCs w:val="false"/>
+          <w:sz w:val="21"/>
+          <w:szCs w:val="21"/>
+        </w:rPr>
+        <w:t xml:space="preserve">, so whenever the room differs from 20 °C, both the </w:t>
+      </w:r>
+      <w:r>
+        <w:rPr>
+          <w:rFonts w:ascii="Calibri" w:cs="Calibri" w:eastAsia="Calibri" w:hAnsi="Calibri"/>
+          <w:b/>
+          <w:bCs/>
+          <w:i w:val="false"/>
+          <w:iCs w:val="false"/>
+          <w:sz w:val="21"/>
+          <w:szCs w:val="21"/>
+        </w:rPr>
+        <w:t xml:space="preserve">workpiece</w:t>
+      </w:r>
+      <w:r>
+        <w:rPr>
+          <w:rFonts w:ascii="Calibri" w:cs="Calibri" w:eastAsia="Calibri" w:hAnsi="Calibri"/>
+          <w:b w:val="false"/>
+          <w:bCs w:val="false"/>
+          <w:i w:val="false"/>
+          <w:iCs w:val="false"/>
+          <w:sz w:val="21"/>
+          <w:szCs w:val="21"/>
+        </w:rPr>
+        <w:t xml:space="preserve"> and the </w:t>
+      </w:r>
+      <w:r>
+        <w:rPr>
+          <w:rFonts w:ascii="Calibri" w:cs="Calibri" w:eastAsia="Calibri" w:hAnsi="Calibri"/>
+          <w:b/>
+          <w:bCs/>
+          <w:i w:val="false"/>
+          <w:iCs w:val="false"/>
+          <w:sz w:val="21"/>
+          <w:szCs w:val="21"/>
+        </w:rPr>
+        <w:t xml:space="preserve">machine’s scales and structure</w:t>
+      </w:r>
+      <w:r>
+        <w:rPr>
+          <w:rFonts w:ascii="Calibri" w:cs="Calibri" w:eastAsia="Calibri" w:hAnsi="Calibri"/>
+          <w:b w:val="false"/>
+          <w:bCs w:val="false"/>
+          <w:i w:val="false"/>
+          <w:iCs w:val="false"/>
+          <w:sz w:val="21"/>
+          <w:szCs w:val="21"/>
+        </w:rPr>
+        <w:t xml:space="preserve"> change size, and the measured value </w:t>
+      </w:r>
+      <w:r>
+        <w:rPr>
+          <w:rFonts w:ascii="Calibri" w:cs="Calibri" w:eastAsia="Calibri" w:hAnsi="Calibri"/>
+          <w:b/>
+          <w:bCs/>
+          <w:i w:val="false"/>
+          <w:iCs w:val="false"/>
+          <w:sz w:val="21"/>
+          <w:szCs w:val="21"/>
+        </w:rPr>
+        <w:t xml:space="preserve">drifts away from the true dimension</w:t>
+      </w:r>
+      <w:r>
+        <w:rPr>
+          <w:rFonts w:ascii="Calibri" w:cs="Calibri" w:eastAsia="Calibri" w:hAnsi="Calibri"/>
+          <w:b w:val="false"/>
+          <w:bCs w:val="false"/>
+          <w:i w:val="false"/>
+          <w:iCs w:val="false"/>
+          <w:sz w:val="21"/>
+          <w:szCs w:val="21"/>
+        </w:rPr>
+        <w:t xml:space="preserve">. </w:t>
+      </w:r>
+      <w:r>
+        <w:rPr>
+          <w:rFonts w:ascii="Calibri" w:cs="Calibri" w:eastAsia="Calibri" w:hAnsi="Calibri"/>
+          <w:b/>
+          <w:bCs/>
+          <w:i w:val="false"/>
+          <w:iCs w:val="false"/>
+          <w:sz w:val="21"/>
+          <w:szCs w:val="21"/>
+        </w:rPr>
+        <w:t xml:space="preserve">Temperature gradients</w:t>
+      </w:r>
+      <w:r>
+        <w:rPr>
+          <w:rFonts w:ascii="Calibri" w:cs="Calibri" w:eastAsia="Calibri" w:hAnsi="Calibri"/>
+          <w:b w:val="false"/>
+          <w:bCs w:val="false"/>
+          <w:i w:val="false"/>
+          <w:iCs w:val="false"/>
+          <w:sz w:val="21"/>
+          <w:szCs w:val="21"/>
+        </w:rPr>
+        <w:t xml:space="preserve"> — a warm side and a cool side, or heat from motors and lighting — are worse still, because they </w:t>
+      </w:r>
+      <w:r>
+        <w:rPr>
+          <w:rFonts w:ascii="Calibri" w:cs="Calibri" w:eastAsia="Calibri" w:hAnsi="Calibri"/>
+          <w:b/>
+          <w:bCs/>
+          <w:i w:val="false"/>
+          <w:iCs w:val="false"/>
+          <w:sz w:val="21"/>
+          <w:szCs w:val="21"/>
+        </w:rPr>
+        <w:t xml:space="preserve">distort the CMM frame unevenly</w:t>
+      </w:r>
+      <w:r>
+        <w:rPr>
+          <w:rFonts w:ascii="Calibri" w:cs="Calibri" w:eastAsia="Calibri" w:hAnsi="Calibri"/>
+          <w:b w:val="false"/>
+          <w:bCs w:val="false"/>
+          <w:i w:val="false"/>
+          <w:iCs w:val="false"/>
+          <w:sz w:val="21"/>
+          <w:szCs w:val="21"/>
+        </w:rPr>
+        <w:t xml:space="preserve"> and bend the axes. Since even a </w:t>
+      </w:r>
+      <w:r>
+        <w:rPr>
+          <w:rFonts w:ascii="Calibri" w:cs="Calibri" w:eastAsia="Calibri" w:hAnsi="Calibri"/>
+          <w:b/>
+          <w:bCs/>
+          <w:i w:val="false"/>
+          <w:iCs w:val="false"/>
+          <w:sz w:val="21"/>
+          <w:szCs w:val="21"/>
+        </w:rPr>
+        <w:t xml:space="preserve">1 °C change produces micron-level errors</w:t>
+      </w:r>
+      <w:r>
+        <w:rPr>
+          <w:rFonts w:ascii="Calibri" w:cs="Calibri" w:eastAsia="Calibri" w:hAnsi="Calibri"/>
+          <w:b w:val="false"/>
+          <w:bCs w:val="false"/>
+          <w:i w:val="false"/>
+          <w:iCs w:val="false"/>
+          <w:sz w:val="21"/>
+          <w:szCs w:val="21"/>
+        </w:rPr>
+        <w:t xml:space="preserve"> over typical part sizes, high-precision metrology is carried out in </w:t>
+      </w:r>
+      <w:r>
+        <w:rPr>
+          <w:rFonts w:ascii="Calibri" w:cs="Calibri" w:eastAsia="Calibri" w:hAnsi="Calibri"/>
+          <w:b/>
+          <w:bCs/>
+          <w:i w:val="false"/>
+          <w:iCs w:val="false"/>
+          <w:sz w:val="21"/>
+          <w:szCs w:val="21"/>
+        </w:rPr>
+        <w:t xml:space="preserve">temperature-controlled rooms held at 20 ± 1 °C</w:t>
+      </w:r>
+      <w:r>
+        <w:rPr>
+          <w:rFonts w:ascii="Calibri" w:cs="Calibri" w:eastAsia="Calibri" w:hAnsi="Calibri"/>
+          <w:b w:val="false"/>
+          <w:bCs w:val="false"/>
+          <w:i w:val="false"/>
+          <w:iCs w:val="false"/>
+          <w:sz w:val="21"/>
+          <w:szCs w:val="21"/>
+        </w:rPr>
+        <w:t xml:space="preserve">, parts are given time to </w:t>
+      </w:r>
+      <w:r>
+        <w:rPr>
+          <w:rFonts w:ascii="Calibri" w:cs="Calibri" w:eastAsia="Calibri" w:hAnsi="Calibri"/>
+          <w:b/>
+          <w:bCs/>
+          <w:i w:val="false"/>
+          <w:iCs w:val="false"/>
+          <w:sz w:val="21"/>
+          <w:szCs w:val="21"/>
+        </w:rPr>
+        <w:t xml:space="preserve">soak to room temperature</w:t>
+      </w:r>
+      <w:r>
+        <w:rPr>
+          <w:rFonts w:ascii="Calibri" w:cs="Calibri" w:eastAsia="Calibri" w:hAnsi="Calibri"/>
+          <w:b w:val="false"/>
+          <w:bCs w:val="false"/>
+          <w:i w:val="false"/>
+          <w:iCs w:val="false"/>
+          <w:sz w:val="21"/>
+          <w:szCs w:val="21"/>
+        </w:rPr>
+        <w:t xml:space="preserve"> before measurement, and software </w:t>
+      </w:r>
+      <w:r>
+        <w:rPr>
+          <w:rFonts w:ascii="Calibri" w:cs="Calibri" w:eastAsia="Calibri" w:hAnsi="Calibri"/>
+          <w:b/>
+          <w:bCs/>
+          <w:i w:val="false"/>
+          <w:iCs w:val="false"/>
+          <w:sz w:val="21"/>
+          <w:szCs w:val="21"/>
+        </w:rPr>
+        <w:t xml:space="preserve">temperature compensation</w:t>
+      </w:r>
+      <w:r>
+        <w:rPr>
+          <w:rFonts w:ascii="Calibri" w:cs="Calibri" w:eastAsia="Calibri" w:hAnsi="Calibri"/>
+          <w:b w:val="false"/>
+          <w:bCs w:val="false"/>
+          <w:i w:val="false"/>
+          <w:iCs w:val="false"/>
+          <w:sz w:val="21"/>
+          <w:szCs w:val="21"/>
+        </w:rPr>
+        <w:t xml:space="preserve"> is applied to remove the residual error.</w:t>
       </w:r>
     </w:p>
     <w:sectPr>
@@ -5206,44 +5992,7 @@
         <w:sz w:val="16"/>
         <w:szCs w:val="16"/>
       </w:rPr>
-      <w:t xml:space="preserve">Automated Manufacturing (BE05041021) — Question Solutions          Page </w:t>
-    </w:r>
-    <w:r>
-      <w:rPr>
-        <w:rFonts w:ascii="Calibri" w:cs="Calibri" w:eastAsia="Calibri" w:hAnsi="Calibri"/>
-        <w:color w:val="44546A"/>
-        <w:sz w:val="16"/>
-        <w:szCs w:val="16"/>
-      </w:rPr>
-      <w:fldChar w:fldCharType="begin"/>
-      <w:instrText xml:space="preserve">PAGE</w:instrText>
-      <w:fldChar w:fldCharType="separate"/>
-      <w:fldChar w:fldCharType="end"/>
-    </w:r>
-    <w:r>
-      <w:rPr>
-        <w:rFonts w:ascii="Calibri" w:cs="Calibri" w:eastAsia="Calibri" w:hAnsi="Calibri"/>
-        <w:b w:val="false"/>
-        <w:bCs w:val="false"/>
-        <w:i w:val="false"/>
-        <w:iCs w:val="false"/>
-        <w:color w:val="44546A"/>
-        <w:sz w:val="16"/>
-        <w:szCs w:val="16"/>
-      </w:rPr>
-      <w:t xml:space="preserve"> of </w:t>
-    </w:r>
-    <w:r>
-      <w:rPr>
-        <w:rFonts w:ascii="Calibri" w:cs="Calibri" w:eastAsia="Calibri" w:hAnsi="Calibri"/>
-        <w:color w:val="44546A"/>
-        <w:sz w:val="16"/>
-        <w:szCs w:val="16"/>
-      </w:rPr>
-      <w:fldChar w:fldCharType="begin"/>
-      <w:instrText xml:space="preserve">NUMPAGES</w:instrText>
-      <w:fldChar w:fldCharType="separate"/>
-      <w:fldChar w:fldCharType="end"/>
+      <w:t xml:space="preserve">Automated Manufacturing (BE05041021) — Question Solutions</w:t>
     </w:r>
   </w:p>
 </w:ftr>
@@ -5640,8 +6389,8 @@
       <w:b/>
       <w:bCs/>
       <w:color w:val="1F3864"/>
-      <w:sz w:val="22"/>
-      <w:szCs w:val="22"/>
+      <w:sz w:val="23"/>
+      <w:szCs w:val="23"/>
     </w:rPr>
   </w:style>
   <w:style w:type="paragraph" w:styleId="Heading2">
@@ -5657,8 +6406,8 @@
       <w:b/>
       <w:bCs/>
       <w:color w:val="2E5496"/>
-      <w:sz w:val="24"/>
-      <w:szCs w:val="24"/>
+      <w:sz w:val="16"/>
+      <w:szCs w:val="16"/>
     </w:rPr>
   </w:style>
   <w:style w:type="paragraph" w:styleId="Heading3">

</xml_diff>